<commit_message>
docs: sync entire project documentation with 22-table Core MVP database schema
</commit_message>
<xml_diff>
--- a/docs/product/PRODUCT_REQUIREMENTS_DOCUMENT_LINGUAL.docx
+++ b/docs/product/PRODUCT_REQUIREMENTS_DOCUMENT_LINGUAL.docx
@@ -156,7 +156,7 @@
                 <w:sz w:val="20"/>
                 <w:szCs w:val="20"/>
               </w:rPr>
-              <w:t xml:space="preserve">Chủ nhiệm đề tài / PO:</w:t>
+              <w:t xml:space="preserve">Mentor hướng dẫn:</w:t>
             </w:r>
           </w:p>
         </w:tc>
@@ -181,7 +181,7 @@
                 <w:sz w:val="20"/>
                 <w:szCs w:val="20"/>
               </w:rPr>
-              <w:t xml:space="preserve">Ngô Văn Công</w:t>
+              <w:t xml:space="preserve">Mai Hồng Mận (man.maihong)</w:t>
             </w:r>
           </w:p>
         </w:tc>
@@ -208,7 +208,7 @@
                 <w:sz w:val="20"/>
                 <w:szCs w:val="20"/>
               </w:rPr>
-              <w:t xml:space="preserve">Đơn vị đào tạo:</w:t>
+              <w:t xml:space="preserve">Chủ nhiệm đề tài / PO:</w:t>
             </w:r>
           </w:p>
         </w:tc>
@@ -227,11 +227,13 @@
             <w:r>
               <w:rPr>
                 <w:rFonts w:ascii="Calibri" w:cs="Calibri" w:eastAsia="Calibri" w:hAnsi="Calibri"/>
+                <w:b/>
+                <w:bCs/>
                 <w:color w:val="2D3748"/>
                 <w:sz w:val="20"/>
                 <w:szCs w:val="20"/>
               </w:rPr>
-              <w:t xml:space="preserve">Khoa CNTT — Trường ĐH Bách Khoa, ĐHĐN</w:t>
+              <w:t xml:space="preserve">Ngô Văn Công (cong.ngovan)</w:t>
             </w:r>
           </w:p>
         </w:tc>
@@ -258,7 +260,7 @@
                 <w:sz w:val="20"/>
                 <w:szCs w:val="20"/>
               </w:rPr>
-              <w:t xml:space="preserve">Đơn vị bảo trợ:</w:t>
+              <w:t xml:space="preserve">Đội ngũ thực hiện:</w:t>
             </w:r>
           </w:p>
         </w:tc>
@@ -281,7 +283,7 @@
                 <w:sz w:val="20"/>
                 <w:szCs w:val="20"/>
               </w:rPr>
-              <w:t xml:space="preserve">NCC+ &amp; Nền tảng Mezon (mezon.ai)</w:t>
+              <w:t xml:space="preserve">Team 05 — Đụt Cận Trĩ (Công, Minh, Trí)</w:t>
             </w:r>
           </w:p>
         </w:tc>
@@ -308,7 +310,7 @@
                 <w:sz w:val="20"/>
                 <w:szCs w:val="20"/>
               </w:rPr>
-              <w:t xml:space="preserve">Trạng thái tài liệu:</w:t>
+              <w:t xml:space="preserve">Đơn vị đào tạo:</w:t>
             </w:r>
           </w:p>
         </w:tc>
@@ -327,13 +329,113 @@
             <w:r>
               <w:rPr>
                 <w:rFonts w:ascii="Calibri" w:cs="Calibri" w:eastAsia="Calibri" w:hAnsi="Calibri"/>
+                <w:color w:val="2D3748"/>
+                <w:sz w:val="20"/>
+                <w:szCs w:val="20"/>
+              </w:rPr>
+              <w:t xml:space="preserve">Khoa CNTT — Trường ĐH Bách Khoa, ĐHĐN</w:t>
+            </w:r>
+          </w:p>
+        </w:tc>
+      </w:tr>
+      <w:tr>
+        <w:tc>
+          <w:tcPr>
+            <w:tcW w:type="dxa" w:w="2600"/>
+            <w:shd w:fill="EDF2F7" w:val="clear"/>
+            <w:tcMar>
+              <w:top w:type="dxa" w:w="120"/>
+              <w:left w:type="dxa" w:w="160"/>
+              <w:bottom w:type="dxa" w:w="120"/>
+              <w:right w:type="dxa" w:w="160"/>
+            </w:tcMar>
+          </w:tcPr>
+          <w:p>
+            <w:r>
+              <w:rPr>
+                <w:rFonts w:ascii="Calibri" w:cs="Calibri" w:eastAsia="Calibri" w:hAnsi="Calibri"/>
+                <w:b/>
+                <w:bCs/>
+                <w:color w:val="1A365D"/>
+                <w:sz w:val="20"/>
+                <w:szCs w:val="20"/>
+              </w:rPr>
+              <w:t xml:space="preserve">Đơn vị bảo trợ:</w:t>
+            </w:r>
+          </w:p>
+        </w:tc>
+        <w:tc>
+          <w:tcPr>
+            <w:tcW w:type="dxa" w:w="4200"/>
+            <w:shd w:fill="FFFFFF" w:val="clear"/>
+            <w:tcMar>
+              <w:top w:type="dxa" w:w="120"/>
+              <w:left w:type="dxa" w:w="160"/>
+              <w:bottom w:type="dxa" w:w="120"/>
+              <w:right w:type="dxa" w:w="160"/>
+            </w:tcMar>
+          </w:tcPr>
+          <w:p>
+            <w:r>
+              <w:rPr>
+                <w:rFonts w:ascii="Calibri" w:cs="Calibri" w:eastAsia="Calibri" w:hAnsi="Calibri"/>
+                <w:color w:val="2D3748"/>
+                <w:sz w:val="20"/>
+                <w:szCs w:val="20"/>
+              </w:rPr>
+              <w:t xml:space="preserve">NCC+ &amp; Nền tảng Mezon (mezon.ai)</w:t>
+            </w:r>
+          </w:p>
+        </w:tc>
+      </w:tr>
+      <w:tr>
+        <w:tc>
+          <w:tcPr>
+            <w:tcW w:type="dxa" w:w="2600"/>
+            <w:shd w:fill="EDF2F7" w:val="clear"/>
+            <w:tcMar>
+              <w:top w:type="dxa" w:w="120"/>
+              <w:left w:type="dxa" w:w="160"/>
+              <w:bottom w:type="dxa" w:w="120"/>
+              <w:right w:type="dxa" w:w="160"/>
+            </w:tcMar>
+          </w:tcPr>
+          <w:p>
+            <w:r>
+              <w:rPr>
+                <w:rFonts w:ascii="Calibri" w:cs="Calibri" w:eastAsia="Calibri" w:hAnsi="Calibri"/>
+                <w:b/>
+                <w:bCs/>
+                <w:color w:val="1A365D"/>
+                <w:sz w:val="20"/>
+                <w:szCs w:val="20"/>
+              </w:rPr>
+              <w:t xml:space="preserve">Trạng thái tài liệu:</w:t>
+            </w:r>
+          </w:p>
+        </w:tc>
+        <w:tc>
+          <w:tcPr>
+            <w:tcW w:type="dxa" w:w="4200"/>
+            <w:shd w:fill="FFFFFF" w:val="clear"/>
+            <w:tcMar>
+              <w:top w:type="dxa" w:w="120"/>
+              <w:left w:type="dxa" w:w="160"/>
+              <w:bottom w:type="dxa" w:w="120"/>
+              <w:right w:type="dxa" w:w="160"/>
+            </w:tcMar>
+          </w:tcPr>
+          <w:p>
+            <w:r>
+              <w:rPr>
+                <w:rFonts w:ascii="Calibri" w:cs="Calibri" w:eastAsia="Calibri" w:hAnsi="Calibri"/>
                 <w:b/>
                 <w:bCs/>
                 <w:color w:val="D97706"/>
                 <w:sz w:val="20"/>
                 <w:szCs w:val="20"/>
               </w:rPr>
-              <w:t xml:space="preserve">Bản chính thức v1.1 — Chuẩn hóa Single-Clan &amp; CSDL 8 Module</w:t>
+              <w:t xml:space="preserve">Bản chính thức v1.1 — Chuẩn hóa Single-Clan &amp; CSDL 22 Bảng Core MVP</w:t>
             </w:r>
           </w:p>
         </w:tc>
@@ -2154,36 +2256,16 @@
           <w:sz w:val="21"/>
           <w:szCs w:val="21"/>
         </w:rPr>
-        <w:t xml:space="preserve">) mà không yêu cầu tạo mật khẩu riêng.</w:t>
-      </w:r>
-    </w:p>
-    <w:p>
-      <w:pPr>
-        <w:pStyle w:val="ListParagraph"/>
-        <w:numPr>
-          <w:ilvl w:val="0"/>
-          <w:numId w:val="1"/>
-        </w:numPr>
-        <w:spacing w:after="40" w:before="40" w:line="260"/>
-        <w:ind w:left="360" w:hanging="240"/>
-      </w:pPr>
-      <w:r>
-        <w:rPr>
-          <w:rFonts w:ascii="Calibri" w:cs="Calibri" w:eastAsia="Calibri" w:hAnsi="Calibri"/>
-          <w:color w:val="2D3748"/>
-          <w:sz w:val="21"/>
-          <w:szCs w:val="21"/>
-        </w:rPr>
-        <w:t xml:space="preserve">Tự động ghi nhận thành viên vào cộng đồng Clan được cấu hình (</w:t>
-      </w:r>
-      <w:r>
-        <w:rPr>
-          <w:rFonts w:ascii="Calibri" w:cs="Calibri" w:eastAsia="Calibri" w:hAnsi="Calibri"/>
-          <w:color w:val="2D3748"/>
-          <w:sz w:val="21"/>
-          <w:szCs w:val="21"/>
-        </w:rPr>
-        <w:t xml:space="preserve">configured_clan_members</w:t>
+        <w:t xml:space="preserve">) mà không yêu cầu tạo mật khẩu riêng (</w:t>
+      </w:r>
+      <w:r>
+        <w:rPr>
+          <w:rFonts w:ascii="Calibri" w:cs="Calibri" w:eastAsia="Calibri" w:hAnsi="Calibri"/>
+          <w:color w:val="2D3748"/>
+          <w:sz w:val="21"/>
+          <w:szCs w:val="21"/>
+        </w:rPr>
+        <w:t xml:space="preserve">users</w:t>
       </w:r>
       <w:r>
         <w:rPr>
@@ -2208,6 +2290,98 @@
       <w:r>
         <w:rPr>
           <w:rFonts w:ascii="Calibri" w:cs="Calibri" w:eastAsia="Calibri" w:hAnsi="Calibri"/>
+          <w:color w:val="2D3748"/>
+          <w:sz w:val="21"/>
+          <w:szCs w:val="21"/>
+        </w:rPr>
+        <w:t xml:space="preserve">Phân quyền Simple RBAC trực tiếp qua cột </w:t>
+      </w:r>
+      <w:r>
+        <w:rPr>
+          <w:rFonts w:ascii="Calibri" w:cs="Calibri" w:eastAsia="Calibri" w:hAnsi="Calibri"/>
+          <w:color w:val="2D3748"/>
+          <w:sz w:val="21"/>
+          <w:szCs w:val="21"/>
+        </w:rPr>
+        <w:t xml:space="preserve">users.role</w:t>
+      </w:r>
+      <w:r>
+        <w:rPr>
+          <w:rFonts w:ascii="Calibri" w:cs="Calibri" w:eastAsia="Calibri" w:hAnsi="Calibri"/>
+          <w:color w:val="2D3748"/>
+          <w:sz w:val="21"/>
+          <w:szCs w:val="21"/>
+        </w:rPr>
+        <w:t xml:space="preserve"> (</w:t>
+      </w:r>
+      <w:r>
+        <w:rPr>
+          <w:rFonts w:ascii="Calibri" w:cs="Calibri" w:eastAsia="Calibri" w:hAnsi="Calibri"/>
+          <w:color w:val="2D3748"/>
+          <w:sz w:val="21"/>
+          <w:szCs w:val="21"/>
+        </w:rPr>
+        <w:t xml:space="preserve">learner</w:t>
+      </w:r>
+      <w:r>
+        <w:rPr>
+          <w:rFonts w:ascii="Calibri" w:cs="Calibri" w:eastAsia="Calibri" w:hAnsi="Calibri"/>
+          <w:color w:val="2D3748"/>
+          <w:sz w:val="21"/>
+          <w:szCs w:val="21"/>
+        </w:rPr>
+        <w:t xml:space="preserve">, </w:t>
+      </w:r>
+      <w:r>
+        <w:rPr>
+          <w:rFonts w:ascii="Calibri" w:cs="Calibri" w:eastAsia="Calibri" w:hAnsi="Calibri"/>
+          <w:color w:val="2D3748"/>
+          <w:sz w:val="21"/>
+          <w:szCs w:val="21"/>
+        </w:rPr>
+        <w:t xml:space="preserve">moderator</w:t>
+      </w:r>
+      <w:r>
+        <w:rPr>
+          <w:rFonts w:ascii="Calibri" w:cs="Calibri" w:eastAsia="Calibri" w:hAnsi="Calibri"/>
+          <w:color w:val="2D3748"/>
+          <w:sz w:val="21"/>
+          <w:szCs w:val="21"/>
+        </w:rPr>
+        <w:t xml:space="preserve">, </w:t>
+      </w:r>
+      <w:r>
+        <w:rPr>
+          <w:rFonts w:ascii="Calibri" w:cs="Calibri" w:eastAsia="Calibri" w:hAnsi="Calibri"/>
+          <w:color w:val="2D3748"/>
+          <w:sz w:val="21"/>
+          <w:szCs w:val="21"/>
+        </w:rPr>
+        <w:t xml:space="preserve">admin</w:t>
+      </w:r>
+      <w:r>
+        <w:rPr>
+          <w:rFonts w:ascii="Calibri" w:cs="Calibri" w:eastAsia="Calibri" w:hAnsi="Calibri"/>
+          <w:color w:val="2D3748"/>
+          <w:sz w:val="21"/>
+          <w:szCs w:val="21"/>
+        </w:rPr>
+        <w:t xml:space="preserve">).</w:t>
+      </w:r>
+    </w:p>
+    <w:p>
+      <w:pPr>
+        <w:pStyle w:val="ListParagraph"/>
+        <w:numPr>
+          <w:ilvl w:val="0"/>
+          <w:numId w:val="1"/>
+        </w:numPr>
+        <w:spacing w:after="40" w:before="40" w:line="260"/>
+        <w:ind w:left="360" w:hanging="240"/>
+      </w:pPr>
+      <w:r>
+        <w:rPr>
+          <w:rFonts w:ascii="Calibri" w:cs="Calibri" w:eastAsia="Calibri" w:hAnsi="Calibri"/>
           <w:b/>
           <w:bCs/>
           <w:color w:val="2D3748"/>
@@ -2357,34 +2531,34 @@
           <w:sz w:val="21"/>
           <w:szCs w:val="21"/>
         </w:rPr>
-        <w:t xml:space="preserve">placement_attempts</w:t>
-      </w:r>
-      <w:r>
-        <w:rPr>
-          <w:rFonts w:ascii="Calibri" w:cs="Calibri" w:eastAsia="Calibri" w:hAnsi="Calibri"/>
-          <w:color w:val="2D3748"/>
-          <w:sz w:val="21"/>
-          <w:szCs w:val="21"/>
-        </w:rPr>
-        <w:t xml:space="preserve">, </w:t>
-      </w:r>
-      <w:r>
-        <w:rPr>
-          <w:rFonts w:ascii="Calibri" w:cs="Calibri" w:eastAsia="Calibri" w:hAnsi="Calibri"/>
-          <w:color w:val="2D3748"/>
-          <w:sz w:val="21"/>
-          <w:szCs w:val="21"/>
-        </w:rPr>
-        <w:t xml:space="preserve">placement_answers</w:t>
-      </w:r>
-      <w:r>
-        <w:rPr>
-          <w:rFonts w:ascii="Calibri" w:cs="Calibri" w:eastAsia="Calibri" w:hAnsi="Calibri"/>
-          <w:color w:val="2D3748"/>
-          <w:sz w:val="21"/>
-          <w:szCs w:val="21"/>
-        </w:rPr>
-        <w:t xml:space="preserve">) để tự động xếp người học vào phân tầng trình độ phù hợp (A1, A2, B1, B2).</w:t>
+        <w:t xml:space="preserve">placement_tests</w:t>
+      </w:r>
+      <w:r>
+        <w:rPr>
+          <w:rFonts w:ascii="Calibri" w:cs="Calibri" w:eastAsia="Calibri" w:hAnsi="Calibri"/>
+          <w:color w:val="2D3748"/>
+          <w:sz w:val="21"/>
+          <w:szCs w:val="21"/>
+        </w:rPr>
+        <w:t xml:space="preserve"> kèm chi tiết câu trả lời lưu dạng </w:t>
+      </w:r>
+      <w:r>
+        <w:rPr>
+          <w:rFonts w:ascii="Calibri" w:cs="Calibri" w:eastAsia="Calibri" w:hAnsi="Calibri"/>
+          <w:color w:val="2D3748"/>
+          <w:sz w:val="21"/>
+          <w:szCs w:val="21"/>
+        </w:rPr>
+        <w:t xml:space="preserve">answers_detail</w:t>
+      </w:r>
+      <w:r>
+        <w:rPr>
+          <w:rFonts w:ascii="Calibri" w:cs="Calibri" w:eastAsia="Calibri" w:hAnsi="Calibri"/>
+          <w:color w:val="2D3748"/>
+          <w:sz w:val="21"/>
+          <w:szCs w:val="21"/>
+        </w:rPr>
+        <w:t xml:space="preserve"> JSONB) để tự động xếp người học vào phân tầng trình độ phù hợp (A1, A2, B1, B2).</w:t>
       </w:r>
     </w:p>
     <w:p>
@@ -2517,7 +2691,25 @@
           <w:sz w:val="21"/>
           <w:szCs w:val="21"/>
         </w:rPr>
-        <w:t xml:space="preserve"> - 5 đến 7 từ mới/cấu trúc).</w:t>
+        <w:t xml:space="preserve"> - tích hợp danh sách ID từ vựng trực tiếp qua cột </w:t>
+      </w:r>
+      <w:r>
+        <w:rPr>
+          <w:rFonts w:ascii="Calibri" w:cs="Calibri" w:eastAsia="Calibri" w:hAnsi="Calibri"/>
+          <w:color w:val="2D3748"/>
+          <w:sz w:val="21"/>
+          <w:szCs w:val="21"/>
+        </w:rPr>
+        <w:t xml:space="preserve">vocabulary_ids</w:t>
+      </w:r>
+      <w:r>
+        <w:rPr>
+          <w:rFonts w:ascii="Calibri" w:cs="Calibri" w:eastAsia="Calibri" w:hAnsi="Calibri"/>
+          <w:color w:val="2D3748"/>
+          <w:sz w:val="21"/>
+          <w:szCs w:val="21"/>
+        </w:rPr>
+        <w:t xml:space="preserve"> JSONB).</w:t>
       </w:r>
     </w:p>
     <w:p>
@@ -2597,85 +2789,103 @@
           <w:sz w:val="21"/>
           <w:szCs w:val="21"/>
         </w:rPr>
-        <w:t xml:space="preserve">Bảng câu ví dụ ngữ cảnh song ngữ độc lập (</w:t>
-      </w:r>
-      <w:r>
-        <w:rPr>
-          <w:rFonts w:ascii="Calibri" w:cs="Calibri" w:eastAsia="Calibri" w:hAnsi="Calibri"/>
-          <w:color w:val="2D3748"/>
-          <w:sz w:val="21"/>
-          <w:szCs w:val="21"/>
-        </w:rPr>
-        <w:t xml:space="preserve">vocabulary_examples</w:t>
-      </w:r>
-      <w:r>
-        <w:rPr>
-          <w:rFonts w:ascii="Calibri" w:cs="Calibri" w:eastAsia="Calibri" w:hAnsi="Calibri"/>
-          <w:color w:val="2D3748"/>
-          <w:sz w:val="21"/>
-          <w:szCs w:val="21"/>
-        </w:rPr>
-        <w:t xml:space="preserve">) hỗ trợ nhiều ví dụ thực tế cho mỗi từ vựng.</w:t>
-      </w:r>
-    </w:p>
-    <w:p>
-      <w:pPr>
-        <w:pStyle w:val="ListParagraph"/>
-        <w:numPr>
-          <w:ilvl w:val="0"/>
-          <w:numId w:val="1"/>
-        </w:numPr>
-        <w:spacing w:after="40" w:before="40" w:line="260"/>
-        <w:ind w:left="360" w:hanging="240"/>
-      </w:pPr>
-      <w:r>
-        <w:rPr>
-          <w:rFonts w:ascii="Calibri" w:cs="Calibri" w:eastAsia="Calibri" w:hAnsi="Calibri"/>
-          <w:b/>
-          <w:bCs/>
-          <w:color w:val="2D3748"/>
-          <w:sz w:val="21"/>
-          <w:szCs w:val="21"/>
-        </w:rPr>
-        <w:t xml:space="preserve">FR-02.3 Sổ tay từ vựng cá nhân (Personal Vocabulary Deck):</w:t>
-      </w:r>
-    </w:p>
-    <w:p>
-      <w:pPr>
-        <w:pStyle w:val="ListParagraph"/>
-        <w:numPr>
-          <w:ilvl w:val="0"/>
-          <w:numId w:val="1"/>
-        </w:numPr>
-        <w:spacing w:after="40" w:before="40" w:line="260"/>
-        <w:ind w:left="360" w:hanging="240"/>
-      </w:pPr>
-      <w:r>
-        <w:rPr>
-          <w:rFonts w:ascii="Calibri" w:cs="Calibri" w:eastAsia="Calibri" w:hAnsi="Calibri"/>
-          <w:color w:val="2D3748"/>
-          <w:sz w:val="21"/>
-          <w:szCs w:val="21"/>
-        </w:rPr>
-        <w:t xml:space="preserve">Bảng </w:t>
-      </w:r>
-      <w:r>
-        <w:rPr>
-          <w:rFonts w:ascii="Calibri" w:cs="Calibri" w:eastAsia="Calibri" w:hAnsi="Calibri"/>
-          <w:color w:val="2D3748"/>
-          <w:sz w:val="21"/>
-          <w:szCs w:val="21"/>
-        </w:rPr>
-        <w:t xml:space="preserve">user_vocabulary_deck</w:t>
-      </w:r>
-      <w:r>
-        <w:rPr>
-          <w:rFonts w:ascii="Calibri" w:cs="Calibri" w:eastAsia="Calibri" w:hAnsi="Calibri"/>
-          <w:color w:val="2D3748"/>
-          <w:sz w:val="21"/>
-          <w:szCs w:val="21"/>
-        </w:rPr>
-        <w:t xml:space="preserve"> cho phép người học bấm "Lưu từ" (Bookmark) khi bắt gặp từ mới trong bài học, tin nhắn chat Bot hoặc đoạn hội thoại AI để chủ động gom vào sổ tay ôn tập riêng.</w:t>
+        <w:t xml:space="preserve">Các câu ví dụ ngữ cảnh song ngữ được lưu trực tiếp dạng mảng </w:t>
+      </w:r>
+      <w:r>
+        <w:rPr>
+          <w:rFonts w:ascii="Calibri" w:cs="Calibri" w:eastAsia="Calibri" w:hAnsi="Calibri"/>
+          <w:color w:val="2D3748"/>
+          <w:sz w:val="21"/>
+          <w:szCs w:val="21"/>
+        </w:rPr>
+        <w:t xml:space="preserve">examples</w:t>
+      </w:r>
+      <w:r>
+        <w:rPr>
+          <w:rFonts w:ascii="Calibri" w:cs="Calibri" w:eastAsia="Calibri" w:hAnsi="Calibri"/>
+          <w:color w:val="2D3748"/>
+          <w:sz w:val="21"/>
+          <w:szCs w:val="21"/>
+        </w:rPr>
+        <w:t xml:space="preserve"> (JSONB) trong bảng </w:t>
+      </w:r>
+      <w:r>
+        <w:rPr>
+          <w:rFonts w:ascii="Calibri" w:cs="Calibri" w:eastAsia="Calibri" w:hAnsi="Calibri"/>
+          <w:color w:val="2D3748"/>
+          <w:sz w:val="21"/>
+          <w:szCs w:val="21"/>
+        </w:rPr>
+        <w:t xml:space="preserve">vocabulary_items</w:t>
+      </w:r>
+      <w:r>
+        <w:rPr>
+          <w:rFonts w:ascii="Calibri" w:cs="Calibri" w:eastAsia="Calibri" w:hAnsi="Calibri"/>
+          <w:color w:val="2D3748"/>
+          <w:sz w:val="21"/>
+          <w:szCs w:val="21"/>
+        </w:rPr>
+        <w:t xml:space="preserve">.</w:t>
+      </w:r>
+    </w:p>
+    <w:p>
+      <w:pPr>
+        <w:pStyle w:val="ListParagraph"/>
+        <w:numPr>
+          <w:ilvl w:val="0"/>
+          <w:numId w:val="1"/>
+        </w:numPr>
+        <w:spacing w:after="40" w:before="40" w:line="260"/>
+        <w:ind w:left="360" w:hanging="240"/>
+      </w:pPr>
+      <w:r>
+        <w:rPr>
+          <w:rFonts w:ascii="Calibri" w:cs="Calibri" w:eastAsia="Calibri" w:hAnsi="Calibri"/>
+          <w:b/>
+          <w:bCs/>
+          <w:color w:val="2D3748"/>
+          <w:sz w:val="21"/>
+          <w:szCs w:val="21"/>
+        </w:rPr>
+        <w:t xml:space="preserve">FR-02.3 Sổ tay từ vựng &amp; Ôn tập tích hợp:</w:t>
+      </w:r>
+    </w:p>
+    <w:p>
+      <w:pPr>
+        <w:pStyle w:val="ListParagraph"/>
+        <w:numPr>
+          <w:ilvl w:val="0"/>
+          <w:numId w:val="1"/>
+        </w:numPr>
+        <w:spacing w:after="40" w:before="40" w:line="260"/>
+        <w:ind w:left="360" w:hanging="240"/>
+      </w:pPr>
+      <w:r>
+        <w:rPr>
+          <w:rFonts w:ascii="Calibri" w:cs="Calibri" w:eastAsia="Calibri" w:hAnsi="Calibri"/>
+          <w:color w:val="2D3748"/>
+          <w:sz w:val="21"/>
+          <w:szCs w:val="21"/>
+        </w:rPr>
+        <w:t xml:space="preserve">Tính năng lưu từ vựng (Bookmark) và chủ động ôn tập được quản lý và đồng bộ tập trung vào bảng thẻ nhớ </w:t>
+      </w:r>
+      <w:r>
+        <w:rPr>
+          <w:rFonts w:ascii="Calibri" w:cs="Calibri" w:eastAsia="Calibri" w:hAnsi="Calibri"/>
+          <w:color w:val="2D3748"/>
+          <w:sz w:val="21"/>
+          <w:szCs w:val="21"/>
+        </w:rPr>
+        <w:t xml:space="preserve">srs_cards</w:t>
+      </w:r>
+      <w:r>
+        <w:rPr>
+          <w:rFonts w:ascii="Calibri" w:cs="Calibri" w:eastAsia="Calibri" w:hAnsi="Calibri"/>
+          <w:color w:val="2D3748"/>
+          <w:sz w:val="21"/>
+          <w:szCs w:val="21"/>
+        </w:rPr>
+        <w:t xml:space="preserve"> trong phân hệ Learning.</w:t>
       </w:r>
     </w:p>
     <w:p>
@@ -2922,16 +3132,34 @@
           <w:sz w:val="21"/>
           <w:szCs w:val="21"/>
         </w:rPr>
-        <w:t xml:space="preserve">Ghi nhật ký ôn tập chi tiết vào </w:t>
-      </w:r>
-      <w:r>
-        <w:rPr>
-          <w:rFonts w:ascii="Calibri" w:cs="Calibri" w:eastAsia="Calibri" w:hAnsi="Calibri"/>
-          <w:color w:val="2D3748"/>
-          <w:sz w:val="21"/>
-          <w:szCs w:val="21"/>
-        </w:rPr>
-        <w:t xml:space="preserve">srs_reviews</w:t>
+        <w:t xml:space="preserve">Ghi nhật ký ôn tập chi tiết vào cột </w:t>
+      </w:r>
+      <w:r>
+        <w:rPr>
+          <w:rFonts w:ascii="Calibri" w:cs="Calibri" w:eastAsia="Calibri" w:hAnsi="Calibri"/>
+          <w:color w:val="2D3748"/>
+          <w:sz w:val="21"/>
+          <w:szCs w:val="21"/>
+        </w:rPr>
+        <w:t xml:space="preserve">review_history</w:t>
+      </w:r>
+      <w:r>
+        <w:rPr>
+          <w:rFonts w:ascii="Calibri" w:cs="Calibri" w:eastAsia="Calibri" w:hAnsi="Calibri"/>
+          <w:color w:val="2D3748"/>
+          <w:sz w:val="21"/>
+          <w:szCs w:val="21"/>
+        </w:rPr>
+        <w:t xml:space="preserve"> (JSONB) trong </w:t>
+      </w:r>
+      <w:r>
+        <w:rPr>
+          <w:rFonts w:ascii="Calibri" w:cs="Calibri" w:eastAsia="Calibri" w:hAnsi="Calibri"/>
+          <w:color w:val="2D3748"/>
+          <w:sz w:val="21"/>
+          <w:szCs w:val="21"/>
+        </w:rPr>
+        <w:t xml:space="preserve">srs_cards</w:t>
       </w:r>
       <w:r>
         <w:rPr>
@@ -3103,7 +3331,7 @@
           <w:sz w:val="21"/>
           <w:szCs w:val="21"/>
         </w:rPr>
-        <w:t xml:space="preserve">FR-04.1 Cấu trúc đề thi &amp; câu hỏi đa dạng (`quizzes`, `quiz_questions`, `quiz_options`):</w:t>
+        <w:t xml:space="preserve">FR-04.1 Cấu trúc đề thi &amp; câu hỏi đa dạng (`quizzes`, `quiz_questions`):</w:t>
       </w:r>
     </w:p>
     <w:p>
@@ -3161,6 +3389,98 @@
           <w:sz w:val="21"/>
           <w:szCs w:val="21"/>
         </w:rPr>
+        <w:t xml:space="preserve">Bảng </w:t>
+      </w:r>
+      <w:r>
+        <w:rPr>
+          <w:rFonts w:ascii="Calibri" w:cs="Calibri" w:eastAsia="Calibri" w:hAnsi="Calibri"/>
+          <w:color w:val="2D3748"/>
+          <w:sz w:val="21"/>
+          <w:szCs w:val="21"/>
+        </w:rPr>
+        <w:t xml:space="preserve">quiz_questions</w:t>
+      </w:r>
+      <w:r>
+        <w:rPr>
+          <w:rFonts w:ascii="Calibri" w:cs="Calibri" w:eastAsia="Calibri" w:hAnsi="Calibri"/>
+          <w:color w:val="2D3748"/>
+          <w:sz w:val="21"/>
+          <w:szCs w:val="21"/>
+        </w:rPr>
+        <w:t xml:space="preserve"> gắn trực tiếp </w:t>
+      </w:r>
+      <w:r>
+        <w:rPr>
+          <w:rFonts w:ascii="Calibri" w:cs="Calibri" w:eastAsia="Calibri" w:hAnsi="Calibri"/>
+          <w:color w:val="2D3748"/>
+          <w:sz w:val="21"/>
+          <w:szCs w:val="21"/>
+        </w:rPr>
+        <w:t xml:space="preserve">quiz_id</w:t>
+      </w:r>
+      <w:r>
+        <w:rPr>
+          <w:rFonts w:ascii="Calibri" w:cs="Calibri" w:eastAsia="Calibri" w:hAnsi="Calibri"/>
+          <w:color w:val="2D3748"/>
+          <w:sz w:val="21"/>
+          <w:szCs w:val="21"/>
+        </w:rPr>
+        <w:t xml:space="preserve">, tích hợp toàn bộ các phương án trắc nghiệm qua cột </w:t>
+      </w:r>
+      <w:r>
+        <w:rPr>
+          <w:rFonts w:ascii="Calibri" w:cs="Calibri" w:eastAsia="Calibri" w:hAnsi="Calibri"/>
+          <w:color w:val="2D3748"/>
+          <w:sz w:val="21"/>
+          <w:szCs w:val="21"/>
+        </w:rPr>
+        <w:t xml:space="preserve">options</w:t>
+      </w:r>
+      <w:r>
+        <w:rPr>
+          <w:rFonts w:ascii="Calibri" w:cs="Calibri" w:eastAsia="Calibri" w:hAnsi="Calibri"/>
+          <w:color w:val="2D3748"/>
+          <w:sz w:val="21"/>
+          <w:szCs w:val="21"/>
+        </w:rPr>
+        <w:t xml:space="preserve"> (JSONB) và nội dung mở rộng qua </w:t>
+      </w:r>
+      <w:r>
+        <w:rPr>
+          <w:rFonts w:ascii="Calibri" w:cs="Calibri" w:eastAsia="Calibri" w:hAnsi="Calibri"/>
+          <w:color w:val="2D3748"/>
+          <w:sz w:val="21"/>
+          <w:szCs w:val="21"/>
+        </w:rPr>
+        <w:t xml:space="preserve">payload</w:t>
+      </w:r>
+      <w:r>
+        <w:rPr>
+          <w:rFonts w:ascii="Calibri" w:cs="Calibri" w:eastAsia="Calibri" w:hAnsi="Calibri"/>
+          <w:color w:val="2D3748"/>
+          <w:sz w:val="21"/>
+          <w:szCs w:val="21"/>
+        </w:rPr>
+        <w:t xml:space="preserve"> (JSONB).</w:t>
+      </w:r>
+    </w:p>
+    <w:p>
+      <w:pPr>
+        <w:pStyle w:val="ListParagraph"/>
+        <w:numPr>
+          <w:ilvl w:val="0"/>
+          <w:numId w:val="1"/>
+        </w:numPr>
+        <w:spacing w:after="40" w:before="40" w:line="260"/>
+        <w:ind w:left="360" w:hanging="240"/>
+      </w:pPr>
+      <w:r>
+        <w:rPr>
+          <w:rFonts w:ascii="Calibri" w:cs="Calibri" w:eastAsia="Calibri" w:hAnsi="Calibri"/>
+          <w:color w:val="2D3748"/>
+          <w:sz w:val="21"/>
+          <w:szCs w:val="21"/>
+        </w:rPr>
         <w:t xml:space="preserve">Đa dạng dạng thức: Trắc nghiệm 4 lựa chọn (</w:t>
       </w:r>
       <w:r>
@@ -3255,27 +3575,45 @@
           <w:sz w:val="21"/>
           <w:szCs w:val="21"/>
         </w:rPr>
-        <w:t xml:space="preserve">FR-04.2 Phiên làm bài và chấm điểm (`quiz_attempts`, `quiz_attempt_answers`):</w:t>
-      </w:r>
-    </w:p>
-    <w:p>
-      <w:pPr>
-        <w:pStyle w:val="ListParagraph"/>
-        <w:numPr>
-          <w:ilvl w:val="0"/>
-          <w:numId w:val="1"/>
-        </w:numPr>
-        <w:spacing w:after="40" w:before="40" w:line="260"/>
-        <w:ind w:left="360" w:hanging="240"/>
-      </w:pPr>
-      <w:r>
-        <w:rPr>
-          <w:rFonts w:ascii="Calibri" w:cs="Calibri" w:eastAsia="Calibri" w:hAnsi="Calibri"/>
-          <w:color w:val="2D3748"/>
-          <w:sz w:val="21"/>
-          <w:szCs w:val="21"/>
-        </w:rPr>
-        <w:t xml:space="preserve">Ghi nhận thời gian bắt đầu, nộp bài, điểm số tự động và câu trả lời chi tiết.</w:t>
+        <w:t xml:space="preserve">FR-04.2 Phiên làm bài và chấm điểm (`quiz_attempts`):</w:t>
+      </w:r>
+    </w:p>
+    <w:p>
+      <w:pPr>
+        <w:pStyle w:val="ListParagraph"/>
+        <w:numPr>
+          <w:ilvl w:val="0"/>
+          <w:numId w:val="1"/>
+        </w:numPr>
+        <w:spacing w:after="40" w:before="40" w:line="260"/>
+        <w:ind w:left="360" w:hanging="240"/>
+      </w:pPr>
+      <w:r>
+        <w:rPr>
+          <w:rFonts w:ascii="Calibri" w:cs="Calibri" w:eastAsia="Calibri" w:hAnsi="Calibri"/>
+          <w:color w:val="2D3748"/>
+          <w:sz w:val="21"/>
+          <w:szCs w:val="21"/>
+        </w:rPr>
+        <w:t xml:space="preserve">Ghi nhận thời gian bắt đầu, nộp bài, điểm số tự động và toàn bộ chi tiết bài làm của học viên lưu tập trung trong cột </w:t>
+      </w:r>
+      <w:r>
+        <w:rPr>
+          <w:rFonts w:ascii="Calibri" w:cs="Calibri" w:eastAsia="Calibri" w:hAnsi="Calibri"/>
+          <w:color w:val="2D3748"/>
+          <w:sz w:val="21"/>
+          <w:szCs w:val="21"/>
+        </w:rPr>
+        <w:t xml:space="preserve">answers_detail</w:t>
+      </w:r>
+      <w:r>
+        <w:rPr>
+          <w:rFonts w:ascii="Calibri" w:cs="Calibri" w:eastAsia="Calibri" w:hAnsi="Calibri"/>
+          <w:color w:val="2D3748"/>
+          <w:sz w:val="21"/>
+          <w:szCs w:val="21"/>
+        </w:rPr>
+        <w:t xml:space="preserve"> (JSONB).</w:t>
       </w:r>
     </w:p>
     <w:p>
@@ -3446,7 +3784,25 @@
           <w:sz w:val="21"/>
           <w:szCs w:val="21"/>
         </w:rPr>
-        <w:t xml:space="preserve">Loại bỏ hoàn toàn sự phức tạp của kiến trúc đa Clan (Multi-tenant), tập trung tối đa vào trải nghiệm gắn kết chiều sâu trong cộng đồng sinh viên.</w:t>
+        <w:t xml:space="preserve">Tích hợp lịch hẹn giờ tự động (Word of the Day, Daily Quiz) trực tiếp qua cột </w:t>
+      </w:r>
+      <w:r>
+        <w:rPr>
+          <w:rFonts w:ascii="Calibri" w:cs="Calibri" w:eastAsia="Calibri" w:hAnsi="Calibri"/>
+          <w:color w:val="2D3748"/>
+          <w:sz w:val="21"/>
+          <w:szCs w:val="21"/>
+        </w:rPr>
+        <w:t xml:space="preserve">schedules</w:t>
+      </w:r>
+      <w:r>
+        <w:rPr>
+          <w:rFonts w:ascii="Calibri" w:cs="Calibri" w:eastAsia="Calibri" w:hAnsi="Calibri"/>
+          <w:color w:val="2D3748"/>
+          <w:sz w:val="21"/>
+          <w:szCs w:val="21"/>
+        </w:rPr>
+        <w:t xml:space="preserve"> (JSONB).</w:t>
       </w:r>
     </w:p>
     <w:p>
@@ -3606,7 +3962,7 @@
           <w:sz w:val="21"/>
           <w:szCs w:val="21"/>
         </w:rPr>
-        <w:t xml:space="preserve">FR-05.3 Đố vui tương tác cộng đồng trong kênh Chat (`clan_quiz_sessions`, `clan_quiz_responses`):</w:t>
+        <w:t xml:space="preserve">FR-05.3 Đố vui tương tác cộng đồng trong kênh Chat (`clan_quiz_sessions`):</w:t>
       </w:r>
     </w:p>
     <w:p>
@@ -3702,25 +4058,43 @@
           <w:sz w:val="21"/>
           <w:szCs w:val="21"/>
         </w:rPr>
-        <w:t xml:space="preserve">Mỗi thành viên chỉ được bấm trả lời đúng 1 lần (ràng buộc UNIQUE </w:t>
-      </w:r>
-      <w:r>
-        <w:rPr>
-          <w:rFonts w:ascii="Calibri" w:cs="Calibri" w:eastAsia="Calibri" w:hAnsi="Calibri"/>
-          <w:color w:val="2D3748"/>
-          <w:sz w:val="21"/>
-          <w:szCs w:val="21"/>
-        </w:rPr>
-        <w:t xml:space="preserve">session_id, user_id</w:t>
-      </w:r>
-      <w:r>
-        <w:rPr>
-          <w:rFonts w:ascii="Calibri" w:cs="Calibri" w:eastAsia="Calibri" w:hAnsi="Calibri"/>
-          <w:color w:val="2D3748"/>
-          <w:sz w:val="21"/>
-          <w:szCs w:val="21"/>
-        </w:rPr>
-        <w:t xml:space="preserve"> chống double-click / race condition).</w:t>
+        <w:t xml:space="preserve">Toàn bộ câu trả lời của các thành viên được lưu dạng </w:t>
+      </w:r>
+      <w:r>
+        <w:rPr>
+          <w:rFonts w:ascii="Calibri" w:cs="Calibri" w:eastAsia="Calibri" w:hAnsi="Calibri"/>
+          <w:color w:val="2D3748"/>
+          <w:sz w:val="21"/>
+          <w:szCs w:val="21"/>
+        </w:rPr>
+        <w:t xml:space="preserve">responses</w:t>
+      </w:r>
+      <w:r>
+        <w:rPr>
+          <w:rFonts w:ascii="Calibri" w:cs="Calibri" w:eastAsia="Calibri" w:hAnsi="Calibri"/>
+          <w:color w:val="2D3748"/>
+          <w:sz w:val="21"/>
+          <w:szCs w:val="21"/>
+        </w:rPr>
+        <w:t xml:space="preserve"> (JSONB) trong </w:t>
+      </w:r>
+      <w:r>
+        <w:rPr>
+          <w:rFonts w:ascii="Calibri" w:cs="Calibri" w:eastAsia="Calibri" w:hAnsi="Calibri"/>
+          <w:color w:val="2D3748"/>
+          <w:sz w:val="21"/>
+          <w:szCs w:val="21"/>
+        </w:rPr>
+        <w:t xml:space="preserve">clan_quiz_sessions</w:t>
+      </w:r>
+      <w:r>
+        <w:rPr>
+          <w:rFonts w:ascii="Calibri" w:cs="Calibri" w:eastAsia="Calibri" w:hAnsi="Calibri"/>
+          <w:color w:val="2D3748"/>
+          <w:sz w:val="21"/>
+          <w:szCs w:val="21"/>
+        </w:rPr>
+        <w:t xml:space="preserve">.</w:t>
       </w:r>
     </w:p>
     <w:p>
@@ -3798,27 +4172,45 @@
           <w:sz w:val="21"/>
           <w:szCs w:val="21"/>
         </w:rPr>
-        <w:t xml:space="preserve">FR-05.4 Lập lịch tự động định kỳ (`bot_schedules`):</w:t>
-      </w:r>
-    </w:p>
-    <w:p>
-      <w:pPr>
-        <w:pStyle w:val="ListParagraph"/>
-        <w:numPr>
-          <w:ilvl w:val="0"/>
-          <w:numId w:val="1"/>
-        </w:numPr>
-        <w:spacing w:after="40" w:before="40" w:line="260"/>
-        <w:ind w:left="360" w:hanging="240"/>
-      </w:pPr>
-      <w:r>
-        <w:rPr>
-          <w:rFonts w:ascii="Calibri" w:cs="Calibri" w:eastAsia="Calibri" w:hAnsi="Calibri"/>
-          <w:color w:val="2D3748"/>
-          <w:sz w:val="21"/>
-          <w:szCs w:val="21"/>
-        </w:rPr>
-        <w:t xml:space="preserve">Cho phép cấu hình lịch gửi tự động "Word of the Day" vào 8h00 sáng mỗi ngày hoặc câu đố định kỳ mà không cần can thiệp thủ công.</w:t>
+        <w:t xml:space="preserve">FR-05.4 Phân quyền Clan Moderator (`clan_moderator_grants`):</w:t>
+      </w:r>
+    </w:p>
+    <w:p>
+      <w:pPr>
+        <w:pStyle w:val="ListParagraph"/>
+        <w:numPr>
+          <w:ilvl w:val="0"/>
+          <w:numId w:val="1"/>
+        </w:numPr>
+        <w:spacing w:after="40" w:before="40" w:line="260"/>
+        <w:ind w:left="360" w:hanging="240"/>
+      </w:pPr>
+      <w:r>
+        <w:rPr>
+          <w:rFonts w:ascii="Calibri" w:cs="Calibri" w:eastAsia="Calibri" w:hAnsi="Calibri"/>
+          <w:color w:val="2D3748"/>
+          <w:sz w:val="21"/>
+          <w:szCs w:val="21"/>
+        </w:rPr>
+        <w:t xml:space="preserve">Bảng </w:t>
+      </w:r>
+      <w:r>
+        <w:rPr>
+          <w:rFonts w:ascii="Calibri" w:cs="Calibri" w:eastAsia="Calibri" w:hAnsi="Calibri"/>
+          <w:color w:val="2D3748"/>
+          <w:sz w:val="21"/>
+          <w:szCs w:val="21"/>
+        </w:rPr>
+        <w:t xml:space="preserve">clan_moderator_grants</w:t>
+      </w:r>
+      <w:r>
+        <w:rPr>
+          <w:rFonts w:ascii="Calibri" w:cs="Calibri" w:eastAsia="Calibri" w:hAnsi="Calibri"/>
+          <w:color w:val="2D3748"/>
+          <w:sz w:val="21"/>
+          <w:szCs w:val="21"/>
+        </w:rPr>
+        <w:t xml:space="preserve"> lưu trữ quyền quản trị đố vui và vận hành cục bộ trong phạm vi 1 Clan, tách biệt hoàn toàn với role toàn cục.</w:t>
       </w:r>
     </w:p>
     <w:p>
@@ -4092,16 +4484,54 @@
           <w:sz w:val="21"/>
           <w:szCs w:val="21"/>
         </w:rPr>
-        <w:t xml:space="preserve"> kết nối SignalR GameHub để thi đấu 5 vòng đối kháng 10s/vòng (</w:t>
-      </w:r>
-      <w:r>
-        <w:rPr>
-          <w:rFonts w:ascii="Calibri" w:cs="Calibri" w:eastAsia="Calibri" w:hAnsi="Calibri"/>
-          <w:color w:val="2D3748"/>
-          <w:sz w:val="21"/>
-          <w:szCs w:val="21"/>
-        </w:rPr>
-        <w:t xml:space="preserve">duel_match_questions</w:t>
+        <w:t xml:space="preserve"> kết nối SignalR GameHub để thi đấu 5 vòng đối kháng 10s/vòng.</w:t>
+      </w:r>
+    </w:p>
+    <w:p>
+      <w:pPr>
+        <w:pStyle w:val="ListParagraph"/>
+        <w:numPr>
+          <w:ilvl w:val="0"/>
+          <w:numId w:val="1"/>
+        </w:numPr>
+        <w:spacing w:after="40" w:before="40" w:line="260"/>
+        <w:ind w:left="360" w:hanging="240"/>
+      </w:pPr>
+      <w:r>
+        <w:rPr>
+          <w:rFonts w:ascii="Calibri" w:cs="Calibri" w:eastAsia="Calibri" w:hAnsi="Calibri"/>
+          <w:color w:val="2D3748"/>
+          <w:sz w:val="21"/>
+          <w:szCs w:val="21"/>
+        </w:rPr>
+        <w:t xml:space="preserve">Toàn bộ danh sách câu hỏi (</w:t>
+      </w:r>
+      <w:r>
+        <w:rPr>
+          <w:rFonts w:ascii="Calibri" w:cs="Calibri" w:eastAsia="Calibri" w:hAnsi="Calibri"/>
+          <w:color w:val="2D3748"/>
+          <w:sz w:val="21"/>
+          <w:szCs w:val="21"/>
+        </w:rPr>
+        <w:t xml:space="preserve">question_ids</w:t>
+      </w:r>
+      <w:r>
+        <w:rPr>
+          <w:rFonts w:ascii="Calibri" w:cs="Calibri" w:eastAsia="Calibri" w:hAnsi="Calibri"/>
+          <w:color w:val="2D3748"/>
+          <w:sz w:val="21"/>
+          <w:szCs w:val="21"/>
+        </w:rPr>
+        <w:t xml:space="preserve">), bài làm 2 bên (</w:t>
+      </w:r>
+      <w:r>
+        <w:rPr>
+          <w:rFonts w:ascii="Calibri" w:cs="Calibri" w:eastAsia="Calibri" w:hAnsi="Calibri"/>
+          <w:color w:val="2D3748"/>
+          <w:sz w:val="21"/>
+          <w:szCs w:val="21"/>
+        </w:rPr>
+        <w:t xml:space="preserve">challenger_answers</w:t>
       </w:r>
       <w:r>
         <w:rPr>
@@ -4119,165 +4549,94 @@
           <w:sz w:val="21"/>
           <w:szCs w:val="21"/>
         </w:rPr>
-        <w:t xml:space="preserve">duel_answers</w:t>
-      </w:r>
-      <w:r>
-        <w:rPr>
-          <w:rFonts w:ascii="Calibri" w:cs="Calibri" w:eastAsia="Calibri" w:hAnsi="Calibri"/>
-          <w:color w:val="2D3748"/>
-          <w:sz w:val="21"/>
-          <w:szCs w:val="21"/>
-        </w:rPr>
-        <w:t xml:space="preserve">, </w:t>
-      </w:r>
-      <w:r>
-        <w:rPr>
-          <w:rFonts w:ascii="Calibri" w:cs="Calibri" w:eastAsia="Calibri" w:hAnsi="Calibri"/>
-          <w:color w:val="2D3748"/>
-          <w:sz w:val="21"/>
-          <w:szCs w:val="21"/>
-        </w:rPr>
-        <w:t xml:space="preserve">duel_results</w:t>
-      </w:r>
-      <w:r>
-        <w:rPr>
-          <w:rFonts w:ascii="Calibri" w:cs="Calibri" w:eastAsia="Calibri" w:hAnsi="Calibri"/>
-          <w:color w:val="2D3748"/>
-          <w:sz w:val="21"/>
-          <w:szCs w:val="21"/>
-        </w:rPr>
-        <w:t xml:space="preserve">).</w:t>
-      </w:r>
-    </w:p>
-    <w:p>
-      <w:pPr>
-        <w:pStyle w:val="ListParagraph"/>
-        <w:numPr>
-          <w:ilvl w:val="0"/>
-          <w:numId w:val="1"/>
-        </w:numPr>
-        <w:spacing w:after="40" w:before="40" w:line="260"/>
-        <w:ind w:left="360" w:hanging="240"/>
-      </w:pPr>
-      <w:r>
-        <w:rPr>
-          <w:rFonts w:ascii="Calibri" w:cs="Calibri" w:eastAsia="Calibri" w:hAnsi="Calibri"/>
-          <w:b/>
-          <w:bCs/>
-          <w:color w:val="2D3748"/>
-          <w:sz w:val="21"/>
-          <w:szCs w:val="21"/>
-        </w:rPr>
-        <w:t xml:space="preserve">Lợi ích kiến trúc:</w:t>
-      </w:r>
-      <w:r>
-        <w:rPr>
-          <w:rFonts w:ascii="Calibri" w:cs="Calibri" w:eastAsia="Calibri" w:hAnsi="Calibri"/>
-          <w:color w:val="2D3748"/>
-          <w:sz w:val="21"/>
-          <w:szCs w:val="21"/>
-        </w:rPr>
-        <w:t xml:space="preserve"> Đấu trường chạy trong Webview giúp </w:t>
-      </w:r>
-      <w:r>
-        <w:rPr>
-          <w:rFonts w:ascii="Calibri" w:cs="Calibri" w:eastAsia="Calibri" w:hAnsi="Calibri"/>
-          <w:b/>
-          <w:bCs/>
-          <w:color w:val="2D3748"/>
-          <w:sz w:val="21"/>
-          <w:szCs w:val="21"/>
-        </w:rPr>
-        <w:t xml:space="preserve">hoàn toàn không làm rác/spam kênh chat Clan</w:t>
-      </w:r>
-      <w:r>
-        <w:rPr>
-          <w:rFonts w:ascii="Calibri" w:cs="Calibri" w:eastAsia="Calibri" w:hAnsi="Calibri"/>
-          <w:color w:val="2D3748"/>
-          <w:sz w:val="21"/>
-          <w:szCs w:val="21"/>
-        </w:rPr>
-        <w:t xml:space="preserve">, đồng thời đảm bảo đếm ngược 10s mượt mà, có âm thanh và hiệu ứng sinh động.</w:t>
-      </w:r>
-    </w:p>
-    <w:p>
-      <w:pPr>
-        <w:pStyle w:val="ListParagraph"/>
-        <w:numPr>
-          <w:ilvl w:val="0"/>
-          <w:numId w:val="1"/>
-        </w:numPr>
-        <w:spacing w:after="40" w:before="40" w:line="260"/>
-        <w:ind w:left="360" w:hanging="240"/>
-      </w:pPr>
-      <w:r>
-        <w:rPr>
-          <w:rFonts w:ascii="Calibri" w:cs="Calibri" w:eastAsia="Calibri" w:hAnsi="Calibri"/>
-          <w:b/>
-          <w:bCs/>
-          <w:color w:val="2D3748"/>
-          <w:sz w:val="21"/>
-          <w:szCs w:val="21"/>
-        </w:rPr>
-        <w:t xml:space="preserve">FR-07.2 Bảng xếp hạng tuần nội bộ Clan (`leaderboard_weeks`, `user_weekly_leaderboard`):</w:t>
-      </w:r>
-    </w:p>
-    <w:p>
-      <w:pPr>
-        <w:pStyle w:val="ListParagraph"/>
-        <w:numPr>
-          <w:ilvl w:val="0"/>
-          <w:numId w:val="1"/>
-        </w:numPr>
-        <w:spacing w:after="40" w:before="40" w:line="260"/>
-        <w:ind w:left="360" w:hanging="240"/>
-      </w:pPr>
-      <w:r>
-        <w:rPr>
-          <w:rFonts w:ascii="Calibri" w:cs="Calibri" w:eastAsia="Calibri" w:hAnsi="Calibri"/>
-          <w:color w:val="2D3748"/>
-          <w:sz w:val="21"/>
-          <w:szCs w:val="21"/>
-        </w:rPr>
-        <w:t xml:space="preserve">Xếp hạng Top thành viên có tổng điểm XP cao nhất trong tuần tại Clan đã cấu hình.</w:t>
-      </w:r>
-    </w:p>
-    <w:p>
-      <w:pPr>
-        <w:pStyle w:val="ListParagraph"/>
-        <w:numPr>
-          <w:ilvl w:val="0"/>
-          <w:numId w:val="1"/>
-        </w:numPr>
-        <w:spacing w:after="40" w:before="40" w:line="260"/>
-        <w:ind w:left="360" w:hanging="240"/>
-      </w:pPr>
-      <w:r>
-        <w:rPr>
-          <w:rFonts w:ascii="Calibri" w:cs="Calibri" w:eastAsia="Calibri" w:hAnsi="Calibri"/>
-          <w:color w:val="2D3748"/>
-          <w:sz w:val="21"/>
-          <w:szCs w:val="21"/>
-        </w:rPr>
-        <w:t xml:space="preserve">Bảng tổng hợp chỉ số tương tác tuần của Clan (</w:t>
-      </w:r>
-      <w:r>
-        <w:rPr>
-          <w:rFonts w:ascii="Calibri" w:cs="Calibri" w:eastAsia="Calibri" w:hAnsi="Calibri"/>
-          <w:color w:val="2D3748"/>
-          <w:sz w:val="21"/>
-          <w:szCs w:val="21"/>
-        </w:rPr>
-        <w:t xml:space="preserve">configured_clan_weekly_stats</w:t>
-      </w:r>
-      <w:r>
-        <w:rPr>
-          <w:rFonts w:ascii="Calibri" w:cs="Calibri" w:eastAsia="Calibri" w:hAnsi="Calibri"/>
-          <w:color w:val="2D3748"/>
-          <w:sz w:val="21"/>
-          <w:szCs w:val="21"/>
-        </w:rPr>
-        <w:t xml:space="preserve">): Tổng XP, số giờ học, số bài học và số phiên quiz hoàn thành.</w:t>
+        <w:t xml:space="preserve">opponent_answers</w:t>
+      </w:r>
+      <w:r>
+        <w:rPr>
+          <w:rFonts w:ascii="Calibri" w:cs="Calibri" w:eastAsia="Calibri" w:hAnsi="Calibri"/>
+          <w:color w:val="2D3748"/>
+          <w:sz w:val="21"/>
+          <w:szCs w:val="21"/>
+        </w:rPr>
+        <w:t xml:space="preserve">) và kết quả điểm số được lưu trọn vẹn trong bảng </w:t>
+      </w:r>
+      <w:r>
+        <w:rPr>
+          <w:rFonts w:ascii="Calibri" w:cs="Calibri" w:eastAsia="Calibri" w:hAnsi="Calibri"/>
+          <w:color w:val="2D3748"/>
+          <w:sz w:val="21"/>
+          <w:szCs w:val="21"/>
+        </w:rPr>
+        <w:t xml:space="preserve">duel_matches</w:t>
+      </w:r>
+      <w:r>
+        <w:rPr>
+          <w:rFonts w:ascii="Calibri" w:cs="Calibri" w:eastAsia="Calibri" w:hAnsi="Calibri"/>
+          <w:color w:val="2D3748"/>
+          <w:sz w:val="21"/>
+          <w:szCs w:val="21"/>
+        </w:rPr>
+        <w:t xml:space="preserve">.</w:t>
+      </w:r>
+    </w:p>
+    <w:p>
+      <w:pPr>
+        <w:pStyle w:val="ListParagraph"/>
+        <w:numPr>
+          <w:ilvl w:val="0"/>
+          <w:numId w:val="1"/>
+        </w:numPr>
+        <w:spacing w:after="40" w:before="40" w:line="260"/>
+        <w:ind w:left="360" w:hanging="240"/>
+      </w:pPr>
+      <w:r>
+        <w:rPr>
+          <w:rFonts w:ascii="Calibri" w:cs="Calibri" w:eastAsia="Calibri" w:hAnsi="Calibri"/>
+          <w:b/>
+          <w:bCs/>
+          <w:color w:val="2D3748"/>
+          <w:sz w:val="21"/>
+          <w:szCs w:val="21"/>
+        </w:rPr>
+        <w:t xml:space="preserve">FR-07.2 Bảng xếp hạng tuần nội bộ Clan (`weekly_leaderboards`):</w:t>
+      </w:r>
+    </w:p>
+    <w:p>
+      <w:pPr>
+        <w:pStyle w:val="ListParagraph"/>
+        <w:numPr>
+          <w:ilvl w:val="0"/>
+          <w:numId w:val="1"/>
+        </w:numPr>
+        <w:spacing w:after="40" w:before="40" w:line="260"/>
+        <w:ind w:left="360" w:hanging="240"/>
+      </w:pPr>
+      <w:r>
+        <w:rPr>
+          <w:rFonts w:ascii="Calibri" w:cs="Calibri" w:eastAsia="Calibri" w:hAnsi="Calibri"/>
+          <w:color w:val="2D3748"/>
+          <w:sz w:val="21"/>
+          <w:szCs w:val="21"/>
+        </w:rPr>
+        <w:t xml:space="preserve">Xếp hạng Top thành viên có tổng điểm XP cao nhất trong tuần tại Clan đã cấu hình (</w:t>
+      </w:r>
+      <w:r>
+        <w:rPr>
+          <w:rFonts w:ascii="Calibri" w:cs="Calibri" w:eastAsia="Calibri" w:hAnsi="Calibri"/>
+          <w:color w:val="2D3748"/>
+          <w:sz w:val="21"/>
+          <w:szCs w:val="21"/>
+        </w:rPr>
+        <w:t xml:space="preserve">weekly_leaderboards</w:t>
+      </w:r>
+      <w:r>
+        <w:rPr>
+          <w:rFonts w:ascii="Calibri" w:cs="Calibri" w:eastAsia="Calibri" w:hAnsi="Calibri"/>
+          <w:color w:val="2D3748"/>
+          <w:sz w:val="21"/>
+          <w:szCs w:val="21"/>
+        </w:rPr>
+        <w:t xml:space="preserve"> gộp thông tin tuần và thứ hạng học viên).</w:t>
       </w:r>
     </w:p>
     <w:p>
@@ -4375,7 +4734,7 @@
           <w:sz w:val="21"/>
           <w:szCs w:val="21"/>
         </w:rPr>
-        <w:t xml:space="preserve">, loại bỏ hoàn toàn nguy cơ cộng trùng điểm hoặc race condition khi nhiều sự kiện diễn ra đồng thời.</w:t>
+        <w:t xml:space="preserve"> và unique index chống cộng trùng điểm.</w:t>
       </w:r>
     </w:p>
     <w:p>
@@ -4435,43 +4794,43 @@
           <w:sz w:val="21"/>
           <w:szCs w:val="21"/>
         </w:rPr>
-        <w:t xml:space="preserve">, </w:t>
-      </w:r>
-      <w:r>
-        <w:rPr>
-          <w:rFonts w:ascii="Calibri" w:cs="Calibri" w:eastAsia="Calibri" w:hAnsi="Calibri"/>
-          <w:color w:val="2D3748"/>
-          <w:sz w:val="21"/>
-          <w:szCs w:val="21"/>
-        </w:rPr>
-        <w:t xml:space="preserve">streak_freeze_events</w:t>
-      </w:r>
-      <w:r>
-        <w:rPr>
-          <w:rFonts w:ascii="Calibri" w:cs="Calibri" w:eastAsia="Calibri" w:hAnsi="Calibri"/>
-          <w:color w:val="2D3748"/>
-          <w:sz w:val="21"/>
-          <w:szCs w:val="21"/>
-        </w:rPr>
-        <w:t xml:space="preserve"> và bảng tổng hợp hàng ngày </w:t>
-      </w:r>
-      <w:r>
-        <w:rPr>
-          <w:rFonts w:ascii="Calibri" w:cs="Calibri" w:eastAsia="Calibri" w:hAnsi="Calibri"/>
-          <w:color w:val="2D3748"/>
-          <w:sz w:val="21"/>
-          <w:szCs w:val="21"/>
-        </w:rPr>
-        <w:t xml:space="preserve">user_daily_activity</w:t>
-      </w:r>
-      <w:r>
-        <w:rPr>
-          <w:rFonts w:ascii="Calibri" w:cs="Calibri" w:eastAsia="Calibri" w:hAnsi="Calibri"/>
-          <w:color w:val="2D3748"/>
-          <w:sz w:val="21"/>
-          <w:szCs w:val="21"/>
-        </w:rPr>
-        <w:t xml:space="preserve">.</w:t>
+        <w:t xml:space="preserve">, tích hợp lịch sử nhận/dùng vé đóng băng (</w:t>
+      </w:r>
+      <w:r>
+        <w:rPr>
+          <w:rFonts w:ascii="Calibri" w:cs="Calibri" w:eastAsia="Calibri" w:hAnsi="Calibri"/>
+          <w:color w:val="2D3748"/>
+          <w:sz w:val="21"/>
+          <w:szCs w:val="21"/>
+        </w:rPr>
+        <w:t xml:space="preserve">freeze_history</w:t>
+      </w:r>
+      <w:r>
+        <w:rPr>
+          <w:rFonts w:ascii="Calibri" w:cs="Calibri" w:eastAsia="Calibri" w:hAnsi="Calibri"/>
+          <w:color w:val="2D3748"/>
+          <w:sz w:val="21"/>
+          <w:szCs w:val="21"/>
+        </w:rPr>
+        <w:t xml:space="preserve"> JSONB) và thống kê hoạt động từng ngày (</w:t>
+      </w:r>
+      <w:r>
+        <w:rPr>
+          <w:rFonts w:ascii="Calibri" w:cs="Calibri" w:eastAsia="Calibri" w:hAnsi="Calibri"/>
+          <w:color w:val="2D3748"/>
+          <w:sz w:val="21"/>
+          <w:szCs w:val="21"/>
+        </w:rPr>
+        <w:t xml:space="preserve">daily_activity</w:t>
+      </w:r>
+      <w:r>
+        <w:rPr>
+          <w:rFonts w:ascii="Calibri" w:cs="Calibri" w:eastAsia="Calibri" w:hAnsi="Calibri"/>
+          <w:color w:val="2D3748"/>
+          <w:sz w:val="21"/>
+          <w:szCs w:val="21"/>
+        </w:rPr>
+        <w:t xml:space="preserve"> JSONB).</w:t>
       </w:r>
     </w:p>
     <w:p>
@@ -4509,25 +4868,7 @@
           <w:sz w:val="21"/>
           <w:szCs w:val="21"/>
         </w:rPr>
-        <w:t xml:space="preserve">) để duy trì chuỗi (+1 ngày). Tự động tiêu thụ khiên bảo vệ </w:t>
-      </w:r>
-      <w:r>
-        <w:rPr>
-          <w:rFonts w:ascii="Calibri" w:cs="Calibri" w:eastAsia="Calibri" w:hAnsi="Calibri"/>
-          <w:color w:val="2D3748"/>
-          <w:sz w:val="21"/>
-          <w:szCs w:val="21"/>
-        </w:rPr>
-        <w:t xml:space="preserve">streak_freeze</w:t>
-      </w:r>
-      <w:r>
-        <w:rPr>
-          <w:rFonts w:ascii="Calibri" w:cs="Calibri" w:eastAsia="Calibri" w:hAnsi="Calibri"/>
-          <w:color w:val="2D3748"/>
-          <w:sz w:val="21"/>
-          <w:szCs w:val="21"/>
-        </w:rPr>
-        <w:t xml:space="preserve"> nếu quên học.</w:t>
+        <w:t xml:space="preserve">) để duy trì chuỗi (+1 ngày). Tự động tiêu thụ khiên bảo vệ nếu quên học.</w:t>
       </w:r>
     </w:p>
     <w:p>
@@ -4566,27 +4907,45 @@
           <w:sz w:val="21"/>
           <w:szCs w:val="21"/>
         </w:rPr>
-        <w:t xml:space="preserve">FR-08.1 Kịch bản đóng vai &amp; Hội thoại nhiều lượt (`ai_scenarios`, `ai_conversations`, `ai_messages`):</w:t>
-      </w:r>
-    </w:p>
-    <w:p>
-      <w:pPr>
-        <w:pStyle w:val="ListParagraph"/>
-        <w:numPr>
-          <w:ilvl w:val="0"/>
-          <w:numId w:val="1"/>
-        </w:numPr>
-        <w:spacing w:after="40" w:before="40" w:line="260"/>
-        <w:ind w:left="360" w:hanging="240"/>
-      </w:pPr>
-      <w:r>
-        <w:rPr>
-          <w:rFonts w:ascii="Calibri" w:cs="Calibri" w:eastAsia="Calibri" w:hAnsi="Calibri"/>
-          <w:color w:val="2D3748"/>
-          <w:sz w:val="21"/>
-          <w:szCs w:val="21"/>
-        </w:rPr>
-        <w:t xml:space="preserve">Cung cấp kịch bản đối thoại chọn trước: </w:t>
+        <w:t xml:space="preserve">FR-08.1 Kịch bản đóng vai &amp; Hội thoại nhiều lượt (`ai_scenarios`, `ai_conversations`):</w:t>
+      </w:r>
+    </w:p>
+    <w:p>
+      <w:pPr>
+        <w:pStyle w:val="ListParagraph"/>
+        <w:numPr>
+          <w:ilvl w:val="0"/>
+          <w:numId w:val="1"/>
+        </w:numPr>
+        <w:spacing w:after="40" w:before="40" w:line="260"/>
+        <w:ind w:left="360" w:hanging="240"/>
+      </w:pPr>
+      <w:r>
+        <w:rPr>
+          <w:rFonts w:ascii="Calibri" w:cs="Calibri" w:eastAsia="Calibri" w:hAnsi="Calibri"/>
+          <w:color w:val="2D3748"/>
+          <w:sz w:val="21"/>
+          <w:szCs w:val="21"/>
+        </w:rPr>
+        <w:t xml:space="preserve">Cung cấp kịch bản đối thoại chọn trước trong </w:t>
+      </w:r>
+      <w:r>
+        <w:rPr>
+          <w:rFonts w:ascii="Calibri" w:cs="Calibri" w:eastAsia="Calibri" w:hAnsi="Calibri"/>
+          <w:color w:val="2D3748"/>
+          <w:sz w:val="21"/>
+          <w:szCs w:val="21"/>
+        </w:rPr>
+        <w:t xml:space="preserve">ai_scenarios</w:t>
+      </w:r>
+      <w:r>
+        <w:rPr>
+          <w:rFonts w:ascii="Calibri" w:cs="Calibri" w:eastAsia="Calibri" w:hAnsi="Calibri"/>
+          <w:color w:val="2D3748"/>
+          <w:sz w:val="21"/>
+          <w:szCs w:val="21"/>
+        </w:rPr>
+        <w:t xml:space="preserve">: </w:t>
       </w:r>
       <w:r>
         <w:rPr>
@@ -4626,61 +4985,43 @@
           <w:sz w:val="21"/>
           <w:szCs w:val="21"/>
         </w:rPr>
-        <w:t xml:space="preserve">Lưu trữ lịch sử tin nhắn nhiều lượt kèm định danh vai trò (</w:t>
-      </w:r>
-      <w:r>
-        <w:rPr>
-          <w:rFonts w:ascii="Calibri" w:cs="Calibri" w:eastAsia="Calibri" w:hAnsi="Calibri"/>
-          <w:color w:val="2D3748"/>
-          <w:sz w:val="21"/>
-          <w:szCs w:val="21"/>
-        </w:rPr>
-        <w:t xml:space="preserve">user</w:t>
-      </w:r>
-      <w:r>
-        <w:rPr>
-          <w:rFonts w:ascii="Calibri" w:cs="Calibri" w:eastAsia="Calibri" w:hAnsi="Calibri"/>
-          <w:color w:val="2D3748"/>
-          <w:sz w:val="21"/>
-          <w:szCs w:val="21"/>
-        </w:rPr>
-        <w:t xml:space="preserve">, </w:t>
-      </w:r>
-      <w:r>
-        <w:rPr>
-          <w:rFonts w:ascii="Calibri" w:cs="Calibri" w:eastAsia="Calibri" w:hAnsi="Calibri"/>
-          <w:color w:val="2D3748"/>
-          <w:sz w:val="21"/>
-          <w:szCs w:val="21"/>
-        </w:rPr>
-        <w:t xml:space="preserve">assistant</w:t>
-      </w:r>
-      <w:r>
-        <w:rPr>
-          <w:rFonts w:ascii="Calibri" w:cs="Calibri" w:eastAsia="Calibri" w:hAnsi="Calibri"/>
-          <w:color w:val="2D3748"/>
-          <w:sz w:val="21"/>
-          <w:szCs w:val="21"/>
-        </w:rPr>
-        <w:t xml:space="preserve">, </w:t>
-      </w:r>
-      <w:r>
-        <w:rPr>
-          <w:rFonts w:ascii="Calibri" w:cs="Calibri" w:eastAsia="Calibri" w:hAnsi="Calibri"/>
-          <w:color w:val="2D3748"/>
-          <w:sz w:val="21"/>
-          <w:szCs w:val="21"/>
-        </w:rPr>
-        <w:t xml:space="preserve">system</w:t>
-      </w:r>
-      <w:r>
-        <w:rPr>
-          <w:rFonts w:ascii="Calibri" w:cs="Calibri" w:eastAsia="Calibri" w:hAnsi="Calibri"/>
-          <w:color w:val="2D3748"/>
-          <w:sz w:val="21"/>
-          <w:szCs w:val="21"/>
-        </w:rPr>
-        <w:t xml:space="preserve">).</w:t>
+        <w:t xml:space="preserve">Lưu trữ lịch sử tin nhắn nhiều lượt dưới dạng mảng </w:t>
+      </w:r>
+      <w:r>
+        <w:rPr>
+          <w:rFonts w:ascii="Calibri" w:cs="Calibri" w:eastAsia="Calibri" w:hAnsi="Calibri"/>
+          <w:color w:val="2D3748"/>
+          <w:sz w:val="21"/>
+          <w:szCs w:val="21"/>
+        </w:rPr>
+        <w:t xml:space="preserve">messages</w:t>
+      </w:r>
+      <w:r>
+        <w:rPr>
+          <w:rFonts w:ascii="Calibri" w:cs="Calibri" w:eastAsia="Calibri" w:hAnsi="Calibri"/>
+          <w:color w:val="2D3748"/>
+          <w:sz w:val="21"/>
+          <w:szCs w:val="21"/>
+        </w:rPr>
+        <w:t xml:space="preserve"> (JSONB) chuẩn OpenAI/Gemini payload trong </w:t>
+      </w:r>
+      <w:r>
+        <w:rPr>
+          <w:rFonts w:ascii="Calibri" w:cs="Calibri" w:eastAsia="Calibri" w:hAnsi="Calibri"/>
+          <w:color w:val="2D3748"/>
+          <w:sz w:val="21"/>
+          <w:szCs w:val="21"/>
+        </w:rPr>
+        <w:t xml:space="preserve">ai_conversations</w:t>
+      </w:r>
+      <w:r>
+        <w:rPr>
+          <w:rFonts w:ascii="Calibri" w:cs="Calibri" w:eastAsia="Calibri" w:hAnsi="Calibri"/>
+          <w:color w:val="2D3748"/>
+          <w:sz w:val="21"/>
+          <w:szCs w:val="21"/>
+        </w:rPr>
+        <w:t xml:space="preserve">.</w:t>
       </w:r>
     </w:p>
     <w:p>
@@ -4722,81 +5063,25 @@
           <w:sz w:val="21"/>
           <w:szCs w:val="21"/>
         </w:rPr>
-        <w:t xml:space="preserve">AI phản hồi kèm cấu trúc JSON sửa lỗi ngữ pháp chuẩn bản xứ (</w:t>
-      </w:r>
-      <w:r>
-        <w:rPr>
-          <w:rFonts w:ascii="Calibri" w:cs="Calibri" w:eastAsia="Calibri" w:hAnsi="Calibri"/>
-          <w:color w:val="2D3748"/>
-          <w:sz w:val="21"/>
-          <w:szCs w:val="21"/>
-        </w:rPr>
-        <w:t xml:space="preserve">correction_payload JSONB</w:t>
-      </w:r>
-      <w:r>
-        <w:rPr>
-          <w:rFonts w:ascii="Calibri" w:cs="Calibri" w:eastAsia="Calibri" w:hAnsi="Calibri"/>
-          <w:color w:val="2D3748"/>
-          <w:sz w:val="21"/>
-          <w:szCs w:val="21"/>
-        </w:rPr>
-        <w:t xml:space="preserve">).</w:t>
-      </w:r>
-    </w:p>
-    <w:p>
-      <w:pPr>
-        <w:pStyle w:val="ListParagraph"/>
-        <w:numPr>
-          <w:ilvl w:val="0"/>
-          <w:numId w:val="1"/>
-        </w:numPr>
-        <w:spacing w:after="40" w:before="40" w:line="260"/>
-        <w:ind w:left="360" w:hanging="240"/>
-      </w:pPr>
-      <w:r>
-        <w:rPr>
-          <w:rFonts w:ascii="Calibri" w:cs="Calibri" w:eastAsia="Calibri" w:hAnsi="Calibri"/>
-          <w:color w:val="2D3748"/>
-          <w:sz w:val="21"/>
-          <w:szCs w:val="21"/>
-        </w:rPr>
-        <w:t xml:space="preserve">Ghi nhận </w:t>
-      </w:r>
-      <w:r>
-        <w:rPr>
-          <w:rFonts w:ascii="Calibri" w:cs="Calibri" w:eastAsia="Calibri" w:hAnsi="Calibri"/>
-          <w:color w:val="2D3748"/>
-          <w:sz w:val="21"/>
-          <w:szCs w:val="21"/>
-        </w:rPr>
-        <w:t xml:space="preserve">input_tokens</w:t>
-      </w:r>
-      <w:r>
-        <w:rPr>
-          <w:rFonts w:ascii="Calibri" w:cs="Calibri" w:eastAsia="Calibri" w:hAnsi="Calibri"/>
-          <w:color w:val="2D3748"/>
-          <w:sz w:val="21"/>
-          <w:szCs w:val="21"/>
-        </w:rPr>
-        <w:t xml:space="preserve"> và </w:t>
-      </w:r>
-      <w:r>
-        <w:rPr>
-          <w:rFonts w:ascii="Calibri" w:cs="Calibri" w:eastAsia="Calibri" w:hAnsi="Calibri"/>
-          <w:color w:val="2D3748"/>
-          <w:sz w:val="21"/>
-          <w:szCs w:val="21"/>
-        </w:rPr>
-        <w:t xml:space="preserve">output_tokens</w:t>
-      </w:r>
-      <w:r>
-        <w:rPr>
-          <w:rFonts w:ascii="Calibri" w:cs="Calibri" w:eastAsia="Calibri" w:hAnsi="Calibri"/>
-          <w:color w:val="2D3748"/>
-          <w:sz w:val="21"/>
-          <w:szCs w:val="21"/>
-        </w:rPr>
-        <w:t xml:space="preserve"> trên mỗi tin nhắn để theo dõi và tối ưu hóa chi phí gọi Google Gemini API.</w:t>
+        <w:t xml:space="preserve">AI phản hồi kèm cấu trúc JSON sửa lỗi ngữ pháp chuẩn bản xứ và thống kê </w:t>
+      </w:r>
+      <w:r>
+        <w:rPr>
+          <w:rFonts w:ascii="Calibri" w:cs="Calibri" w:eastAsia="Calibri" w:hAnsi="Calibri"/>
+          <w:color w:val="2D3748"/>
+          <w:sz w:val="21"/>
+          <w:szCs w:val="21"/>
+        </w:rPr>
+        <w:t xml:space="preserve">total_tokens</w:t>
+      </w:r>
+      <w:r>
+        <w:rPr>
+          <w:rFonts w:ascii="Calibri" w:cs="Calibri" w:eastAsia="Calibri" w:hAnsi="Calibri"/>
+          <w:color w:val="2D3748"/>
+          <w:sz w:val="21"/>
+          <w:szCs w:val="21"/>
+        </w:rPr>
+        <w:t xml:space="preserve"> trên mỗi phiên hội thoại để tối ưu chi phí gọi Gemini API.</w:t>
       </w:r>
     </w:p>
     <w:p>
@@ -4835,126 +5120,72 @@
           <w:sz w:val="21"/>
           <w:szCs w:val="21"/>
         </w:rPr>
-        <w:t xml:space="preserve">FR-09.1 Báo cáo hoạt động học tập hàng ngày (`user_daily_activity`):</w:t>
-      </w:r>
-    </w:p>
-    <w:p>
-      <w:pPr>
-        <w:pStyle w:val="ListParagraph"/>
-        <w:numPr>
-          <w:ilvl w:val="0"/>
-          <w:numId w:val="1"/>
-        </w:numPr>
-        <w:spacing w:after="40" w:before="40" w:line="260"/>
-        <w:ind w:left="360" w:hanging="240"/>
-      </w:pPr>
-      <w:r>
-        <w:rPr>
-          <w:rFonts w:ascii="Calibri" w:cs="Calibri" w:eastAsia="Calibri" w:hAnsi="Calibri"/>
-          <w:color w:val="2D3748"/>
-          <w:sz w:val="21"/>
-          <w:szCs w:val="21"/>
-        </w:rPr>
-        <w:t xml:space="preserve">Thống kê chi tiết theo ngày: </w:t>
-      </w:r>
-      <w:r>
-        <w:rPr>
-          <w:rFonts w:ascii="Calibri" w:cs="Calibri" w:eastAsia="Calibri" w:hAnsi="Calibri"/>
-          <w:color w:val="2D3748"/>
-          <w:sz w:val="21"/>
-          <w:szCs w:val="21"/>
-        </w:rPr>
-        <w:t xml:space="preserve">xp_earned</w:t>
-      </w:r>
-      <w:r>
-        <w:rPr>
-          <w:rFonts w:ascii="Calibri" w:cs="Calibri" w:eastAsia="Calibri" w:hAnsi="Calibri"/>
-          <w:color w:val="2D3748"/>
-          <w:sz w:val="21"/>
-          <w:szCs w:val="21"/>
-        </w:rPr>
-        <w:t xml:space="preserve">, </w:t>
-      </w:r>
-      <w:r>
-        <w:rPr>
-          <w:rFonts w:ascii="Calibri" w:cs="Calibri" w:eastAsia="Calibri" w:hAnsi="Calibri"/>
-          <w:color w:val="2D3748"/>
-          <w:sz w:val="21"/>
-          <w:szCs w:val="21"/>
-        </w:rPr>
-        <w:t xml:space="preserve">study_seconds</w:t>
-      </w:r>
-      <w:r>
-        <w:rPr>
-          <w:rFonts w:ascii="Calibri" w:cs="Calibri" w:eastAsia="Calibri" w:hAnsi="Calibri"/>
-          <w:color w:val="2D3748"/>
-          <w:sz w:val="21"/>
-          <w:szCs w:val="21"/>
-        </w:rPr>
-        <w:t xml:space="preserve">, </w:t>
-      </w:r>
-      <w:r>
-        <w:rPr>
-          <w:rFonts w:ascii="Calibri" w:cs="Calibri" w:eastAsia="Calibri" w:hAnsi="Calibri"/>
-          <w:color w:val="2D3748"/>
-          <w:sz w:val="21"/>
-          <w:szCs w:val="21"/>
-        </w:rPr>
-        <w:t xml:space="preserve">new_words_count</w:t>
-      </w:r>
-      <w:r>
-        <w:rPr>
-          <w:rFonts w:ascii="Calibri" w:cs="Calibri" w:eastAsia="Calibri" w:hAnsi="Calibri"/>
-          <w:color w:val="2D3748"/>
-          <w:sz w:val="21"/>
-          <w:szCs w:val="21"/>
-        </w:rPr>
-        <w:t xml:space="preserve">, </w:t>
-      </w:r>
-      <w:r>
-        <w:rPr>
-          <w:rFonts w:ascii="Calibri" w:cs="Calibri" w:eastAsia="Calibri" w:hAnsi="Calibri"/>
-          <w:color w:val="2D3748"/>
-          <w:sz w:val="21"/>
-          <w:szCs w:val="21"/>
-        </w:rPr>
-        <w:t xml:space="preserve">review_count</w:t>
-      </w:r>
-      <w:r>
-        <w:rPr>
-          <w:rFonts w:ascii="Calibri" w:cs="Calibri" w:eastAsia="Calibri" w:hAnsi="Calibri"/>
-          <w:color w:val="2D3748"/>
-          <w:sz w:val="21"/>
-          <w:szCs w:val="21"/>
-        </w:rPr>
-        <w:t xml:space="preserve">, </w:t>
-      </w:r>
-      <w:r>
-        <w:rPr>
-          <w:rFonts w:ascii="Calibri" w:cs="Calibri" w:eastAsia="Calibri" w:hAnsi="Calibri"/>
-          <w:color w:val="2D3748"/>
-          <w:sz w:val="21"/>
-          <w:szCs w:val="21"/>
-        </w:rPr>
-        <w:t xml:space="preserve">completed_lessons_count</w:t>
-      </w:r>
-      <w:r>
-        <w:rPr>
-          <w:rFonts w:ascii="Calibri" w:cs="Calibri" w:eastAsia="Calibri" w:hAnsi="Calibri"/>
-          <w:color w:val="2D3748"/>
-          <w:sz w:val="21"/>
-          <w:szCs w:val="21"/>
-        </w:rPr>
-        <w:t xml:space="preserve">, </w:t>
-      </w:r>
-      <w:r>
-        <w:rPr>
-          <w:rFonts w:ascii="Calibri" w:cs="Calibri" w:eastAsia="Calibri" w:hAnsi="Calibri"/>
-          <w:color w:val="2D3748"/>
-          <w:sz w:val="21"/>
-          <w:szCs w:val="21"/>
-        </w:rPr>
-        <w:t xml:space="preserve">completed_quizzes_count</w:t>
+        <w:t xml:space="preserve">FR-09.1 Báo cáo hoạt động học tập hàng ngày:</w:t>
+      </w:r>
+    </w:p>
+    <w:p>
+      <w:pPr>
+        <w:pStyle w:val="ListParagraph"/>
+        <w:numPr>
+          <w:ilvl w:val="0"/>
+          <w:numId w:val="1"/>
+        </w:numPr>
+        <w:spacing w:after="40" w:before="40" w:line="260"/>
+        <w:ind w:left="360" w:hanging="240"/>
+      </w:pPr>
+      <w:r>
+        <w:rPr>
+          <w:rFonts w:ascii="Calibri" w:cs="Calibri" w:eastAsia="Calibri" w:hAnsi="Calibri"/>
+          <w:color w:val="2D3748"/>
+          <w:sz w:val="21"/>
+          <w:szCs w:val="21"/>
+        </w:rPr>
+        <w:t xml:space="preserve">Dữ liệu hoạt động học tập được tổng hợp trực tiếp từ </w:t>
+      </w:r>
+      <w:r>
+        <w:rPr>
+          <w:rFonts w:ascii="Calibri" w:cs="Calibri" w:eastAsia="Calibri" w:hAnsi="Calibri"/>
+          <w:color w:val="2D3748"/>
+          <w:sz w:val="21"/>
+          <w:szCs w:val="21"/>
+        </w:rPr>
+        <w:t xml:space="preserve">user_streaks.daily_activity</w:t>
+      </w:r>
+      <w:r>
+        <w:rPr>
+          <w:rFonts w:ascii="Calibri" w:cs="Calibri" w:eastAsia="Calibri" w:hAnsi="Calibri"/>
+          <w:color w:val="2D3748"/>
+          <w:sz w:val="21"/>
+          <w:szCs w:val="21"/>
+        </w:rPr>
+        <w:t xml:space="preserve"> (JSONB), </w:t>
+      </w:r>
+      <w:r>
+        <w:rPr>
+          <w:rFonts w:ascii="Calibri" w:cs="Calibri" w:eastAsia="Calibri" w:hAnsi="Calibri"/>
+          <w:color w:val="2D3748"/>
+          <w:sz w:val="21"/>
+          <w:szCs w:val="21"/>
+        </w:rPr>
+        <w:t xml:space="preserve">lesson_progress</w:t>
+      </w:r>
+      <w:r>
+        <w:rPr>
+          <w:rFonts w:ascii="Calibri" w:cs="Calibri" w:eastAsia="Calibri" w:hAnsi="Calibri"/>
+          <w:color w:val="2D3748"/>
+          <w:sz w:val="21"/>
+          <w:szCs w:val="21"/>
+        </w:rPr>
+        <w:t xml:space="preserve"> và </w:t>
+      </w:r>
+      <w:r>
+        <w:rPr>
+          <w:rFonts w:ascii="Calibri" w:cs="Calibri" w:eastAsia="Calibri" w:hAnsi="Calibri"/>
+          <w:color w:val="2D3748"/>
+          <w:sz w:val="21"/>
+          <w:szCs w:val="21"/>
+        </w:rPr>
+        <w:t xml:space="preserve">xp_ledger</w:t>
       </w:r>
       <w:r>
         <w:rPr>
@@ -4985,63 +5216,27 @@
           <w:sz w:val="21"/>
           <w:szCs w:val="21"/>
         </w:rPr>
-        <w:t xml:space="preserve">FR-09.2 Thống kê gắn kết Clan &amp; Phân tích giữ chân (`configured_clan_daily_analytics`, `user_retention_cohorts`):</w:t>
-      </w:r>
-    </w:p>
-    <w:p>
-      <w:pPr>
-        <w:pStyle w:val="ListParagraph"/>
-        <w:numPr>
-          <w:ilvl w:val="0"/>
-          <w:numId w:val="1"/>
-        </w:numPr>
-        <w:spacing w:after="40" w:before="40" w:line="260"/>
-        <w:ind w:left="360" w:hanging="240"/>
-      </w:pPr>
-      <w:r>
-        <w:rPr>
-          <w:rFonts w:ascii="Calibri" w:cs="Calibri" w:eastAsia="Calibri" w:hAnsi="Calibri"/>
-          <w:color w:val="2D3748"/>
-          <w:sz w:val="21"/>
-          <w:szCs w:val="21"/>
-        </w:rPr>
-        <w:t xml:space="preserve">Cung cấp cho Clan Master bức tranh tổng thể: Số thành viên hoạt động (</w:t>
-      </w:r>
-      <w:r>
-        <w:rPr>
-          <w:rFonts w:ascii="Calibri" w:cs="Calibri" w:eastAsia="Calibri" w:hAnsi="Calibri"/>
-          <w:color w:val="2D3748"/>
-          <w:sz w:val="21"/>
-          <w:szCs w:val="21"/>
-        </w:rPr>
-        <w:t xml:space="preserve">active_member_count</w:t>
-      </w:r>
-      <w:r>
-        <w:rPr>
-          <w:rFonts w:ascii="Calibri" w:cs="Calibri" w:eastAsia="Calibri" w:hAnsi="Calibri"/>
-          <w:color w:val="2D3748"/>
-          <w:sz w:val="21"/>
-          <w:szCs w:val="21"/>
-        </w:rPr>
-        <w:t xml:space="preserve">), mức độ gắn kết theo chu kỳ ngày 1, 7, 14, 30 (</w:t>
-      </w:r>
-      <w:r>
-        <w:rPr>
-          <w:rFonts w:ascii="Calibri" w:cs="Calibri" w:eastAsia="Calibri" w:hAnsi="Calibri"/>
-          <w:color w:val="2D3748"/>
-          <w:sz w:val="21"/>
-          <w:szCs w:val="21"/>
-        </w:rPr>
-        <w:t xml:space="preserve">user_retention_cohorts</w:t>
-      </w:r>
-      <w:r>
-        <w:rPr>
-          <w:rFonts w:ascii="Calibri" w:cs="Calibri" w:eastAsia="Calibri" w:hAnsi="Calibri"/>
-          <w:color w:val="2D3748"/>
-          <w:sz w:val="21"/>
-          <w:szCs w:val="21"/>
-        </w:rPr>
-        <w:t xml:space="preserve">).</w:t>
+        <w:t xml:space="preserve">FR-09.2 Thống kê gắn kết Clan &amp; Phân tích giữ chân (Phase 2):</w:t>
+      </w:r>
+    </w:p>
+    <w:p>
+      <w:pPr>
+        <w:pStyle w:val="ListParagraph"/>
+        <w:numPr>
+          <w:ilvl w:val="0"/>
+          <w:numId w:val="1"/>
+        </w:numPr>
+        <w:spacing w:after="40" w:before="40" w:line="260"/>
+        <w:ind w:left="360" w:hanging="240"/>
+      </w:pPr>
+      <w:r>
+        <w:rPr>
+          <w:rFonts w:ascii="Calibri" w:cs="Calibri" w:eastAsia="Calibri" w:hAnsi="Calibri"/>
+          <w:color w:val="2D3748"/>
+          <w:sz w:val="21"/>
+          <w:szCs w:val="21"/>
+        </w:rPr>
+        <w:t xml:space="preserve">Phân tích Cohort retention (D1, D7, D14, D30) và báo cáo Clan được query động trực tiếp từ CSDL lõi, sẵn sàng mở rộng các bảng tĩnh chuyên biệt trong Phase 2.</w:t>
       </w:r>
     </w:p>
     <w:p>
@@ -5058,7 +5253,7 @@
           <w:sz w:val="22"/>
           <w:szCs w:val="22"/>
         </w:rPr>
-        <w:t xml:space="preserve">FR-10: Cổng Quản trị Nội dung &amp; Quản trị Clan (Admin &amp; Community CMS)</w:t>
+        <w:t xml:space="preserve">FR-10: Cổng Quản trị Nội dung &amp; Nhật ký Kiểm toán (Admin &amp; Security Audit)</w:t>
       </w:r>
     </w:p>
     <w:p>
@@ -5122,36 +5317,36 @@
           <w:sz w:val="21"/>
           <w:szCs w:val="21"/>
         </w:rPr>
-        <w:t xml:space="preserve">FR-10.2 Quản trị quyền hạn phân cấp (RBAC):</w:t>
-      </w:r>
-    </w:p>
-    <w:p>
-      <w:pPr>
-        <w:pStyle w:val="ListParagraph"/>
-        <w:numPr>
-          <w:ilvl w:val="0"/>
-          <w:numId w:val="1"/>
-        </w:numPr>
-        <w:spacing w:after="40" w:before="40" w:line="260"/>
-        <w:ind w:left="360" w:hanging="240"/>
-      </w:pPr>
-      <w:r>
-        <w:rPr>
-          <w:rFonts w:ascii="Calibri" w:cs="Calibri" w:eastAsia="Calibri" w:hAnsi="Calibri"/>
-          <w:color w:val="2D3748"/>
-          <w:sz w:val="21"/>
-          <w:szCs w:val="21"/>
-        </w:rPr>
-        <w:t xml:space="preserve">Hệ thống bảng quyền chuẩn hóa: </w:t>
-      </w:r>
-      <w:r>
-        <w:rPr>
-          <w:rFonts w:ascii="Calibri" w:cs="Calibri" w:eastAsia="Calibri" w:hAnsi="Calibri"/>
-          <w:color w:val="2D3748"/>
-          <w:sz w:val="21"/>
-          <w:szCs w:val="21"/>
-        </w:rPr>
-        <w:t xml:space="preserve">roles</w:t>
+        <w:t xml:space="preserve">FR-10.2 Phân quyền Simple RBAC &amp; Nhật ký kiểm toán (`audit_logs`):</w:t>
+      </w:r>
+    </w:p>
+    <w:p>
+      <w:pPr>
+        <w:pStyle w:val="ListParagraph"/>
+        <w:numPr>
+          <w:ilvl w:val="0"/>
+          <w:numId w:val="1"/>
+        </w:numPr>
+        <w:spacing w:after="40" w:before="40" w:line="260"/>
+        <w:ind w:left="360" w:hanging="240"/>
+      </w:pPr>
+      <w:r>
+        <w:rPr>
+          <w:rFonts w:ascii="Calibri" w:cs="Calibri" w:eastAsia="Calibri" w:hAnsi="Calibri"/>
+          <w:color w:val="2D3748"/>
+          <w:sz w:val="21"/>
+          <w:szCs w:val="21"/>
+        </w:rPr>
+        <w:t xml:space="preserve">Phân quyền Simple RBAC qua </w:t>
+      </w:r>
+      <w:r>
+        <w:rPr>
+          <w:rFonts w:ascii="Calibri" w:cs="Calibri" w:eastAsia="Calibri" w:hAnsi="Calibri"/>
+          <w:color w:val="2D3748"/>
+          <w:sz w:val="21"/>
+          <w:szCs w:val="21"/>
+        </w:rPr>
+        <w:t xml:space="preserve">users.role</w:t>
       </w:r>
       <w:r>
         <w:rPr>
@@ -5214,61 +5409,63 @@
           <w:sz w:val="21"/>
           <w:szCs w:val="21"/>
         </w:rPr>
-        <w:t xml:space="preserve">), </w:t>
-      </w:r>
-      <w:r>
-        <w:rPr>
-          <w:rFonts w:ascii="Calibri" w:cs="Calibri" w:eastAsia="Calibri" w:hAnsi="Calibri"/>
-          <w:color w:val="2D3748"/>
-          <w:sz w:val="21"/>
-          <w:szCs w:val="21"/>
-        </w:rPr>
-        <w:t xml:space="preserve">user_roles</w:t>
-      </w:r>
-      <w:r>
-        <w:rPr>
-          <w:rFonts w:ascii="Calibri" w:cs="Calibri" w:eastAsia="Calibri" w:hAnsi="Calibri"/>
-          <w:color w:val="2D3748"/>
-          <w:sz w:val="21"/>
-          <w:szCs w:val="21"/>
-        </w:rPr>
-        <w:t xml:space="preserve"> (gán quyền hệ thống) và </w:t>
-      </w:r>
-      <w:r>
-        <w:rPr>
-          <w:rFonts w:ascii="Calibri" w:cs="Calibri" w:eastAsia="Calibri" w:hAnsi="Calibri"/>
-          <w:color w:val="2D3748"/>
-          <w:sz w:val="21"/>
-          <w:szCs w:val="21"/>
-        </w:rPr>
-        <w:t xml:space="preserve">configured_clan_role_grants</w:t>
-      </w:r>
-      <w:r>
-        <w:rPr>
-          <w:rFonts w:ascii="Calibri" w:cs="Calibri" w:eastAsia="Calibri" w:hAnsi="Calibri"/>
-          <w:color w:val="2D3748"/>
-          <w:sz w:val="21"/>
-          <w:szCs w:val="21"/>
-        </w:rPr>
-        <w:t xml:space="preserve"> (gán quyền </w:t>
-      </w:r>
-      <w:r>
-        <w:rPr>
-          <w:rFonts w:ascii="Calibri" w:cs="Calibri" w:eastAsia="Calibri" w:hAnsi="Calibri"/>
-          <w:color w:val="2D3748"/>
-          <w:sz w:val="21"/>
-          <w:szCs w:val="21"/>
-        </w:rPr>
-        <w:t xml:space="preserve">clan_moderator</w:t>
-      </w:r>
-      <w:r>
-        <w:rPr>
-          <w:rFonts w:ascii="Calibri" w:cs="Calibri" w:eastAsia="Calibri" w:hAnsi="Calibri"/>
-          <w:color w:val="2D3748"/>
-          <w:sz w:val="21"/>
-          <w:szCs w:val="21"/>
-        </w:rPr>
-        <w:t xml:space="preserve"> quản trị đố vui nội bộ Clan).</w:t>
+        <w:t xml:space="preserve">) và phân quyền Clan qua </w:t>
+      </w:r>
+      <w:r>
+        <w:rPr>
+          <w:rFonts w:ascii="Calibri" w:cs="Calibri" w:eastAsia="Calibri" w:hAnsi="Calibri"/>
+          <w:color w:val="2D3748"/>
+          <w:sz w:val="21"/>
+          <w:szCs w:val="21"/>
+        </w:rPr>
+        <w:t xml:space="preserve">clan_moderator_grants</w:t>
+      </w:r>
+      <w:r>
+        <w:rPr>
+          <w:rFonts w:ascii="Calibri" w:cs="Calibri" w:eastAsia="Calibri" w:hAnsi="Calibri"/>
+          <w:color w:val="2D3748"/>
+          <w:sz w:val="21"/>
+          <w:szCs w:val="21"/>
+        </w:rPr>
+        <w:t xml:space="preserve">.</w:t>
+      </w:r>
+    </w:p>
+    <w:p>
+      <w:pPr>
+        <w:pStyle w:val="ListParagraph"/>
+        <w:numPr>
+          <w:ilvl w:val="0"/>
+          <w:numId w:val="1"/>
+        </w:numPr>
+        <w:spacing w:after="40" w:before="40" w:line="260"/>
+        <w:ind w:left="360" w:hanging="240"/>
+      </w:pPr>
+      <w:r>
+        <w:rPr>
+          <w:rFonts w:ascii="Calibri" w:cs="Calibri" w:eastAsia="Calibri" w:hAnsi="Calibri"/>
+          <w:color w:val="2D3748"/>
+          <w:sz w:val="21"/>
+          <w:szCs w:val="21"/>
+        </w:rPr>
+        <w:t xml:space="preserve">Hệ thống ghi nhật ký kiểm toán không thể sửa xóa (</w:t>
+      </w:r>
+      <w:r>
+        <w:rPr>
+          <w:rFonts w:ascii="Calibri" w:cs="Calibri" w:eastAsia="Calibri" w:hAnsi="Calibri"/>
+          <w:color w:val="2D3748"/>
+          <w:sz w:val="21"/>
+          <w:szCs w:val="21"/>
+        </w:rPr>
+        <w:t xml:space="preserve">audit_logs</w:t>
+      </w:r>
+      <w:r>
+        <w:rPr>
+          <w:rFonts w:ascii="Calibri" w:cs="Calibri" w:eastAsia="Calibri" w:hAnsi="Calibri"/>
+          <w:color w:val="2D3748"/>
+          <w:sz w:val="21"/>
+          <w:szCs w:val="21"/>
+        </w:rPr>
+        <w:t xml:space="preserve"> - Module 09, chuẩn bảo mật ADM-09/ADM-12) cho mọi thao tác phân quyền, kỷ luật và thay đổi cấu hình.</w:t>
       </w:r>
     </w:p>
     <w:p>
@@ -6242,16 +6439,34 @@
           <w:sz w:val="21"/>
           <w:szCs w:val="21"/>
         </w:rPr>
-        <w:t xml:space="preserve">), được tổng hợp vào bảng </w:t>
-      </w:r>
-      <w:r>
-        <w:rPr>
-          <w:rFonts w:ascii="Calibri" w:cs="Calibri" w:eastAsia="Calibri" w:hAnsi="Calibri"/>
-          <w:color w:val="2D3748"/>
-          <w:sz w:val="21"/>
-          <w:szCs w:val="21"/>
-        </w:rPr>
-        <w:t xml:space="preserve">user_daily_activity</w:t>
+        <w:t xml:space="preserve">), được ghi nhận vào cột </w:t>
+      </w:r>
+      <w:r>
+        <w:rPr>
+          <w:rFonts w:ascii="Calibri" w:cs="Calibri" w:eastAsia="Calibri" w:hAnsi="Calibri"/>
+          <w:color w:val="2D3748"/>
+          <w:sz w:val="21"/>
+          <w:szCs w:val="21"/>
+        </w:rPr>
+        <w:t xml:space="preserve">daily_activity</w:t>
+      </w:r>
+      <w:r>
+        <w:rPr>
+          <w:rFonts w:ascii="Calibri" w:cs="Calibri" w:eastAsia="Calibri" w:hAnsi="Calibri"/>
+          <w:color w:val="2D3748"/>
+          <w:sz w:val="21"/>
+          <w:szCs w:val="21"/>
+        </w:rPr>
+        <w:t xml:space="preserve"> (JSONB) trong bảng </w:t>
+      </w:r>
+      <w:r>
+        <w:rPr>
+          <w:rFonts w:ascii="Calibri" w:cs="Calibri" w:eastAsia="Calibri" w:hAnsi="Calibri"/>
+          <w:color w:val="2D3748"/>
+          <w:sz w:val="21"/>
+          <w:szCs w:val="21"/>
+        </w:rPr>
+        <w:t xml:space="preserve">user_streaks</w:t>
       </w:r>
       <w:r>
         <w:rPr>
@@ -6344,25 +6559,43 @@
           <w:sz w:val="21"/>
           <w:szCs w:val="21"/>
         </w:rPr>
-        <w:t xml:space="preserve">): Hệ thống tự động ghi 1 sự kiện tiêu thụ vào </w:t>
-      </w:r>
-      <w:r>
-        <w:rPr>
-          <w:rFonts w:ascii="Calibri" w:cs="Calibri" w:eastAsia="Calibri" w:hAnsi="Calibri"/>
-          <w:color w:val="2D3748"/>
-          <w:sz w:val="21"/>
-          <w:szCs w:val="21"/>
-        </w:rPr>
-        <w:t xml:space="preserve">streak_freeze_events</w:t>
-      </w:r>
-      <w:r>
-        <w:rPr>
-          <w:rFonts w:ascii="Calibri" w:cs="Calibri" w:eastAsia="Calibri" w:hAnsi="Calibri"/>
-          <w:color w:val="2D3748"/>
-          <w:sz w:val="21"/>
-          <w:szCs w:val="21"/>
-        </w:rPr>
-        <w:t xml:space="preserve">, trừ 1 khiên và bảo lưu chuỗi ngày.</w:t>
+        <w:t xml:space="preserve">): Hệ thống tự động trừ 1 khiên, ghi nhật ký vào </w:t>
+      </w:r>
+      <w:r>
+        <w:rPr>
+          <w:rFonts w:ascii="Calibri" w:cs="Calibri" w:eastAsia="Calibri" w:hAnsi="Calibri"/>
+          <w:color w:val="2D3748"/>
+          <w:sz w:val="21"/>
+          <w:szCs w:val="21"/>
+        </w:rPr>
+        <w:t xml:space="preserve">freeze_history</w:t>
+      </w:r>
+      <w:r>
+        <w:rPr>
+          <w:rFonts w:ascii="Calibri" w:cs="Calibri" w:eastAsia="Calibri" w:hAnsi="Calibri"/>
+          <w:color w:val="2D3748"/>
+          <w:sz w:val="21"/>
+          <w:szCs w:val="21"/>
+        </w:rPr>
+        <w:t xml:space="preserve"> (JSONB) trong </w:t>
+      </w:r>
+      <w:r>
+        <w:rPr>
+          <w:rFonts w:ascii="Calibri" w:cs="Calibri" w:eastAsia="Calibri" w:hAnsi="Calibri"/>
+          <w:color w:val="2D3748"/>
+          <w:sz w:val="21"/>
+          <w:szCs w:val="21"/>
+        </w:rPr>
+        <w:t xml:space="preserve">user_streaks</w:t>
+      </w:r>
+      <w:r>
+        <w:rPr>
+          <w:rFonts w:ascii="Calibri" w:cs="Calibri" w:eastAsia="Calibri" w:hAnsi="Calibri"/>
+          <w:color w:val="2D3748"/>
+          <w:sz w:val="21"/>
+          <w:szCs w:val="21"/>
+        </w:rPr>
+        <w:t xml:space="preserve"> và bảo lưu chuỗi ngày.</w:t>
       </w:r>
     </w:p>
     <w:p>
@@ -6437,25 +6670,25 @@
           <w:sz w:val="21"/>
           <w:szCs w:val="21"/>
         </w:rPr>
-        <w:t xml:space="preserve">Bảng xếp hạng cá nhân trong Clan được tổng hợp từ điểm XP tích lũy trong tuần (</w:t>
-      </w:r>
-      <w:r>
-        <w:rPr>
-          <w:rFonts w:ascii="Calibri" w:cs="Calibri" w:eastAsia="Calibri" w:hAnsi="Calibri"/>
-          <w:color w:val="2D3748"/>
-          <w:sz w:val="21"/>
-          <w:szCs w:val="21"/>
-        </w:rPr>
-        <w:t xml:space="preserve">leaderboard_weeks</w:t>
-      </w:r>
-      <w:r>
-        <w:rPr>
-          <w:rFonts w:ascii="Calibri" w:cs="Calibri" w:eastAsia="Calibri" w:hAnsi="Calibri"/>
-          <w:color w:val="2D3748"/>
-          <w:sz w:val="21"/>
-          <w:szCs w:val="21"/>
-        </w:rPr>
-        <w:t xml:space="preserve">).</w:t>
+        <w:t xml:space="preserve">Bảng xếp hạng cá nhân trong Clan được tổng hợp từ điểm XP tích lũy trong tuần, quản lý tập trung trong bảng </w:t>
+      </w:r>
+      <w:r>
+        <w:rPr>
+          <w:rFonts w:ascii="Calibri" w:cs="Calibri" w:eastAsia="Calibri" w:hAnsi="Calibri"/>
+          <w:color w:val="2D3748"/>
+          <w:sz w:val="21"/>
+          <w:szCs w:val="21"/>
+        </w:rPr>
+        <w:t xml:space="preserve">weekly_leaderboards</w:t>
+      </w:r>
+      <w:r>
+        <w:rPr>
+          <w:rFonts w:ascii="Calibri" w:cs="Calibri" w:eastAsia="Calibri" w:hAnsi="Calibri"/>
+          <w:color w:val="2D3748"/>
+          <w:sz w:val="21"/>
+          <w:szCs w:val="21"/>
+        </w:rPr>
+        <w:t xml:space="preserve">.</w:t>
       </w:r>
     </w:p>
     <w:p>
@@ -6495,34 +6728,52 @@
           <w:sz w:val="21"/>
           <w:szCs w:val="21"/>
         </w:rPr>
-        <w:t xml:space="preserve">, lưu vết lịch sử vinh danh vào </w:t>
-      </w:r>
-      <w:r>
-        <w:rPr>
-          <w:rFonts w:ascii="Calibri" w:cs="Calibri" w:eastAsia="Calibri" w:hAnsi="Calibri"/>
-          <w:color w:val="2D3748"/>
-          <w:sz w:val="21"/>
-          <w:szCs w:val="21"/>
-        </w:rPr>
-        <w:t xml:space="preserve">user_weekly_leaderboard</w:t>
-      </w:r>
-      <w:r>
-        <w:rPr>
-          <w:rFonts w:ascii="Calibri" w:cs="Calibri" w:eastAsia="Calibri" w:hAnsi="Calibri"/>
-          <w:color w:val="2D3748"/>
-          <w:sz w:val="21"/>
-          <w:szCs w:val="21"/>
-        </w:rPr>
-        <w:t xml:space="preserve"> và </w:t>
-      </w:r>
-      <w:r>
-        <w:rPr>
-          <w:rFonts w:ascii="Calibri" w:cs="Calibri" w:eastAsia="Calibri" w:hAnsi="Calibri"/>
-          <w:color w:val="2D3748"/>
-          <w:sz w:val="21"/>
-          <w:szCs w:val="21"/>
-        </w:rPr>
-        <w:t xml:space="preserve">configured_clan_weekly_stats</w:t>
+        <w:t xml:space="preserve">, cập nhật </w:t>
+      </w:r>
+      <w:r>
+        <w:rPr>
+          <w:rFonts w:ascii="Calibri" w:cs="Calibri" w:eastAsia="Calibri" w:hAnsi="Calibri"/>
+          <w:color w:val="2D3748"/>
+          <w:sz w:val="21"/>
+          <w:szCs w:val="21"/>
+        </w:rPr>
+        <w:t xml:space="preserve">rank</w:t>
+      </w:r>
+      <w:r>
+        <w:rPr>
+          <w:rFonts w:ascii="Calibri" w:cs="Calibri" w:eastAsia="Calibri" w:hAnsi="Calibri"/>
+          <w:color w:val="2D3748"/>
+          <w:sz w:val="21"/>
+          <w:szCs w:val="21"/>
+        </w:rPr>
+        <w:t xml:space="preserve"> và chuyển </w:t>
+      </w:r>
+      <w:r>
+        <w:rPr>
+          <w:rFonts w:ascii="Calibri" w:cs="Calibri" w:eastAsia="Calibri" w:hAnsi="Calibri"/>
+          <w:color w:val="2D3748"/>
+          <w:sz w:val="21"/>
+          <w:szCs w:val="21"/>
+        </w:rPr>
+        <w:t xml:space="preserve">status = 'finalized'</w:t>
+      </w:r>
+      <w:r>
+        <w:rPr>
+          <w:rFonts w:ascii="Calibri" w:cs="Calibri" w:eastAsia="Calibri" w:hAnsi="Calibri"/>
+          <w:color w:val="2D3748"/>
+          <w:sz w:val="21"/>
+          <w:szCs w:val="21"/>
+        </w:rPr>
+        <w:t xml:space="preserve"> trong </w:t>
+      </w:r>
+      <w:r>
+        <w:rPr>
+          <w:rFonts w:ascii="Calibri" w:cs="Calibri" w:eastAsia="Calibri" w:hAnsi="Calibri"/>
+          <w:color w:val="2D3748"/>
+          <w:sz w:val="21"/>
+          <w:szCs w:val="21"/>
+        </w:rPr>
+        <w:t xml:space="preserve">weekly_leaderboards</w:t>
       </w:r>
       <w:r>
         <w:rPr>
@@ -6573,7 +6824,47 @@
           <w:sz w:val="21"/>
           <w:szCs w:val="21"/>
         </w:rPr>
-        <w:t xml:space="preserve">Để đảm bảo dự án triển khai thành công xuất sắc trong 10 tuần của Mezon Campus Studio 2026, CSDL 45 bảng và các tính năng được phân kỳ làm 2 giai đoạn rõ ràng:</w:t>
+        <w:t xml:space="preserve">Dưới sự định hướng của Mentor </w:t>
+      </w:r>
+      <w:r>
+        <w:rPr>
+          <w:rFonts w:ascii="Calibri" w:cs="Calibri" w:eastAsia="Calibri" w:hAnsi="Calibri"/>
+          <w:b/>
+          <w:bCs/>
+          <w:color w:val="2D3748"/>
+          <w:sz w:val="21"/>
+          <w:szCs w:val="21"/>
+        </w:rPr>
+        <w:t xml:space="preserve">Mai Hồng Mận</w:t>
+      </w:r>
+      <w:r>
+        <w:rPr>
+          <w:rFonts w:ascii="Calibri" w:cs="Calibri" w:eastAsia="Calibri" w:hAnsi="Calibri"/>
+          <w:color w:val="2D3748"/>
+          <w:sz w:val="21"/>
+          <w:szCs w:val="21"/>
+        </w:rPr>
+        <w:t xml:space="preserve"> nhằm loại bỏ over-engineering và tối ưu hóa nguồn lực trong vòng đời 10 tuần của Mezon Campus Studio 2026, hệ thống áp dụng </w:t>
+      </w:r>
+      <w:r>
+        <w:rPr>
+          <w:rFonts w:ascii="Calibri" w:cs="Calibri" w:eastAsia="Calibri" w:hAnsi="Calibri"/>
+          <w:b/>
+          <w:bCs/>
+          <w:color w:val="2D3748"/>
+          <w:sz w:val="21"/>
+          <w:szCs w:val="21"/>
+        </w:rPr>
+        <w:t xml:space="preserve">Kiến trúc CSDL Core MVP 22 bảng tinh gọn (Lean Architecture)</w:t>
+      </w:r>
+      <w:r>
+        <w:rPr>
+          <w:rFonts w:ascii="Calibri" w:cs="Calibri" w:eastAsia="Calibri" w:hAnsi="Calibri"/>
+          <w:color w:val="2D3748"/>
+          <w:sz w:val="21"/>
+          <w:szCs w:val="21"/>
+        </w:rPr>
+        <w:t xml:space="preserve"> thông qua cơ chế lưu trữ JSONB linh hoạt. Toàn bộ 22 bảng lõi được hoàn thiện ngay trong Milestone 1 (Sprint 1–3), phân bổ phát triển tính năng theo lộ trình:</w:t>
       </w:r>
     </w:p>
     <w:tbl>
@@ -6589,10 +6880,10 @@
         </w:tblBorders>
       </w:tblPr>
       <w:tblGrid>
-        <w:gridCol w:w="2293"/>
-        <w:gridCol w:w="2196"/>
-        <w:gridCol w:w="2586"/>
-        <w:gridCol w:w="1951"/>
+        <w:gridCol w:w="2111"/>
+        <w:gridCol w:w="2784"/>
+        <w:gridCol w:w="2335"/>
+        <w:gridCol w:w="1796"/>
       </w:tblGrid>
       <w:tr>
         <w:trPr>
@@ -6601,7 +6892,7 @@
         </w:trPr>
         <w:tc>
           <w:tcPr>
-            <w:tcW w:type="dxa" w:w="2293"/>
+            <w:tcW w:type="dxa" w:w="2111"/>
             <w:tcBorders>
               <w:top w:val="single" w:color="CBD5E0" w:sz="4"/>
               <w:left w:val="single" w:color="CBD5E0" w:sz="4"/>
@@ -6635,7 +6926,7 @@
         </w:tc>
         <w:tc>
           <w:tcPr>
-            <w:tcW w:type="dxa" w:w="2196"/>
+            <w:tcW w:type="dxa" w:w="2784"/>
             <w:tcBorders>
               <w:top w:val="single" w:color="CBD5E0" w:sz="4"/>
               <w:left w:val="single" w:color="CBD5E0" w:sz="4"/>
@@ -6663,13 +6954,13 @@
                 <w:sz w:val="19"/>
                 <w:szCs w:val="19"/>
               </w:rPr>
-              <w:t xml:space="preserve">Giai đoạn 1: Core MVP (Sprint 1–3, ~20 bảng)</w:t>
+              <w:t xml:space="preserve">Giai đoạn 1: Core MVP (Sprint 1–3, 22 bảng)</w:t>
             </w:r>
           </w:p>
         </w:tc>
         <w:tc>
           <w:tcPr>
-            <w:tcW w:type="dxa" w:w="2586"/>
+            <w:tcW w:type="dxa" w:w="2335"/>
             <w:tcBorders>
               <w:top w:val="single" w:color="CBD5E0" w:sz="4"/>
               <w:left w:val="single" w:color="CBD5E0" w:sz="4"/>
@@ -6697,13 +6988,13 @@
                 <w:sz w:val="19"/>
                 <w:szCs w:val="19"/>
               </w:rPr>
-              <w:t xml:space="preserve">Giai đoạn 2: Trọng tâm Mezon (Sprint 4–6, Đủ 45 bảng)</w:t>
+              <w:t xml:space="preserve">Giai đoạn 2: Tối ưu Mezon (Sprint 4–6)</w:t>
             </w:r>
           </w:p>
         </w:tc>
         <w:tc>
           <w:tcPr>
-            <w:tcW w:type="dxa" w:w="1951"/>
+            <w:tcW w:type="dxa" w:w="1796"/>
             <w:tcBorders>
               <w:top w:val="single" w:color="CBD5E0" w:sz="4"/>
               <w:left w:val="single" w:color="CBD5E0" w:sz="4"/>
@@ -6743,7 +7034,7 @@
         </w:trPr>
         <w:tc>
           <w:tcPr>
-            <w:tcW w:type="dxa" w:w="2293"/>
+            <w:tcW w:type="dxa" w:w="2111"/>
             <w:tcBorders>
               <w:top w:val="single" w:color="CBD5E0" w:sz="4"/>
               <w:left w:val="single" w:color="CBD5E0" w:sz="4"/>
@@ -6777,7 +7068,7 @@
         </w:tc>
         <w:tc>
           <w:tcPr>
-            <w:tcW w:type="dxa" w:w="2196"/>
+            <w:tcW w:type="dxa" w:w="2784"/>
             <w:tcBorders>
               <w:top w:val="single" w:color="CBD5E0" w:sz="4"/>
               <w:left w:val="single" w:color="CBD5E0" w:sz="4"/>
@@ -6821,13 +7112,13 @@
                 <w:sz w:val="19"/>
                 <w:szCs w:val="19"/>
               </w:rPr>
-              <w:t xml:space="preserve">)</w:t>
+              <w:t xml:space="preserve">, Simple RBAC)</w:t>
             </w:r>
           </w:p>
         </w:tc>
         <w:tc>
           <w:tcPr>
-            <w:tcW w:type="dxa" w:w="2586"/>
+            <w:tcW w:type="dxa" w:w="2335"/>
             <w:tcBorders>
               <w:top w:val="single" w:color="CBD5E0" w:sz="4"/>
               <w:left w:val="single" w:color="CBD5E0" w:sz="4"/>
@@ -6853,13 +7144,31 @@
                 <w:sz w:val="19"/>
                 <w:szCs w:val="19"/>
               </w:rPr>
-              <w:t xml:space="preserve">Bổ sung khảo sát mục tiêu</w:t>
+              <w:t xml:space="preserve">Bổ sung khảo sát mục tiêu (</w:t>
+            </w:r>
+            <w:r>
+              <w:rPr>
+                <w:rFonts w:ascii="Calibri" w:cs="Calibri" w:eastAsia="Calibri" w:hAnsi="Calibri"/>
+                <w:color w:val="2D3748"/>
+                <w:sz w:val="19"/>
+                <w:szCs w:val="19"/>
+              </w:rPr>
+              <w:t xml:space="preserve">learner_profiles</w:t>
+            </w:r>
+            <w:r>
+              <w:rPr>
+                <w:rFonts w:ascii="Calibri" w:cs="Calibri" w:eastAsia="Calibri" w:hAnsi="Calibri"/>
+                <w:color w:val="2D3748"/>
+                <w:sz w:val="19"/>
+                <w:szCs w:val="19"/>
+              </w:rPr>
+              <w:t xml:space="preserve">)</w:t>
             </w:r>
           </w:p>
         </w:tc>
         <w:tc>
           <w:tcPr>
-            <w:tcW w:type="dxa" w:w="1951"/>
+            <w:tcW w:type="dxa" w:w="1796"/>
             <w:tcBorders>
               <w:top w:val="single" w:color="CBD5E0" w:sz="4"/>
               <w:left w:val="single" w:color="CBD5E0" w:sz="4"/>
@@ -6897,7 +7206,7 @@
         </w:trPr>
         <w:tc>
           <w:tcPr>
-            <w:tcW w:type="dxa" w:w="2293"/>
+            <w:tcW w:type="dxa" w:w="2111"/>
             <w:tcBorders>
               <w:top w:val="single" w:color="CBD5E0" w:sz="4"/>
               <w:left w:val="single" w:color="CBD5E0" w:sz="4"/>
@@ -6931,7 +7240,7 @@
         </w:tc>
         <w:tc>
           <w:tcPr>
-            <w:tcW w:type="dxa" w:w="2196"/>
+            <w:tcW w:type="dxa" w:w="2784"/>
             <w:tcBorders>
               <w:top w:val="single" w:color="CBD5E0" w:sz="4"/>
               <w:left w:val="single" w:color="CBD5E0" w:sz="4"/>
@@ -6957,13 +7266,31 @@
                 <w:sz w:val="19"/>
                 <w:szCs w:val="19"/>
               </w:rPr>
-              <w:t xml:space="preserve">❌ Tự chọn trình độ</w:t>
+              <w:t xml:space="preserve">✅ </w:t>
+            </w:r>
+            <w:r>
+              <w:rPr>
+                <w:rFonts w:ascii="Calibri" w:cs="Calibri" w:eastAsia="Calibri" w:hAnsi="Calibri"/>
+                <w:color w:val="2D3748"/>
+                <w:sz w:val="19"/>
+                <w:szCs w:val="19"/>
+              </w:rPr>
+              <w:t xml:space="preserve">placement_tests</w:t>
+            </w:r>
+            <w:r>
+              <w:rPr>
+                <w:rFonts w:ascii="Calibri" w:cs="Calibri" w:eastAsia="Calibri" w:hAnsi="Calibri"/>
+                <w:color w:val="2D3748"/>
+                <w:sz w:val="19"/>
+                <w:szCs w:val="19"/>
+              </w:rPr>
+              <w:t xml:space="preserve"> (answers_detail JSONB)</w:t>
             </w:r>
           </w:p>
         </w:tc>
         <w:tc>
           <w:tcPr>
-            <w:tcW w:type="dxa" w:w="2586"/>
+            <w:tcW w:type="dxa" w:w="2335"/>
             <w:tcBorders>
               <w:top w:val="single" w:color="CBD5E0" w:sz="4"/>
               <w:left w:val="single" w:color="CBD5E0" w:sz="4"/>
@@ -6989,40 +7316,13 @@
                 <w:sz w:val="19"/>
                 <w:szCs w:val="19"/>
               </w:rPr>
-              <w:t xml:space="preserve">✅ </w:t>
-            </w:r>
-            <w:r>
-              <w:rPr>
-                <w:rFonts w:ascii="Calibri" w:cs="Calibri" w:eastAsia="Calibri" w:hAnsi="Calibri"/>
-                <w:color w:val="2D3748"/>
-                <w:sz w:val="19"/>
-                <w:szCs w:val="19"/>
-              </w:rPr>
-              <w:t xml:space="preserve">placement_attempts</w:t>
-            </w:r>
-            <w:r>
-              <w:rPr>
-                <w:rFonts w:ascii="Calibri" w:cs="Calibri" w:eastAsia="Calibri" w:hAnsi="Calibri"/>
-                <w:color w:val="2D3748"/>
-                <w:sz w:val="19"/>
-                <w:szCs w:val="19"/>
-              </w:rPr>
-              <w:t xml:space="preserve"> &amp; </w:t>
-            </w:r>
-            <w:r>
-              <w:rPr>
-                <w:rFonts w:ascii="Calibri" w:cs="Calibri" w:eastAsia="Calibri" w:hAnsi="Calibri"/>
-                <w:color w:val="2D3748"/>
-                <w:sz w:val="19"/>
-                <w:szCs w:val="19"/>
-              </w:rPr>
-              <w:t xml:space="preserve">answers</w:t>
+              <w:t xml:space="preserve">Ngân hàng đề thi phân tầng nâng cao</w:t>
             </w:r>
           </w:p>
         </w:tc>
         <w:tc>
           <w:tcPr>
-            <w:tcW w:type="dxa" w:w="1951"/>
+            <w:tcW w:type="dxa" w:w="1796"/>
             <w:tcBorders>
               <w:top w:val="single" w:color="CBD5E0" w:sz="4"/>
               <w:left w:val="single" w:color="CBD5E0" w:sz="4"/>
@@ -7060,7 +7360,7 @@
         </w:trPr>
         <w:tc>
           <w:tcPr>
-            <w:tcW w:type="dxa" w:w="2293"/>
+            <w:tcW w:type="dxa" w:w="2111"/>
             <w:tcBorders>
               <w:top w:val="single" w:color="CBD5E0" w:sz="4"/>
               <w:left w:val="single" w:color="CBD5E0" w:sz="4"/>
@@ -7094,7 +7394,7 @@
         </w:tc>
         <w:tc>
           <w:tcPr>
-            <w:tcW w:type="dxa" w:w="2196"/>
+            <w:tcW w:type="dxa" w:w="2784"/>
             <w:tcBorders>
               <w:top w:val="single" w:color="CBD5E0" w:sz="4"/>
               <w:left w:val="single" w:color="CBD5E0" w:sz="4"/>
@@ -7174,13 +7474,31 @@
                 <w:sz w:val="19"/>
                 <w:szCs w:val="19"/>
               </w:rPr>
+              <w:t xml:space="preserve">, </w:t>
+            </w:r>
+            <w:r>
+              <w:rPr>
+                <w:rFonts w:ascii="Calibri" w:cs="Calibri" w:eastAsia="Calibri" w:hAnsi="Calibri"/>
+                <w:color w:val="2D3748"/>
+                <w:sz w:val="19"/>
+                <w:szCs w:val="19"/>
+              </w:rPr>
+              <w:t xml:space="preserve">vocabulary_items</w:t>
+            </w:r>
+            <w:r>
+              <w:rPr>
+                <w:rFonts w:ascii="Calibri" w:cs="Calibri" w:eastAsia="Calibri" w:hAnsi="Calibri"/>
+                <w:color w:val="2D3748"/>
+                <w:sz w:val="19"/>
+                <w:szCs w:val="19"/>
+              </w:rPr>
               <w:t xml:space="preserve">)</w:t>
             </w:r>
           </w:p>
         </w:tc>
         <w:tc>
           <w:tcPr>
-            <w:tcW w:type="dxa" w:w="2586"/>
+            <w:tcW w:type="dxa" w:w="2335"/>
             <w:tcBorders>
               <w:top w:val="single" w:color="CBD5E0" w:sz="4"/>
               <w:left w:val="single" w:color="CBD5E0" w:sz="4"/>
@@ -7212,7 +7530,7 @@
         </w:tc>
         <w:tc>
           <w:tcPr>
-            <w:tcW w:type="dxa" w:w="1951"/>
+            <w:tcW w:type="dxa" w:w="1796"/>
             <w:tcBorders>
               <w:top w:val="single" w:color="CBD5E0" w:sz="4"/>
               <w:left w:val="single" w:color="CBD5E0" w:sz="4"/>
@@ -7250,7 +7568,7 @@
         </w:trPr>
         <w:tc>
           <w:tcPr>
-            <w:tcW w:type="dxa" w:w="2293"/>
+            <w:tcW w:type="dxa" w:w="2111"/>
             <w:tcBorders>
               <w:top w:val="single" w:color="CBD5E0" w:sz="4"/>
               <w:left w:val="single" w:color="CBD5E0" w:sz="4"/>
@@ -7278,13 +7596,13 @@
                 <w:sz w:val="19"/>
                 <w:szCs w:val="19"/>
               </w:rPr>
-              <w:t xml:space="preserve">Sổ tay từ vựng cá nhân</w:t>
+              <w:t xml:space="preserve">Thuật toán Spaced Repetition (SRS SM-2)</w:t>
             </w:r>
           </w:p>
         </w:tc>
         <w:tc>
           <w:tcPr>
-            <w:tcW w:type="dxa" w:w="2196"/>
+            <w:tcW w:type="dxa" w:w="2784"/>
             <w:tcBorders>
               <w:top w:val="single" w:color="CBD5E0" w:sz="4"/>
               <w:left w:val="single" w:color="CBD5E0" w:sz="4"/>
@@ -7310,13 +7628,31 @@
                 <w:sz w:val="19"/>
                 <w:szCs w:val="19"/>
               </w:rPr>
-              <w:t xml:space="preserve">❌ Để giai đoạn 2</w:t>
+              <w:t xml:space="preserve">✅ </w:t>
+            </w:r>
+            <w:r>
+              <w:rPr>
+                <w:rFonts w:ascii="Calibri" w:cs="Calibri" w:eastAsia="Calibri" w:hAnsi="Calibri"/>
+                <w:color w:val="2D3748"/>
+                <w:sz w:val="19"/>
+                <w:szCs w:val="19"/>
+              </w:rPr>
+              <w:t xml:space="preserve">srs_cards</w:t>
+            </w:r>
+            <w:r>
+              <w:rPr>
+                <w:rFonts w:ascii="Calibri" w:cs="Calibri" w:eastAsia="Calibri" w:hAnsi="Calibri"/>
+                <w:color w:val="2D3748"/>
+                <w:sz w:val="19"/>
+                <w:szCs w:val="19"/>
+              </w:rPr>
+              <w:t xml:space="preserve"> (review_history JSONB)</w:t>
             </w:r>
           </w:p>
         </w:tc>
         <w:tc>
           <w:tcPr>
-            <w:tcW w:type="dxa" w:w="2586"/>
+            <w:tcW w:type="dxa" w:w="2335"/>
             <w:tcBorders>
               <w:top w:val="single" w:color="CBD5E0" w:sz="4"/>
               <w:left w:val="single" w:color="CBD5E0" w:sz="4"/>
@@ -7342,22 +7678,13 @@
                 <w:sz w:val="19"/>
                 <w:szCs w:val="19"/>
               </w:rPr>
-              <w:t xml:space="preserve">✅ </w:t>
-            </w:r>
-            <w:r>
-              <w:rPr>
-                <w:rFonts w:ascii="Calibri" w:cs="Calibri" w:eastAsia="Calibri" w:hAnsi="Calibri"/>
-                <w:color w:val="2D3748"/>
-                <w:sz w:val="19"/>
-                <w:szCs w:val="19"/>
-              </w:rPr>
-              <w:t xml:space="preserve">user_vocabulary_deck</w:t>
+              <w:t xml:space="preserve">Tối ưu hóa trọng số ghi nhớ Ease Factor</w:t>
             </w:r>
           </w:p>
         </w:tc>
         <w:tc>
           <w:tcPr>
-            <w:tcW w:type="dxa" w:w="1951"/>
+            <w:tcW w:type="dxa" w:w="1796"/>
             <w:tcBorders>
               <w:top w:val="single" w:color="CBD5E0" w:sz="4"/>
               <w:left w:val="single" w:color="CBD5E0" w:sz="4"/>
@@ -7383,7 +7710,7 @@
                 <w:sz w:val="19"/>
                 <w:szCs w:val="19"/>
               </w:rPr>
-              <w:t xml:space="preserve">Xuất file Anki cá nhân</w:t>
+              <w:t xml:space="preserve">Biểu đồ đường cong quên lãng</w:t>
             </w:r>
           </w:p>
         </w:tc>
@@ -7395,7 +7722,7 @@
         </w:trPr>
         <w:tc>
           <w:tcPr>
-            <w:tcW w:type="dxa" w:w="2293"/>
+            <w:tcW w:type="dxa" w:w="2111"/>
             <w:tcBorders>
               <w:top w:val="single" w:color="CBD5E0" w:sz="4"/>
               <w:left w:val="single" w:color="CBD5E0" w:sz="4"/>
@@ -7423,13 +7750,13 @@
                 <w:sz w:val="19"/>
                 <w:szCs w:val="19"/>
               </w:rPr>
-              <w:t xml:space="preserve">Thuật toán Spaced Repetition (SRS SM-2)</w:t>
+              <w:t xml:space="preserve">Hệ thống Điểm XP Ledger &amp; Streak</w:t>
             </w:r>
           </w:p>
         </w:tc>
         <w:tc>
           <w:tcPr>
-            <w:tcW w:type="dxa" w:w="2196"/>
+            <w:tcW w:type="dxa" w:w="2784"/>
             <w:tcBorders>
               <w:top w:val="single" w:color="CBD5E0" w:sz="4"/>
               <w:left w:val="single" w:color="CBD5E0" w:sz="4"/>
@@ -7464,40 +7791,31 @@
                 <w:sz w:val="19"/>
                 <w:szCs w:val="19"/>
               </w:rPr>
-              <w:t xml:space="preserve">srs_cards</w:t>
-            </w:r>
-            <w:r>
-              <w:rPr>
-                <w:rFonts w:ascii="Calibri" w:cs="Calibri" w:eastAsia="Calibri" w:hAnsi="Calibri"/>
-                <w:color w:val="2D3748"/>
-                <w:sz w:val="19"/>
-                <w:szCs w:val="19"/>
-              </w:rPr>
-              <w:t xml:space="preserve">, </w:t>
-            </w:r>
-            <w:r>
-              <w:rPr>
-                <w:rFonts w:ascii="Calibri" w:cs="Calibri" w:eastAsia="Calibri" w:hAnsi="Calibri"/>
-                <w:color w:val="2D3748"/>
-                <w:sz w:val="19"/>
-                <w:szCs w:val="19"/>
-              </w:rPr>
-              <w:t xml:space="preserve">srs_reviews</w:t>
-            </w:r>
-            <w:r>
-              <w:rPr>
-                <w:rFonts w:ascii="Calibri" w:cs="Calibri" w:eastAsia="Calibri" w:hAnsi="Calibri"/>
-                <w:color w:val="2D3748"/>
-                <w:sz w:val="19"/>
-                <w:szCs w:val="19"/>
-              </w:rPr>
-              <w:t xml:space="preserve"> 4 nút</w:t>
+              <w:t xml:space="preserve">xp_ledger</w:t>
+            </w:r>
+            <w:r>
+              <w:rPr>
+                <w:rFonts w:ascii="Calibri" w:cs="Calibri" w:eastAsia="Calibri" w:hAnsi="Calibri"/>
+                <w:color w:val="2D3748"/>
+                <w:sz w:val="19"/>
+                <w:szCs w:val="19"/>
+              </w:rPr>
+              <w:t xml:space="preserve"> (idempotent), </w:t>
+            </w:r>
+            <w:r>
+              <w:rPr>
+                <w:rFonts w:ascii="Calibri" w:cs="Calibri" w:eastAsia="Calibri" w:hAnsi="Calibri"/>
+                <w:color w:val="2D3748"/>
+                <w:sz w:val="19"/>
+                <w:szCs w:val="19"/>
+              </w:rPr>
+              <w:t xml:space="preserve">user_streaks</w:t>
             </w:r>
           </w:p>
         </w:tc>
         <w:tc>
           <w:tcPr>
-            <w:tcW w:type="dxa" w:w="2586"/>
+            <w:tcW w:type="dxa" w:w="2335"/>
             <w:tcBorders>
               <w:top w:val="single" w:color="CBD5E0" w:sz="4"/>
               <w:left w:val="single" w:color="CBD5E0" w:sz="4"/>
@@ -7523,13 +7841,22 @@
                 <w:sz w:val="19"/>
                 <w:szCs w:val="19"/>
               </w:rPr>
-              <w:t xml:space="preserve">Tối ưu hóa trọng số ghi nhớ</w:t>
+              <w:t xml:space="preserve">Heatmap hoạt động chi tiết từ </w:t>
+            </w:r>
+            <w:r>
+              <w:rPr>
+                <w:rFonts w:ascii="Calibri" w:cs="Calibri" w:eastAsia="Calibri" w:hAnsi="Calibri"/>
+                <w:color w:val="2D3748"/>
+                <w:sz w:val="19"/>
+                <w:szCs w:val="19"/>
+              </w:rPr>
+              <w:t xml:space="preserve">daily_activity</w:t>
             </w:r>
           </w:p>
         </w:tc>
         <w:tc>
           <w:tcPr>
-            <w:tcW w:type="dxa" w:w="1951"/>
+            <w:tcW w:type="dxa" w:w="1796"/>
             <w:tcBorders>
               <w:top w:val="single" w:color="CBD5E0" w:sz="4"/>
               <w:left w:val="single" w:color="CBD5E0" w:sz="4"/>
@@ -7555,7 +7882,7 @@
                 <w:sz w:val="19"/>
                 <w:szCs w:val="19"/>
               </w:rPr>
-              <w:t xml:space="preserve">Biểu đồ đường cong quên lãng</w:t>
+              <w:t xml:space="preserve">Đổi vật phẩm bằng XP</w:t>
             </w:r>
           </w:p>
         </w:tc>
@@ -7567,7 +7894,7 @@
         </w:trPr>
         <w:tc>
           <w:tcPr>
-            <w:tcW w:type="dxa" w:w="2293"/>
+            <w:tcW w:type="dxa" w:w="2111"/>
             <w:tcBorders>
               <w:top w:val="single" w:color="CBD5E0" w:sz="4"/>
               <w:left w:val="single" w:color="CBD5E0" w:sz="4"/>
@@ -7595,13 +7922,13 @@
                 <w:sz w:val="19"/>
                 <w:szCs w:val="19"/>
               </w:rPr>
-              <w:t xml:space="preserve">Hệ thống Điểm XP Ledger &amp; Streak</w:t>
+              <w:t xml:space="preserve">Trắc nghiệm Quiz tương tác</w:t>
             </w:r>
           </w:p>
         </w:tc>
         <w:tc>
           <w:tcPr>
-            <w:tcW w:type="dxa" w:w="2196"/>
+            <w:tcW w:type="dxa" w:w="2784"/>
             <w:tcBorders>
               <w:top w:val="single" w:color="CBD5E0" w:sz="4"/>
               <w:left w:val="single" w:color="CBD5E0" w:sz="4"/>
@@ -7636,7 +7963,7 @@
                 <w:sz w:val="19"/>
                 <w:szCs w:val="19"/>
               </w:rPr>
-              <w:t xml:space="preserve">xp_ledger</w:t>
+              <w:t xml:space="preserve">quizzes</w:t>
             </w:r>
             <w:r>
               <w:rPr>
@@ -7654,13 +7981,31 @@
                 <w:sz w:val="19"/>
                 <w:szCs w:val="19"/>
               </w:rPr>
-              <w:t xml:space="preserve">user_streaks</w:t>
+              <w:t xml:space="preserve">quiz_questions</w:t>
+            </w:r>
+            <w:r>
+              <w:rPr>
+                <w:rFonts w:ascii="Calibri" w:cs="Calibri" w:eastAsia="Calibri" w:hAnsi="Calibri"/>
+                <w:color w:val="2D3748"/>
+                <w:sz w:val="19"/>
+                <w:szCs w:val="19"/>
+              </w:rPr>
+              <w:t xml:space="preserve"> (options JSONB), </w:t>
+            </w:r>
+            <w:r>
+              <w:rPr>
+                <w:rFonts w:ascii="Calibri" w:cs="Calibri" w:eastAsia="Calibri" w:hAnsi="Calibri"/>
+                <w:color w:val="2D3748"/>
+                <w:sz w:val="19"/>
+                <w:szCs w:val="19"/>
+              </w:rPr>
+              <w:t xml:space="preserve">quiz_attempts</w:t>
             </w:r>
           </w:p>
         </w:tc>
         <w:tc>
           <w:tcPr>
-            <w:tcW w:type="dxa" w:w="2586"/>
+            <w:tcW w:type="dxa" w:w="2335"/>
             <w:tcBorders>
               <w:top w:val="single" w:color="CBD5E0" w:sz="4"/>
               <w:left w:val="single" w:color="CBD5E0" w:sz="4"/>
@@ -7686,22 +8031,31 @@
                 <w:sz w:val="19"/>
                 <w:szCs w:val="19"/>
               </w:rPr>
-              <w:t xml:space="preserve">user_daily_activity</w:t>
-            </w:r>
-            <w:r>
-              <w:rPr>
-                <w:rFonts w:ascii="Calibri" w:cs="Calibri" w:eastAsia="Calibri" w:hAnsi="Calibri"/>
-                <w:color w:val="2D3748"/>
-                <w:sz w:val="19"/>
-                <w:szCs w:val="19"/>
-              </w:rPr>
-              <w:t xml:space="preserve"> chi tiết</w:t>
+              <w:t xml:space="preserve">Kéo thả &amp; Nghe chép chính tả (</w:t>
+            </w:r>
+            <w:r>
+              <w:rPr>
+                <w:rFonts w:ascii="Calibri" w:cs="Calibri" w:eastAsia="Calibri" w:hAnsi="Calibri"/>
+                <w:color w:val="2D3748"/>
+                <w:sz w:val="19"/>
+                <w:szCs w:val="19"/>
+              </w:rPr>
+              <w:t xml:space="preserve">payload</w:t>
+            </w:r>
+            <w:r>
+              <w:rPr>
+                <w:rFonts w:ascii="Calibri" w:cs="Calibri" w:eastAsia="Calibri" w:hAnsi="Calibri"/>
+                <w:color w:val="2D3748"/>
+                <w:sz w:val="19"/>
+                <w:szCs w:val="19"/>
+              </w:rPr>
+              <w:t xml:space="preserve"> JSONB)</w:t>
             </w:r>
           </w:p>
         </w:tc>
         <w:tc>
           <w:tcPr>
-            <w:tcW w:type="dxa" w:w="1951"/>
+            <w:tcW w:type="dxa" w:w="1796"/>
             <w:tcBorders>
               <w:top w:val="single" w:color="CBD5E0" w:sz="4"/>
               <w:left w:val="single" w:color="CBD5E0" w:sz="4"/>
@@ -7727,7 +8081,7 @@
                 <w:sz w:val="19"/>
                 <w:szCs w:val="19"/>
               </w:rPr>
-              <w:t xml:space="preserve">Đổi vật phẩm bằng XP</w:t>
+              <w:t xml:space="preserve">Đề thi mô phỏng TOEIC</w:t>
             </w:r>
           </w:p>
         </w:tc>
@@ -7739,7 +8093,7 @@
         </w:trPr>
         <w:tc>
           <w:tcPr>
-            <w:tcW w:type="dxa" w:w="2293"/>
+            <w:tcW w:type="dxa" w:w="2111"/>
             <w:tcBorders>
               <w:top w:val="single" w:color="CBD5E0" w:sz="4"/>
               <w:left w:val="single" w:color="CBD5E0" w:sz="4"/>
@@ -7767,13 +8121,13 @@
                 <w:sz w:val="19"/>
                 <w:szCs w:val="19"/>
               </w:rPr>
-              <w:t xml:space="preserve">Trắc nghiệm Quiz 4 lựa chọn</w:t>
+              <w:t xml:space="preserve">Mezon Bot (Single-Clan Architecture)</w:t>
             </w:r>
           </w:p>
         </w:tc>
         <w:tc>
           <w:tcPr>
-            <w:tcW w:type="dxa" w:w="2196"/>
+            <w:tcW w:type="dxa" w:w="2784"/>
             <w:tcBorders>
               <w:top w:val="single" w:color="CBD5E0" w:sz="4"/>
               <w:left w:val="single" w:color="CBD5E0" w:sz="4"/>
@@ -7808,7 +8162,7 @@
                 <w:sz w:val="19"/>
                 <w:szCs w:val="19"/>
               </w:rPr>
-              <w:t xml:space="preserve">quizzes</w:t>
+              <w:t xml:space="preserve">bot_configuration</w:t>
             </w:r>
             <w:r>
               <w:rPr>
@@ -7826,31 +8180,22 @@
                 <w:sz w:val="19"/>
                 <w:szCs w:val="19"/>
               </w:rPr>
-              <w:t xml:space="preserve">quiz_questions</w:t>
-            </w:r>
-            <w:r>
-              <w:rPr>
-                <w:rFonts w:ascii="Calibri" w:cs="Calibri" w:eastAsia="Calibri" w:hAnsi="Calibri"/>
-                <w:color w:val="2D3748"/>
-                <w:sz w:val="19"/>
-                <w:szCs w:val="19"/>
-              </w:rPr>
-              <w:t xml:space="preserve">, </w:t>
-            </w:r>
-            <w:r>
-              <w:rPr>
-                <w:rFonts w:ascii="Calibri" w:cs="Calibri" w:eastAsia="Calibri" w:hAnsi="Calibri"/>
-                <w:color w:val="2D3748"/>
-                <w:sz w:val="19"/>
-                <w:szCs w:val="19"/>
-              </w:rPr>
-              <w:t xml:space="preserve">quiz_options</w:t>
+              <w:t xml:space="preserve">clan_quiz_sessions</w:t>
+            </w:r>
+            <w:r>
+              <w:rPr>
+                <w:rFonts w:ascii="Calibri" w:cs="Calibri" w:eastAsia="Calibri" w:hAnsi="Calibri"/>
+                <w:color w:val="2D3748"/>
+                <w:sz w:val="19"/>
+                <w:szCs w:val="19"/>
+              </w:rPr>
+              <w:t xml:space="preserve"> (responses JSONB)</w:t>
             </w:r>
           </w:p>
         </w:tc>
         <w:tc>
           <w:tcPr>
-            <w:tcW w:type="dxa" w:w="2586"/>
+            <w:tcW w:type="dxa" w:w="2335"/>
             <w:tcBorders>
               <w:top w:val="single" w:color="CBD5E0" w:sz="4"/>
               <w:left w:val="single" w:color="CBD5E0" w:sz="4"/>
@@ -7876,13 +8221,31 @@
                 <w:sz w:val="19"/>
                 <w:szCs w:val="19"/>
               </w:rPr>
-              <w:t xml:space="preserve">Kéo thả &amp; Nghe chép chính tả</w:t>
+              <w:t xml:space="preserve">Lập lịch tự động qua </w:t>
+            </w:r>
+            <w:r>
+              <w:rPr>
+                <w:rFonts w:ascii="Calibri" w:cs="Calibri" w:eastAsia="Calibri" w:hAnsi="Calibri"/>
+                <w:color w:val="2D3748"/>
+                <w:sz w:val="19"/>
+                <w:szCs w:val="19"/>
+              </w:rPr>
+              <w:t xml:space="preserve">schedules</w:t>
+            </w:r>
+            <w:r>
+              <w:rPr>
+                <w:rFonts w:ascii="Calibri" w:cs="Calibri" w:eastAsia="Calibri" w:hAnsi="Calibri"/>
+                <w:color w:val="2D3748"/>
+                <w:sz w:val="19"/>
+                <w:szCs w:val="19"/>
+              </w:rPr>
+              <w:t xml:space="preserve"> JSONB</w:t>
             </w:r>
           </w:p>
         </w:tc>
         <w:tc>
           <w:tcPr>
-            <w:tcW w:type="dxa" w:w="1951"/>
+            <w:tcW w:type="dxa" w:w="1796"/>
             <w:tcBorders>
               <w:top w:val="single" w:color="CBD5E0" w:sz="4"/>
               <w:left w:val="single" w:color="CBD5E0" w:sz="4"/>
@@ -7908,7 +8271,7 @@
                 <w:sz w:val="19"/>
                 <w:szCs w:val="19"/>
               </w:rPr>
-              <w:t xml:space="preserve">Đề thi mô phỏng TOEIC</w:t>
+              <w:t xml:space="preserve">Tùy biến thông điệp Bot theo Clan</w:t>
             </w:r>
           </w:p>
         </w:tc>
@@ -7920,7 +8283,7 @@
         </w:trPr>
         <w:tc>
           <w:tcPr>
-            <w:tcW w:type="dxa" w:w="2293"/>
+            <w:tcW w:type="dxa" w:w="2111"/>
             <w:tcBorders>
               <w:top w:val="single" w:color="CBD5E0" w:sz="4"/>
               <w:left w:val="single" w:color="CBD5E0" w:sz="4"/>
@@ -7948,13 +8311,13 @@
                 <w:sz w:val="19"/>
                 <w:szCs w:val="19"/>
               </w:rPr>
-              <w:t xml:space="preserve">Mezon Bot (Single-Clan Architecture)</w:t>
+              <w:t xml:space="preserve">Phân quyền Clan Moderator</w:t>
             </w:r>
           </w:p>
         </w:tc>
         <w:tc>
           <w:tcPr>
-            <w:tcW w:type="dxa" w:w="2196"/>
+            <w:tcW w:type="dxa" w:w="2784"/>
             <w:tcBorders>
               <w:top w:val="single" w:color="CBD5E0" w:sz="4"/>
               <w:left w:val="single" w:color="CBD5E0" w:sz="4"/>
@@ -7989,49 +8352,22 @@
                 <w:sz w:val="19"/>
                 <w:szCs w:val="19"/>
               </w:rPr>
-              <w:t xml:space="preserve">bot_configuration</w:t>
-            </w:r>
-            <w:r>
-              <w:rPr>
-                <w:rFonts w:ascii="Calibri" w:cs="Calibri" w:eastAsia="Calibri" w:hAnsi="Calibri"/>
-                <w:color w:val="2D3748"/>
-                <w:sz w:val="19"/>
-                <w:szCs w:val="19"/>
-              </w:rPr>
-              <w:t xml:space="preserve">, </w:t>
-            </w:r>
-            <w:r>
-              <w:rPr>
-                <w:rFonts w:ascii="Calibri" w:cs="Calibri" w:eastAsia="Calibri" w:hAnsi="Calibri"/>
-                <w:color w:val="2D3748"/>
-                <w:sz w:val="19"/>
-                <w:szCs w:val="19"/>
-              </w:rPr>
-              <w:t xml:space="preserve">/learn</w:t>
-            </w:r>
-            <w:r>
-              <w:rPr>
-                <w:rFonts w:ascii="Calibri" w:cs="Calibri" w:eastAsia="Calibri" w:hAnsi="Calibri"/>
-                <w:color w:val="2D3748"/>
-                <w:sz w:val="19"/>
-                <w:szCs w:val="19"/>
-              </w:rPr>
-              <w:t xml:space="preserve">, </w:t>
-            </w:r>
-            <w:r>
-              <w:rPr>
-                <w:rFonts w:ascii="Calibri" w:cs="Calibri" w:eastAsia="Calibri" w:hAnsi="Calibri"/>
-                <w:color w:val="2D3748"/>
-                <w:sz w:val="19"/>
-                <w:szCs w:val="19"/>
-              </w:rPr>
-              <w:t xml:space="preserve">/quiz</w:t>
+              <w:t xml:space="preserve">clan_moderator_grants</w:t>
+            </w:r>
+            <w:r>
+              <w:rPr>
+                <w:rFonts w:ascii="Calibri" w:cs="Calibri" w:eastAsia="Calibri" w:hAnsi="Calibri"/>
+                <w:color w:val="2D3748"/>
+                <w:sz w:val="19"/>
+                <w:szCs w:val="19"/>
+              </w:rPr>
+              <w:t xml:space="preserve"> (quyền hạn phạm vi 1 Clan)</w:t>
             </w:r>
           </w:p>
         </w:tc>
         <w:tc>
           <w:tcPr>
-            <w:tcW w:type="dxa" w:w="2586"/>
+            <w:tcW w:type="dxa" w:w="2335"/>
             <w:tcBorders>
               <w:top w:val="single" w:color="CBD5E0" w:sz="4"/>
               <w:left w:val="single" w:color="CBD5E0" w:sz="4"/>
@@ -8057,22 +8393,13 @@
                 <w:sz w:val="19"/>
                 <w:szCs w:val="19"/>
               </w:rPr>
-              <w:t xml:space="preserve">Lập lịch tự động </w:t>
-            </w:r>
-            <w:r>
-              <w:rPr>
-                <w:rFonts w:ascii="Calibri" w:cs="Calibri" w:eastAsia="Calibri" w:hAnsi="Calibri"/>
-                <w:color w:val="2D3748"/>
-                <w:sz w:val="19"/>
-                <w:szCs w:val="19"/>
-              </w:rPr>
-              <w:t xml:space="preserve">bot_schedules</w:t>
+              <w:t xml:space="preserve">Tự động gia hạn quyền theo nhiệm kỳ Clan</w:t>
             </w:r>
           </w:p>
         </w:tc>
         <w:tc>
           <w:tcPr>
-            <w:tcW w:type="dxa" w:w="1951"/>
+            <w:tcW w:type="dxa" w:w="1796"/>
             <w:tcBorders>
               <w:top w:val="single" w:color="CBD5E0" w:sz="4"/>
               <w:left w:val="single" w:color="CBD5E0" w:sz="4"/>
@@ -8098,7 +8425,7 @@
                 <w:sz w:val="19"/>
                 <w:szCs w:val="19"/>
               </w:rPr>
-              <w:t xml:space="preserve">Tùy biến thông điệp Bot theo Clan</w:t>
+              <w:t xml:space="preserve">Phân quyền ban quản trị mở rộng</w:t>
             </w:r>
           </w:p>
         </w:tc>
@@ -8110,7 +8437,7 @@
         </w:trPr>
         <w:tc>
           <w:tcPr>
-            <w:tcW w:type="dxa" w:w="2293"/>
+            <w:tcW w:type="dxa" w:w="2111"/>
             <w:tcBorders>
               <w:top w:val="single" w:color="CBD5E0" w:sz="4"/>
               <w:left w:val="single" w:color="CBD5E0" w:sz="4"/>
@@ -8144,7 +8471,7 @@
         </w:tc>
         <w:tc>
           <w:tcPr>
-            <w:tcW w:type="dxa" w:w="2196"/>
+            <w:tcW w:type="dxa" w:w="2784"/>
             <w:tcBorders>
               <w:top w:val="single" w:color="CBD5E0" w:sz="4"/>
               <w:left w:val="single" w:color="CBD5E0" w:sz="4"/>
@@ -8170,13 +8497,13 @@
                 <w:sz w:val="19"/>
                 <w:szCs w:val="19"/>
               </w:rPr>
-              <w:t xml:space="preserve">✅ Next.js 14 nhúng Iframe</w:t>
+              <w:t xml:space="preserve">✅ Next.js 14 nhúng Iframe qua SSO Handshake</w:t>
             </w:r>
           </w:p>
         </w:tc>
         <w:tc>
           <w:tcPr>
-            <w:tcW w:type="dxa" w:w="2586"/>
+            <w:tcW w:type="dxa" w:w="2335"/>
             <w:tcBorders>
               <w:top w:val="single" w:color="CBD5E0" w:sz="4"/>
               <w:left w:val="single" w:color="CBD5E0" w:sz="4"/>
@@ -8208,7 +8535,7 @@
         </w:tc>
         <w:tc>
           <w:tcPr>
-            <w:tcW w:type="dxa" w:w="1951"/>
+            <w:tcW w:type="dxa" w:w="1796"/>
             <w:tcBorders>
               <w:top w:val="single" w:color="CBD5E0" w:sz="4"/>
               <w:left w:val="single" w:color="CBD5E0" w:sz="4"/>
@@ -8246,7 +8573,7 @@
         </w:trPr>
         <w:tc>
           <w:tcPr>
-            <w:tcW w:type="dxa" w:w="2293"/>
+            <w:tcW w:type="dxa" w:w="2111"/>
             <w:tcBorders>
               <w:top w:val="single" w:color="CBD5E0" w:sz="4"/>
               <w:left w:val="single" w:color="CBD5E0" w:sz="4"/>
@@ -8280,7 +8607,7 @@
         </w:tc>
         <w:tc>
           <w:tcPr>
-            <w:tcW w:type="dxa" w:w="2196"/>
+            <w:tcW w:type="dxa" w:w="2784"/>
             <w:tcBorders>
               <w:top w:val="single" w:color="CBD5E0" w:sz="4"/>
               <w:left w:val="single" w:color="CBD5E0" w:sz="4"/>
@@ -8324,13 +8651,13 @@
                 <w:sz w:val="19"/>
                 <w:szCs w:val="19"/>
               </w:rPr>
-              <w:t xml:space="preserve">, 5 vòng đối kháng</w:t>
+              <w:t xml:space="preserve"> (questions, answers, scores JSONB)</w:t>
             </w:r>
           </w:p>
         </w:tc>
         <w:tc>
           <w:tcPr>
-            <w:tcW w:type="dxa" w:w="2586"/>
+            <w:tcW w:type="dxa" w:w="2335"/>
             <w:tcBorders>
               <w:top w:val="single" w:color="CBD5E0" w:sz="4"/>
               <w:left w:val="single" w:color="CBD5E0" w:sz="4"/>
@@ -8356,13 +8683,31 @@
                 <w:sz w:val="19"/>
                 <w:szCs w:val="19"/>
               </w:rPr>
-              <w:t xml:space="preserve">Bảng xếp hạng tuần đóng băng</w:t>
+              <w:t xml:space="preserve">Bảng xếp hạng tuần đóng băng (</w:t>
+            </w:r>
+            <w:r>
+              <w:rPr>
+                <w:rFonts w:ascii="Calibri" w:cs="Calibri" w:eastAsia="Calibri" w:hAnsi="Calibri"/>
+                <w:color w:val="2D3748"/>
+                <w:sz w:val="19"/>
+                <w:szCs w:val="19"/>
+              </w:rPr>
+              <w:t xml:space="preserve">weekly_leaderboards</w:t>
+            </w:r>
+            <w:r>
+              <w:rPr>
+                <w:rFonts w:ascii="Calibri" w:cs="Calibri" w:eastAsia="Calibri" w:hAnsi="Calibri"/>
+                <w:color w:val="2D3748"/>
+                <w:sz w:val="19"/>
+                <w:szCs w:val="19"/>
+              </w:rPr>
+              <w:t xml:space="preserve">)</w:t>
             </w:r>
           </w:p>
         </w:tc>
         <w:tc>
           <w:tcPr>
-            <w:tcW w:type="dxa" w:w="1951"/>
+            <w:tcW w:type="dxa" w:w="1796"/>
             <w:tcBorders>
               <w:top w:val="single" w:color="CBD5E0" w:sz="4"/>
               <w:left w:val="single" w:color="CBD5E0" w:sz="4"/>
@@ -8400,7 +8745,7 @@
         </w:trPr>
         <w:tc>
           <w:tcPr>
-            <w:tcW w:type="dxa" w:w="2293"/>
+            <w:tcW w:type="dxa" w:w="2111"/>
             <w:tcBorders>
               <w:top w:val="single" w:color="CBD5E0" w:sz="4"/>
               <w:left w:val="single" w:color="CBD5E0" w:sz="4"/>
@@ -8434,7 +8779,7 @@
         </w:tc>
         <w:tc>
           <w:tcPr>
-            <w:tcW w:type="dxa" w:w="2196"/>
+            <w:tcW w:type="dxa" w:w="2784"/>
             <w:tcBorders>
               <w:top w:val="single" w:color="CBD5E0" w:sz="4"/>
               <w:left w:val="single" w:color="CBD5E0" w:sz="4"/>
@@ -8460,13 +8805,22 @@
                 <w:sz w:val="19"/>
                 <w:szCs w:val="19"/>
               </w:rPr>
-              <w:t xml:space="preserve">✅ Giao tiếp đơn lượt với Gemini API</w:t>
+              <w:t xml:space="preserve">✅ Giao tiếp đơn lượt &amp; </w:t>
+            </w:r>
+            <w:r>
+              <w:rPr>
+                <w:rFonts w:ascii="Calibri" w:cs="Calibri" w:eastAsia="Calibri" w:hAnsi="Calibri"/>
+                <w:color w:val="2D3748"/>
+                <w:sz w:val="19"/>
+                <w:szCs w:val="19"/>
+              </w:rPr>
+              <w:t xml:space="preserve">ai_scenarios</w:t>
             </w:r>
           </w:p>
         </w:tc>
         <w:tc>
           <w:tcPr>
-            <w:tcW w:type="dxa" w:w="2586"/>
+            <w:tcW w:type="dxa" w:w="2335"/>
             <w:tcBorders>
               <w:top w:val="single" w:color="CBD5E0" w:sz="4"/>
               <w:left w:val="single" w:color="CBD5E0" w:sz="4"/>
@@ -8501,22 +8855,22 @@
                 <w:sz w:val="19"/>
                 <w:szCs w:val="19"/>
               </w:rPr>
-              <w:t xml:space="preserve">ai_scenarios</w:t>
-            </w:r>
-            <w:r>
-              <w:rPr>
-                <w:rFonts w:ascii="Calibri" w:cs="Calibri" w:eastAsia="Calibri" w:hAnsi="Calibri"/>
-                <w:color w:val="2D3748"/>
-                <w:sz w:val="19"/>
-                <w:szCs w:val="19"/>
-              </w:rPr>
-              <w:t xml:space="preserve">, hội thoại nhiều lượt</w:t>
+              <w:t xml:space="preserve">ai_conversations</w:t>
+            </w:r>
+            <w:r>
+              <w:rPr>
+                <w:rFonts w:ascii="Calibri" w:cs="Calibri" w:eastAsia="Calibri" w:hAnsi="Calibri"/>
+                <w:color w:val="2D3748"/>
+                <w:sz w:val="19"/>
+                <w:szCs w:val="19"/>
+              </w:rPr>
+              <w:t xml:space="preserve"> (messages JSONB)</w:t>
             </w:r>
           </w:p>
         </w:tc>
         <w:tc>
           <w:tcPr>
-            <w:tcW w:type="dxa" w:w="1951"/>
+            <w:tcW w:type="dxa" w:w="1796"/>
             <w:tcBorders>
               <w:top w:val="single" w:color="CBD5E0" w:sz="4"/>
               <w:left w:val="single" w:color="CBD5E0" w:sz="4"/>
@@ -8554,7 +8908,7 @@
         </w:trPr>
         <w:tc>
           <w:tcPr>
-            <w:tcW w:type="dxa" w:w="2293"/>
+            <w:tcW w:type="dxa" w:w="2111"/>
             <w:tcBorders>
               <w:top w:val="single" w:color="CBD5E0" w:sz="4"/>
               <w:left w:val="single" w:color="CBD5E0" w:sz="4"/>
@@ -8582,13 +8936,13 @@
                 <w:sz w:val="19"/>
                 <w:szCs w:val="19"/>
               </w:rPr>
-              <w:t xml:space="preserve">Phân tích số liệu giữ chân (Retention)</w:t>
+              <w:t xml:space="preserve">Nhật ký Kiểm toán &amp; Bảo mật</w:t>
             </w:r>
           </w:p>
         </w:tc>
         <w:tc>
           <w:tcPr>
-            <w:tcW w:type="dxa" w:w="2196"/>
+            <w:tcW w:type="dxa" w:w="2784"/>
             <w:tcBorders>
               <w:top w:val="single" w:color="CBD5E0" w:sz="4"/>
               <w:left w:val="single" w:color="CBD5E0" w:sz="4"/>
@@ -8614,13 +8968,31 @@
                 <w:sz w:val="19"/>
                 <w:szCs w:val="19"/>
               </w:rPr>
-              <w:t xml:space="preserve">❌ Chưa kích hoạt</w:t>
+              <w:t xml:space="preserve">✅ </w:t>
+            </w:r>
+            <w:r>
+              <w:rPr>
+                <w:rFonts w:ascii="Calibri" w:cs="Calibri" w:eastAsia="Calibri" w:hAnsi="Calibri"/>
+                <w:color w:val="2D3748"/>
+                <w:sz w:val="19"/>
+                <w:szCs w:val="19"/>
+              </w:rPr>
+              <w:t xml:space="preserve">audit_logs</w:t>
+            </w:r>
+            <w:r>
+              <w:rPr>
+                <w:rFonts w:ascii="Calibri" w:cs="Calibri" w:eastAsia="Calibri" w:hAnsi="Calibri"/>
+                <w:color w:val="2D3748"/>
+                <w:sz w:val="19"/>
+                <w:szCs w:val="19"/>
+              </w:rPr>
+              <w:t xml:space="preserve"> (append-only, ADM-09/12)</w:t>
             </w:r>
           </w:p>
         </w:tc>
         <w:tc>
           <w:tcPr>
-            <w:tcW w:type="dxa" w:w="2586"/>
+            <w:tcW w:type="dxa" w:w="2335"/>
             <w:tcBorders>
               <w:top w:val="single" w:color="CBD5E0" w:sz="4"/>
               <w:left w:val="single" w:color="CBD5E0" w:sz="4"/>
@@ -8646,40 +9018,13 @@
                 <w:sz w:val="19"/>
                 <w:szCs w:val="19"/>
               </w:rPr>
-              <w:t xml:space="preserve">✅ </w:t>
-            </w:r>
-            <w:r>
-              <w:rPr>
-                <w:rFonts w:ascii="Calibri" w:cs="Calibri" w:eastAsia="Calibri" w:hAnsi="Calibri"/>
-                <w:color w:val="2D3748"/>
-                <w:sz w:val="19"/>
-                <w:szCs w:val="19"/>
-              </w:rPr>
-              <w:t xml:space="preserve">configured_clan_daily_analytics</w:t>
-            </w:r>
-            <w:r>
-              <w:rPr>
-                <w:rFonts w:ascii="Calibri" w:cs="Calibri" w:eastAsia="Calibri" w:hAnsi="Calibri"/>
-                <w:color w:val="2D3748"/>
-                <w:sz w:val="19"/>
-                <w:szCs w:val="19"/>
-              </w:rPr>
-              <w:t xml:space="preserve">, </w:t>
-            </w:r>
-            <w:r>
-              <w:rPr>
-                <w:rFonts w:ascii="Calibri" w:cs="Calibri" w:eastAsia="Calibri" w:hAnsi="Calibri"/>
-                <w:color w:val="2D3748"/>
-                <w:sz w:val="19"/>
-                <w:szCs w:val="19"/>
-              </w:rPr>
-              <w:t xml:space="preserve">cohorts</w:t>
+              <w:t xml:space="preserve">Dashboard tra cứu kiểm toán cho Admin</w:t>
             </w:r>
           </w:p>
         </w:tc>
         <w:tc>
           <w:tcPr>
-            <w:tcW w:type="dxa" w:w="1951"/>
+            <w:tcW w:type="dxa" w:w="1796"/>
             <w:tcBorders>
               <w:top w:val="single" w:color="CBD5E0" w:sz="4"/>
               <w:left w:val="single" w:color="CBD5E0" w:sz="4"/>
@@ -8687,6 +9032,169 @@
               <w:right w:val="single" w:color="CBD5E0" w:sz="4"/>
             </w:tcBorders>
             <w:shd w:fill="FFFFFF" w:val="clear"/>
+            <w:tcMar>
+              <w:top w:type="dxa" w:w="100"/>
+              <w:left w:type="dxa" w:w="140"/>
+              <w:bottom w:type="dxa" w:w="100"/>
+              <w:right w:type="dxa" w:w="140"/>
+            </w:tcMar>
+          </w:tcPr>
+          <w:p>
+            <w:pPr>
+              <w:spacing w:after="20" w:before="20" w:line="240"/>
+            </w:pPr>
+            <w:r>
+              <w:rPr>
+                <w:rFonts w:ascii="Calibri" w:cs="Calibri" w:eastAsia="Calibri" w:hAnsi="Calibri"/>
+                <w:color w:val="2D3748"/>
+                <w:sz w:val="19"/>
+                <w:szCs w:val="19"/>
+              </w:rPr>
+              <w:t xml:space="preserve">Cảnh báo gian lận tự động</w:t>
+            </w:r>
+          </w:p>
+        </w:tc>
+      </w:tr>
+      <w:tr>
+        <w:trPr>
+          <w:cantSplit/>
+          <w:tblHeader w:val="false"/>
+        </w:trPr>
+        <w:tc>
+          <w:tcPr>
+            <w:tcW w:type="dxa" w:w="2111"/>
+            <w:tcBorders>
+              <w:top w:val="single" w:color="CBD5E0" w:sz="4"/>
+              <w:left w:val="single" w:color="CBD5E0" w:sz="4"/>
+              <w:bottom w:val="single" w:color="CBD5E0" w:sz="4"/>
+              <w:right w:val="single" w:color="CBD5E0" w:sz="4"/>
+            </w:tcBorders>
+            <w:shd w:fill="F8FAFC" w:val="clear"/>
+            <w:tcMar>
+              <w:top w:type="dxa" w:w="100"/>
+              <w:left w:type="dxa" w:w="140"/>
+              <w:bottom w:type="dxa" w:w="100"/>
+              <w:right w:type="dxa" w:w="140"/>
+            </w:tcMar>
+          </w:tcPr>
+          <w:p>
+            <w:pPr>
+              <w:spacing w:after="20" w:before="20" w:line="240"/>
+            </w:pPr>
+            <w:r>
+              <w:rPr>
+                <w:rFonts w:ascii="Calibri" w:cs="Calibri" w:eastAsia="Calibri" w:hAnsi="Calibri"/>
+                <w:b/>
+                <w:bCs/>
+                <w:color w:val="2D3748"/>
+                <w:sz w:val="19"/>
+                <w:szCs w:val="19"/>
+              </w:rPr>
+              <w:t xml:space="preserve">Phân tích số liệu giữ chân (Retention)</w:t>
+            </w:r>
+          </w:p>
+        </w:tc>
+        <w:tc>
+          <w:tcPr>
+            <w:tcW w:type="dxa" w:w="2784"/>
+            <w:tcBorders>
+              <w:top w:val="single" w:color="CBD5E0" w:sz="4"/>
+              <w:left w:val="single" w:color="CBD5E0" w:sz="4"/>
+              <w:bottom w:val="single" w:color="CBD5E0" w:sz="4"/>
+              <w:right w:val="single" w:color="CBD5E0" w:sz="4"/>
+            </w:tcBorders>
+            <w:shd w:fill="F8FAFC" w:val="clear"/>
+            <w:tcMar>
+              <w:top w:type="dxa" w:w="100"/>
+              <w:left w:type="dxa" w:w="140"/>
+              <w:bottom w:type="dxa" w:w="100"/>
+              <w:right w:type="dxa" w:w="140"/>
+            </w:tcMar>
+          </w:tcPr>
+          <w:p>
+            <w:pPr>
+              <w:spacing w:after="20" w:before="20" w:line="240"/>
+            </w:pPr>
+            <w:r>
+              <w:rPr>
+                <w:rFonts w:ascii="Calibri" w:cs="Calibri" w:eastAsia="Calibri" w:hAnsi="Calibri"/>
+                <w:color w:val="2D3748"/>
+                <w:sz w:val="19"/>
+                <w:szCs w:val="19"/>
+              </w:rPr>
+              <w:t xml:space="preserve">쿼리 trực tiếp từ </w:t>
+            </w:r>
+            <w:r>
+              <w:rPr>
+                <w:rFonts w:ascii="Calibri" w:cs="Calibri" w:eastAsia="Calibri" w:hAnsi="Calibri"/>
+                <w:color w:val="2D3748"/>
+                <w:sz w:val="19"/>
+                <w:szCs w:val="19"/>
+              </w:rPr>
+              <w:t xml:space="preserve">xp_ledger</w:t>
+            </w:r>
+            <w:r>
+              <w:rPr>
+                <w:rFonts w:ascii="Calibri" w:cs="Calibri" w:eastAsia="Calibri" w:hAnsi="Calibri"/>
+                <w:color w:val="2D3748"/>
+                <w:sz w:val="19"/>
+                <w:szCs w:val="19"/>
+              </w:rPr>
+              <w:t xml:space="preserve"> &amp; </w:t>
+            </w:r>
+            <w:r>
+              <w:rPr>
+                <w:rFonts w:ascii="Calibri" w:cs="Calibri" w:eastAsia="Calibri" w:hAnsi="Calibri"/>
+                <w:color w:val="2D3748"/>
+                <w:sz w:val="19"/>
+                <w:szCs w:val="19"/>
+              </w:rPr>
+              <w:t xml:space="preserve">lesson_progress</w:t>
+            </w:r>
+          </w:p>
+        </w:tc>
+        <w:tc>
+          <w:tcPr>
+            <w:tcW w:type="dxa" w:w="2335"/>
+            <w:tcBorders>
+              <w:top w:val="single" w:color="CBD5E0" w:sz="4"/>
+              <w:left w:val="single" w:color="CBD5E0" w:sz="4"/>
+              <w:bottom w:val="single" w:color="CBD5E0" w:sz="4"/>
+              <w:right w:val="single" w:color="CBD5E0" w:sz="4"/>
+            </w:tcBorders>
+            <w:shd w:fill="F8FAFC" w:val="clear"/>
+            <w:tcMar>
+              <w:top w:type="dxa" w:w="100"/>
+              <w:left w:type="dxa" w:w="140"/>
+              <w:bottom w:type="dxa" w:w="100"/>
+              <w:right w:type="dxa" w:w="140"/>
+            </w:tcMar>
+          </w:tcPr>
+          <w:p>
+            <w:pPr>
+              <w:spacing w:after="20" w:before="20" w:line="240"/>
+            </w:pPr>
+            <w:r>
+              <w:rPr>
+                <w:rFonts w:ascii="Calibri" w:cs="Calibri" w:eastAsia="Calibri" w:hAnsi="Calibri"/>
+                <w:color w:val="2D3748"/>
+                <w:sz w:val="19"/>
+                <w:szCs w:val="19"/>
+              </w:rPr>
+              <w:t xml:space="preserve">Thống kê Cohort giữ chân tự động</w:t>
+            </w:r>
+          </w:p>
+        </w:tc>
+        <w:tc>
+          <w:tcPr>
+            <w:tcW w:type="dxa" w:w="1796"/>
+            <w:tcBorders>
+              <w:top w:val="single" w:color="CBD5E0" w:sz="4"/>
+              <w:left w:val="single" w:color="CBD5E0" w:sz="4"/>
+              <w:bottom w:val="single" w:color="CBD5E0" w:sz="4"/>
+              <w:right w:val="single" w:color="CBD5E0" w:sz="4"/>
+            </w:tcBorders>
+            <w:shd w:fill="F8FAFC" w:val="clear"/>
             <w:tcMar>
               <w:top w:type="dxa" w:w="100"/>
               <w:left w:type="dxa" w:w="140"/>

</xml_diff>

<commit_message>
fix(schema): remove redundant placement from quizzes.quiz_type constraint
</commit_message>
<xml_diff>
--- a/docs/product/PRODUCT_REQUIREMENTS_DOCUMENT_LINGUAL.docx
+++ b/docs/product/PRODUCT_REQUIREMENTS_DOCUMENT_LINGUAL.docx
@@ -3369,7 +3369,25 @@
           <w:sz w:val="21"/>
           <w:szCs w:val="21"/>
         </w:rPr>
-        <w:t xml:space="preserve">: practice, placement, lesson, clan).</w:t>
+        <w:t xml:space="preserve">: practice, lesson, clan; riêng bài test đầu vào Onboarding được quản lý tập trung ở bảng </w:t>
+      </w:r>
+      <w:r>
+        <w:rPr>
+          <w:rFonts w:ascii="Calibri" w:cs="Calibri" w:eastAsia="Calibri" w:hAnsi="Calibri"/>
+          <w:color w:val="2D3748"/>
+          <w:sz w:val="21"/>
+          <w:szCs w:val="21"/>
+        </w:rPr>
+        <w:t xml:space="preserve">placement_tests</w:t>
+      </w:r>
+      <w:r>
+        <w:rPr>
+          <w:rFonts w:ascii="Calibri" w:cs="Calibri" w:eastAsia="Calibri" w:hAnsi="Calibri"/>
+          <w:color w:val="2D3748"/>
+          <w:sz w:val="21"/>
+          <w:szCs w:val="21"/>
+        </w:rPr>
+        <w:t xml:space="preserve">).</w:t>
       </w:r>
     </w:p>
     <w:p>

</xml_diff>

<commit_message>
fix(docs): sync milestone pack with duel_matches schema, fix broken links, mark roadmap historical, add EF Core concurrency warning
</commit_message>
<xml_diff>
--- a/docs/product/PRODUCT_REQUIREMENTS_DOCUMENT_LINGUAL.docx
+++ b/docs/product/PRODUCT_REQUIREMENTS_DOCUMENT_LINGUAL.docx
@@ -1607,46 +1607,157 @@
         <w:t xml:space="preserve">2.2 Ba trụ cột giá trị cốt lõi (Core Value Pillars)</w:t>
       </w:r>
     </w:p>
-    <w:p>
-      <w:pPr>
-        <w:spacing w:before="240" w:after="240"/>
-        <w:jc w:val="center"/>
-      </w:pPr>
-      <w:r>
-        <w:drawing>
-          <wp:inline xmlns:a="http://schemas.openxmlformats.org/drawingml/2006/main" xmlns:pic="http://schemas.openxmlformats.org/drawingml/2006/picture">
-            <wp:extent cx="5303520" cy="2213746"/>
-            <wp:docPr id="1" name="Picture 1"/>
-            <wp:cNvGraphicFramePr>
-              <a:graphicFrameLocks noChangeAspect="1"/>
-            </wp:cNvGraphicFramePr>
-            <a:graphic>
-              <a:graphicData uri="http://schemas.openxmlformats.org/drawingml/2006/picture">
-                <pic:pic>
-                  <pic:nvPicPr>
-                    <pic:cNvPr id="0" name="diagram_pillars.png"/>
-                    <pic:cNvPicPr/>
-                  </pic:nvPicPr>
-                  <pic:blipFill>
-                    <a:blip r:embed="rId10"/>
-                    <a:stretch>
-                      <a:fillRect/>
-                    </a:stretch>
-                  </pic:blipFill>
-                  <pic:spPr>
-                    <a:xfrm>
-                      <a:off x="0" y="0"/>
-                      <a:ext cx="5303520" cy="2213746"/>
-                    </a:xfrm>
-                    <a:prstGeom prst="rect"/>
-                  </pic:spPr>
-                </pic:pic>
-              </a:graphicData>
-            </a:graphic>
-          </wp:inline>
-        </w:drawing>
-      </w:r>
-    </w:p>
+    <w:tbl>
+      <w:tblPr>
+        <w:tblW w:type="dxa" w:w="9026"/>
+        <w:tblBorders>
+          <w:top w:val="single" w:color="auto" w:sz="4"/>
+          <w:left w:val="single" w:color="auto" w:sz="4"/>
+          <w:bottom w:val="single" w:color="auto" w:sz="4"/>
+          <w:right w:val="single" w:color="auto" w:sz="4"/>
+          <w:insideH w:val="single" w:color="auto" w:sz="4"/>
+          <w:insideV w:val="single" w:color="auto" w:sz="4"/>
+        </w:tblBorders>
+      </w:tblPr>
+      <w:tblGrid>
+        <w:gridCol w:w="9026"/>
+      </w:tblGrid>
+      <w:tr>
+        <w:trPr>
+          <w:cantSplit/>
+        </w:trPr>
+        <w:tc>
+          <w:tcPr>
+            <w:tcW w:type="dxa" w:w="9026"/>
+            <w:tcBorders>
+              <w:top w:val="single" w:color="CBD5E0" w:sz="6"/>
+              <w:left w:val="single" w:color="CBD5E0" w:sz="6"/>
+              <w:bottom w:val="single" w:color="CBD5E0" w:sz="6"/>
+              <w:right w:val="single" w:color="CBD5E0" w:sz="6"/>
+            </w:tcBorders>
+            <w:shd w:fill="F8FAFC" w:val="clear"/>
+            <w:tcMar>
+              <w:top w:type="dxa" w:w="120"/>
+              <w:left w:type="dxa" w:w="160"/>
+              <w:bottom w:type="dxa" w:w="120"/>
+              <w:right w:type="dxa" w:w="160"/>
+            </w:tcMar>
+          </w:tcPr>
+          <w:p>
+            <w:pPr>
+              <w:spacing w:after="0" w:before="0" w:line="220"/>
+            </w:pPr>
+            <w:r>
+              <w:rPr>
+                <w:rFonts w:ascii="Consolas" w:cs="Consolas" w:eastAsia="Consolas" w:hAnsi="Consolas"/>
+                <w:color w:val="1A202C"/>
+                <w:sz w:val="17"/>
+                <w:szCs w:val="17"/>
+              </w:rPr>
+              <w:t xml:space="preserve">graph TD</w:t>
+            </w:r>
+          </w:p>
+          <w:p>
+            <w:pPr>
+              <w:spacing w:after="0" w:before="0" w:line="220"/>
+            </w:pPr>
+            <w:r>
+              <w:rPr>
+                <w:rFonts w:ascii="Consolas" w:cs="Consolas" w:eastAsia="Consolas" w:hAnsi="Consolas"/>
+                <w:color w:val="1A202C"/>
+                <w:sz w:val="17"/>
+                <w:szCs w:val="17"/>
+              </w:rPr>
+              <w:t xml:space="preserve">    A["🌟 LINGUAL MEZON"] --&gt; B["1. KHOA HỌC TRÍ NHỚ (Spaced Repetition)"]</w:t>
+            </w:r>
+          </w:p>
+          <w:p>
+            <w:pPr>
+              <w:spacing w:after="0" w:before="0" w:line="220"/>
+            </w:pPr>
+            <w:r>
+              <w:rPr>
+                <w:rFonts w:ascii="Consolas" w:cs="Consolas" w:eastAsia="Consolas" w:hAnsi="Consolas"/>
+                <w:color w:val="1A202C"/>
+                <w:sz w:val="17"/>
+                <w:szCs w:val="17"/>
+              </w:rPr>
+              <w:t xml:space="preserve">    A --&gt; C["2. GẮN KẾT CỘNG ĐỒNG (Clan Social &amp; Gamification)"]</w:t>
+            </w:r>
+          </w:p>
+          <w:p>
+            <w:pPr>
+              <w:spacing w:after="0" w:before="0" w:line="220"/>
+            </w:pPr>
+            <w:r>
+              <w:rPr>
+                <w:rFonts w:ascii="Consolas" w:cs="Consolas" w:eastAsia="Consolas" w:hAnsi="Consolas"/>
+                <w:color w:val="1A202C"/>
+                <w:sz w:val="17"/>
+                <w:szCs w:val="17"/>
+              </w:rPr>
+              <w:t xml:space="preserve">    A --&gt; D["3. ĐỒNG HÀNH THÔNG MINH (AI Companion LingLing)"]</w:t>
+            </w:r>
+          </w:p>
+          <w:p>
+            <w:pPr>
+              <w:spacing w:after="0" w:before="0" w:line="220"/>
+            </w:pPr>
+            <w:r>
+              <w:rPr>
+                <w:rFonts w:ascii="Consolas" w:cs="Consolas" w:eastAsia="Consolas" w:hAnsi="Consolas"/>
+                <w:color w:val="1A202C"/>
+                <w:sz w:val="17"/>
+                <w:szCs w:val="17"/>
+              </w:rPr>
+              <w:t xml:space="preserve">    </w:t>
+            </w:r>
+          </w:p>
+          <w:p>
+            <w:pPr>
+              <w:spacing w:after="0" w:before="0" w:line="220"/>
+            </w:pPr>
+            <w:r>
+              <w:rPr>
+                <w:rFonts w:ascii="Consolas" w:cs="Consolas" w:eastAsia="Consolas" w:hAnsi="Consolas"/>
+                <w:color w:val="1A202C"/>
+                <w:sz w:val="17"/>
+                <w:szCs w:val="17"/>
+              </w:rPr>
+              <w:t xml:space="preserve">    B --&gt; B1["Thuật toán nhắc ôn đúng điểm rơi trí nhớ (10p/ngày)"]</w:t>
+            </w:r>
+          </w:p>
+          <w:p>
+            <w:pPr>
+              <w:spacing w:after="0" w:before="0" w:line="220"/>
+            </w:pPr>
+            <w:r>
+              <w:rPr>
+                <w:rFonts w:ascii="Consolas" w:cs="Consolas" w:eastAsia="Consolas" w:hAnsi="Consolas"/>
+                <w:color w:val="1A202C"/>
+                <w:sz w:val="17"/>
+                <w:szCs w:val="17"/>
+              </w:rPr>
+              <w:t xml:space="preserve">    C --&gt; C1["Đố vui Bot trong kênh, Đấu trường Clan War, BXH đồng đội"]</w:t>
+            </w:r>
+          </w:p>
+          <w:p>
+            <w:pPr>
+              <w:spacing w:after="0" w:before="0" w:line="220"/>
+            </w:pPr>
+            <w:r>
+              <w:rPr>
+                <w:rFonts w:ascii="Consolas" w:cs="Consolas" w:eastAsia="Consolas" w:hAnsi="Consolas"/>
+                <w:color w:val="1A202C"/>
+                <w:sz w:val="17"/>
+                <w:szCs w:val="17"/>
+              </w:rPr>
+              <w:t xml:space="preserve">    D --&gt; D1["Sửa ngữ pháp tức thì, Chat đóng vai tình huống 24/7"]</w:t>
+            </w:r>
+          </w:p>
+        </w:tc>
+      </w:tr>
+    </w:tbl>
     <w:p>
       <w:pPr>
         <w:spacing w:after="140" w:before="0"/>
@@ -2055,46 +2166,395 @@
         <w:t xml:space="preserve">4. HÀNH TRÌNH NGƯỜI DÙNG &amp; KỊCH BẢN TƯƠNG TÁC TRÊN MEZON</w:t>
       </w:r>
     </w:p>
-    <w:p>
-      <w:pPr>
-        <w:spacing w:before="240" w:after="240"/>
-        <w:jc w:val="center"/>
-      </w:pPr>
-      <w:r>
-        <w:drawing>
-          <wp:inline xmlns:a="http://schemas.openxmlformats.org/drawingml/2006/main" xmlns:pic="http://schemas.openxmlformats.org/drawingml/2006/picture">
-            <wp:extent cx="5669280" cy="3598615"/>
-            <wp:docPr id="2" name="Picture 2"/>
-            <wp:cNvGraphicFramePr>
-              <a:graphicFrameLocks noChangeAspect="1"/>
-            </wp:cNvGraphicFramePr>
-            <a:graphic>
-              <a:graphicData uri="http://schemas.openxmlformats.org/drawingml/2006/picture">
-                <pic:pic>
-                  <pic:nvPicPr>
-                    <pic:cNvPr id="0" name="diagram_sequence.png"/>
-                    <pic:cNvPicPr/>
-                  </pic:nvPicPr>
-                  <pic:blipFill>
-                    <a:blip r:embed="rId11"/>
-                    <a:stretch>
-                      <a:fillRect/>
-                    </a:stretch>
-                  </pic:blipFill>
-                  <pic:spPr>
-                    <a:xfrm>
-                      <a:off x="0" y="0"/>
-                      <a:ext cx="5669280" cy="3598615"/>
-                    </a:xfrm>
-                    <a:prstGeom prst="rect"/>
-                  </pic:spPr>
-                </pic:pic>
-              </a:graphicData>
-            </a:graphic>
-          </wp:inline>
-        </w:drawing>
-      </w:r>
-    </w:p>
+    <w:tbl>
+      <w:tblPr>
+        <w:tblW w:type="dxa" w:w="9026"/>
+        <w:tblBorders>
+          <w:top w:val="single" w:color="auto" w:sz="4"/>
+          <w:left w:val="single" w:color="auto" w:sz="4"/>
+          <w:bottom w:val="single" w:color="auto" w:sz="4"/>
+          <w:right w:val="single" w:color="auto" w:sz="4"/>
+          <w:insideH w:val="single" w:color="auto" w:sz="4"/>
+          <w:insideV w:val="single" w:color="auto" w:sz="4"/>
+        </w:tblBorders>
+      </w:tblPr>
+      <w:tblGrid>
+        <w:gridCol w:w="9026"/>
+      </w:tblGrid>
+      <w:tr>
+        <w:trPr>
+          <w:cantSplit/>
+        </w:trPr>
+        <w:tc>
+          <w:tcPr>
+            <w:tcW w:type="dxa" w:w="9026"/>
+            <w:tcBorders>
+              <w:top w:val="single" w:color="CBD5E0" w:sz="6"/>
+              <w:left w:val="single" w:color="CBD5E0" w:sz="6"/>
+              <w:bottom w:val="single" w:color="CBD5E0" w:sz="6"/>
+              <w:right w:val="single" w:color="CBD5E0" w:sz="6"/>
+            </w:tcBorders>
+            <w:shd w:fill="F8FAFC" w:val="clear"/>
+            <w:tcMar>
+              <w:top w:type="dxa" w:w="120"/>
+              <w:left w:type="dxa" w:w="160"/>
+              <w:bottom w:type="dxa" w:w="120"/>
+              <w:right w:type="dxa" w:w="160"/>
+            </w:tcMar>
+          </w:tcPr>
+          <w:p>
+            <w:pPr>
+              <w:spacing w:after="0" w:before="0" w:line="220"/>
+            </w:pPr>
+            <w:r>
+              <w:rPr>
+                <w:rFonts w:ascii="Consolas" w:cs="Consolas" w:eastAsia="Consolas" w:hAnsi="Consolas"/>
+                <w:color w:val="1A202C"/>
+                <w:sz w:val="17"/>
+                <w:szCs w:val="17"/>
+              </w:rPr>
+              <w:t xml:space="preserve">sequenceDiagram</w:t>
+            </w:r>
+          </w:p>
+          <w:p>
+            <w:pPr>
+              <w:spacing w:after="0" w:before="0" w:line="220"/>
+            </w:pPr>
+            <w:r>
+              <w:rPr>
+                <w:rFonts w:ascii="Consolas" w:cs="Consolas" w:eastAsia="Consolas" w:hAnsi="Consolas"/>
+                <w:color w:val="1A202C"/>
+                <w:sz w:val="17"/>
+                <w:szCs w:val="17"/>
+              </w:rPr>
+              <w:t xml:space="preserve">    autonumber</w:t>
+            </w:r>
+          </w:p>
+          <w:p>
+            <w:pPr>
+              <w:spacing w:after="0" w:before="0" w:line="220"/>
+            </w:pPr>
+            <w:r>
+              <w:rPr>
+                <w:rFonts w:ascii="Consolas" w:cs="Consolas" w:eastAsia="Consolas" w:hAnsi="Consolas"/>
+                <w:color w:val="1A202C"/>
+                <w:sz w:val="17"/>
+                <w:szCs w:val="17"/>
+              </w:rPr>
+              <w:t xml:space="preserve">    actor User as Người học (Minh)</w:t>
+            </w:r>
+          </w:p>
+          <w:p>
+            <w:pPr>
+              <w:spacing w:after="0" w:before="0" w:line="220"/>
+            </w:pPr>
+            <w:r>
+              <w:rPr>
+                <w:rFonts w:ascii="Consolas" w:cs="Consolas" w:eastAsia="Consolas" w:hAnsi="Consolas"/>
+                <w:color w:val="1A202C"/>
+                <w:sz w:val="17"/>
+                <w:szCs w:val="17"/>
+              </w:rPr>
+              <w:t xml:space="preserve">    participant Channel as Kênh Chat Clan Mezon</w:t>
+            </w:r>
+          </w:p>
+          <w:p>
+            <w:pPr>
+              <w:spacing w:after="0" w:before="0" w:line="220"/>
+            </w:pPr>
+            <w:r>
+              <w:rPr>
+                <w:rFonts w:ascii="Consolas" w:cs="Consolas" w:eastAsia="Consolas" w:hAnsi="Consolas"/>
+                <w:color w:val="1A202C"/>
+                <w:sz w:val="17"/>
+                <w:szCs w:val="17"/>
+              </w:rPr>
+              <w:t xml:space="preserve">    participant Bot as Lingual Bot</w:t>
+            </w:r>
+          </w:p>
+          <w:p>
+            <w:pPr>
+              <w:spacing w:after="0" w:before="0" w:line="220"/>
+            </w:pPr>
+            <w:r>
+              <w:rPr>
+                <w:rFonts w:ascii="Consolas" w:cs="Consolas" w:eastAsia="Consolas" w:hAnsi="Consolas"/>
+                <w:color w:val="1A202C"/>
+                <w:sz w:val="17"/>
+                <w:szCs w:val="17"/>
+              </w:rPr>
+              <w:t xml:space="preserve">    participant MiniApp as Channel Mini-App (Nhúng)</w:t>
+            </w:r>
+          </w:p>
+          <w:p>
+            <w:pPr>
+              <w:spacing w:after="0" w:before="0" w:line="220"/>
+            </w:pPr>
+            <w:r>
+              <w:rPr>
+                <w:rFonts w:ascii="Consolas" w:cs="Consolas" w:eastAsia="Consolas" w:hAnsi="Consolas"/>
+                <w:color w:val="1A202C"/>
+                <w:sz w:val="17"/>
+                <w:szCs w:val="17"/>
+              </w:rPr>
+              <w:t xml:space="preserve">    participant AI as Trợ Lý AI LingLing</w:t>
+            </w:r>
+          </w:p>
+          <w:p>
+            <w:pPr>
+              <w:spacing w:after="0" w:before="0" w:line="220"/>
+            </w:pPr>
+            <w:r>
+              <w:rPr>
+                <w:rFonts w:ascii="Consolas" w:cs="Consolas" w:eastAsia="Consolas" w:hAnsi="Consolas"/>
+                <w:color w:val="1A202C"/>
+                <w:sz w:val="17"/>
+                <w:szCs w:val="17"/>
+              </w:rPr>
+              <w:t xml:space="preserve"> </w:t>
+            </w:r>
+          </w:p>
+          <w:p>
+            <w:pPr>
+              <w:spacing w:after="0" w:before="0" w:line="220"/>
+            </w:pPr>
+            <w:r>
+              <w:rPr>
+                <w:rFonts w:ascii="Consolas" w:cs="Consolas" w:eastAsia="Consolas" w:hAnsi="Consolas"/>
+                <w:color w:val="1A202C"/>
+                <w:sz w:val="17"/>
+                <w:szCs w:val="17"/>
+              </w:rPr>
+              <w:t xml:space="preserve">    Note over User,Bot: Kịch bản 1: Tương tác qua Kênh Chat</w:t>
+            </w:r>
+          </w:p>
+          <w:p>
+            <w:pPr>
+              <w:spacing w:after="0" w:before="0" w:line="220"/>
+            </w:pPr>
+            <w:r>
+              <w:rPr>
+                <w:rFonts w:ascii="Consolas" w:cs="Consolas" w:eastAsia="Consolas" w:hAnsi="Consolas"/>
+                <w:color w:val="1A202C"/>
+                <w:sz w:val="17"/>
+                <w:szCs w:val="17"/>
+              </w:rPr>
+              <w:t xml:space="preserve">    User-&gt;&gt;Channel: Gõ lệnh /learn</w:t>
+            </w:r>
+          </w:p>
+          <w:p>
+            <w:pPr>
+              <w:spacing w:after="0" w:before="0" w:line="220"/>
+            </w:pPr>
+            <w:r>
+              <w:rPr>
+                <w:rFonts w:ascii="Consolas" w:cs="Consolas" w:eastAsia="Consolas" w:hAnsi="Consolas"/>
+                <w:color w:val="1A202C"/>
+                <w:sz w:val="17"/>
+                <w:szCs w:val="17"/>
+              </w:rPr>
+              <w:t xml:space="preserve">    Bot--&gt;&gt;Channel: Trả về Flashcard 3 từ mới hôm nay kèm nút bấm "Nghe phát âm" &amp; "Tôi đã thuộc"</w:t>
+            </w:r>
+          </w:p>
+          <w:p>
+            <w:pPr>
+              <w:spacing w:after="0" w:before="0" w:line="220"/>
+            </w:pPr>
+            <w:r>
+              <w:rPr>
+                <w:rFonts w:ascii="Consolas" w:cs="Consolas" w:eastAsia="Consolas" w:hAnsi="Consolas"/>
+                <w:color w:val="1A202C"/>
+                <w:sz w:val="17"/>
+                <w:szCs w:val="17"/>
+              </w:rPr>
+              <w:t xml:space="preserve">    User-&gt;&gt;Bot: Bấm "Tôi đã thuộc"</w:t>
+            </w:r>
+          </w:p>
+          <w:p>
+            <w:pPr>
+              <w:spacing w:after="0" w:before="0" w:line="220"/>
+            </w:pPr>
+            <w:r>
+              <w:rPr>
+                <w:rFonts w:ascii="Consolas" w:cs="Consolas" w:eastAsia="Consolas" w:hAnsi="Consolas"/>
+                <w:color w:val="1A202C"/>
+                <w:sz w:val="17"/>
+                <w:szCs w:val="17"/>
+              </w:rPr>
+              <w:t xml:space="preserve">    Bot--&gt;&gt;Channel: Cập nhật +15 XP &amp; thông báo Chuỗi 3 ngày liên tiếp!</w:t>
+            </w:r>
+          </w:p>
+          <w:p>
+            <w:pPr>
+              <w:spacing w:after="0" w:before="0" w:line="220"/>
+            </w:pPr>
+            <w:r>
+              <w:rPr>
+                <w:rFonts w:ascii="Consolas" w:cs="Consolas" w:eastAsia="Consolas" w:hAnsi="Consolas"/>
+                <w:color w:val="1A202C"/>
+                <w:sz w:val="17"/>
+                <w:szCs w:val="17"/>
+              </w:rPr>
+              <w:t xml:space="preserve"> </w:t>
+            </w:r>
+          </w:p>
+          <w:p>
+            <w:pPr>
+              <w:spacing w:after="0" w:before="0" w:line="220"/>
+            </w:pPr>
+            <w:r>
+              <w:rPr>
+                <w:rFonts w:ascii="Consolas" w:cs="Consolas" w:eastAsia="Consolas" w:hAnsi="Consolas"/>
+                <w:color w:val="1A202C"/>
+                <w:sz w:val="17"/>
+                <w:szCs w:val="17"/>
+              </w:rPr>
+              <w:t xml:space="preserve">    Note over User,MiniApp: Kịch bản 2: Học chuyên sâu trên Channel App</w:t>
+            </w:r>
+          </w:p>
+          <w:p>
+            <w:pPr>
+              <w:spacing w:after="0" w:before="0" w:line="220"/>
+            </w:pPr>
+            <w:r>
+              <w:rPr>
+                <w:rFonts w:ascii="Consolas" w:cs="Consolas" w:eastAsia="Consolas" w:hAnsi="Consolas"/>
+                <w:color w:val="1A202C"/>
+                <w:sz w:val="17"/>
+                <w:szCs w:val="17"/>
+              </w:rPr>
+              <w:t xml:space="preserve">    User-&gt;&gt;Channel: Bấm vào Tab "Lingual Study Cockpit" ở thanh kênh</w:t>
+            </w:r>
+          </w:p>
+          <w:p>
+            <w:pPr>
+              <w:spacing w:after="0" w:before="0" w:line="220"/>
+            </w:pPr>
+            <w:r>
+              <w:rPr>
+                <w:rFonts w:ascii="Consolas" w:cs="Consolas" w:eastAsia="Consolas" w:hAnsi="Consolas"/>
+                <w:color w:val="1A202C"/>
+                <w:sz w:val="17"/>
+                <w:szCs w:val="17"/>
+              </w:rPr>
+              <w:t xml:space="preserve">    MiniApp-&gt;&gt;User: Mở giao diện bài học: Lộ trình Unit, Lật thẻ 3D, Bài tập kéo thả</w:t>
+            </w:r>
+          </w:p>
+          <w:p>
+            <w:pPr>
+              <w:spacing w:after="0" w:before="0" w:line="220"/>
+            </w:pPr>
+            <w:r>
+              <w:rPr>
+                <w:rFonts w:ascii="Consolas" w:cs="Consolas" w:eastAsia="Consolas" w:hAnsi="Consolas"/>
+                <w:color w:val="1A202C"/>
+                <w:sz w:val="17"/>
+                <w:szCs w:val="17"/>
+              </w:rPr>
+              <w:t xml:space="preserve">    User-&gt;&gt;MiniApp: Hoàn thành bài trắc nghiệm nhanh</w:t>
+            </w:r>
+          </w:p>
+          <w:p>
+            <w:pPr>
+              <w:spacing w:after="0" w:before="0" w:line="220"/>
+            </w:pPr>
+            <w:r>
+              <w:rPr>
+                <w:rFonts w:ascii="Consolas" w:cs="Consolas" w:eastAsia="Consolas" w:hAnsi="Consolas"/>
+                <w:color w:val="1A202C"/>
+                <w:sz w:val="17"/>
+                <w:szCs w:val="17"/>
+              </w:rPr>
+              <w:t xml:space="preserve">    MiniApp--&gt;&gt;User: Ghi nhận tiến độ SRS &amp; đồng bộ điểm về Clan Profile</w:t>
+            </w:r>
+          </w:p>
+          <w:p>
+            <w:pPr>
+              <w:spacing w:after="0" w:before="0" w:line="220"/>
+            </w:pPr>
+            <w:r>
+              <w:rPr>
+                <w:rFonts w:ascii="Consolas" w:cs="Consolas" w:eastAsia="Consolas" w:hAnsi="Consolas"/>
+                <w:color w:val="1A202C"/>
+                <w:sz w:val="17"/>
+                <w:szCs w:val="17"/>
+              </w:rPr>
+              <w:t xml:space="preserve"> </w:t>
+            </w:r>
+          </w:p>
+          <w:p>
+            <w:pPr>
+              <w:spacing w:after="0" w:before="0" w:line="220"/>
+            </w:pPr>
+            <w:r>
+              <w:rPr>
+                <w:rFonts w:ascii="Consolas" w:cs="Consolas" w:eastAsia="Consolas" w:hAnsi="Consolas"/>
+                <w:color w:val="1A202C"/>
+                <w:sz w:val="17"/>
+                <w:szCs w:val="17"/>
+              </w:rPr>
+              <w:t xml:space="preserve">    Note over User,AI: Kịch bản 3: Luyện phản xạ với AI LingLing</w:t>
+            </w:r>
+          </w:p>
+          <w:p>
+            <w:pPr>
+              <w:spacing w:after="0" w:before="0" w:line="220"/>
+            </w:pPr>
+            <w:r>
+              <w:rPr>
+                <w:rFonts w:ascii="Consolas" w:cs="Consolas" w:eastAsia="Consolas" w:hAnsi="Consolas"/>
+                <w:color w:val="1A202C"/>
+                <w:sz w:val="17"/>
+                <w:szCs w:val="17"/>
+              </w:rPr>
+              <w:t xml:space="preserve">    User-&gt;&gt;AI: Nhắn tin: "Hi LingLing, let's practice ordering coffee!"</w:t>
+            </w:r>
+          </w:p>
+          <w:p>
+            <w:pPr>
+              <w:spacing w:after="0" w:before="0" w:line="220"/>
+            </w:pPr>
+            <w:r>
+              <w:rPr>
+                <w:rFonts w:ascii="Consolas" w:cs="Consolas" w:eastAsia="Consolas" w:hAnsi="Consolas"/>
+                <w:color w:val="1A202C"/>
+                <w:sz w:val="17"/>
+                <w:szCs w:val="17"/>
+              </w:rPr>
+              <w:t xml:space="preserve">    AI--&gt;&gt;User: Đóng vai Barista: "Welcome to Mezon Cafe! What can I get for you today?"</w:t>
+            </w:r>
+          </w:p>
+          <w:p>
+            <w:pPr>
+              <w:spacing w:after="0" w:before="0" w:line="220"/>
+            </w:pPr>
+            <w:r>
+              <w:rPr>
+                <w:rFonts w:ascii="Consolas" w:cs="Consolas" w:eastAsia="Consolas" w:hAnsi="Consolas"/>
+                <w:color w:val="1A202C"/>
+                <w:sz w:val="17"/>
+                <w:szCs w:val="17"/>
+              </w:rPr>
+              <w:t xml:space="preserve">    User-&gt;&gt;AI: "I want drink a hot chocolate please."</w:t>
+            </w:r>
+          </w:p>
+          <w:p>
+            <w:pPr>
+              <w:spacing w:after="0" w:before="0" w:line="220"/>
+            </w:pPr>
+            <w:r>
+              <w:rPr>
+                <w:rFonts w:ascii="Consolas" w:cs="Consolas" w:eastAsia="Consolas" w:hAnsi="Consolas"/>
+                <w:color w:val="1A202C"/>
+                <w:sz w:val="17"/>
+                <w:szCs w:val="17"/>
+              </w:rPr>
+              <w:t xml:space="preserve">    AI--&gt;&gt;User: "Sure! A hot chocolate for you. 💡 Nhỏ một xíu: Bạn nên nói 'I want to drink' hoặc 'I would like a hot chocolate' sẽ tự nhiên và lịch sự hơn nhé!"</w:t>
+            </w:r>
+          </w:p>
+        </w:tc>
+      </w:tr>
+    </w:tbl>
     <w:p>
       <w:pPr>
         <w:spacing w:after="140" w:before="0"/>

</xml_diff>

<commit_message>
fix(bot,docs): add reconnection backoff to MezonBotWorker, patch PRD diagrams and setup CI
</commit_message>
<xml_diff>
--- a/docs/product/PRODUCT_REQUIREMENTS_DOCUMENT_LINGUAL.docx
+++ b/docs/product/PRODUCT_REQUIREMENTS_DOCUMENT_LINGUAL.docx
@@ -1607,157 +1607,46 @@
         <w:t xml:space="preserve">2.2 Ba trụ cột giá trị cốt lõi (Core Value Pillars)</w:t>
       </w:r>
     </w:p>
-    <w:tbl>
-      <w:tblPr>
-        <w:tblW w:type="dxa" w:w="9026"/>
-        <w:tblBorders>
-          <w:top w:val="single" w:color="auto" w:sz="4"/>
-          <w:left w:val="single" w:color="auto" w:sz="4"/>
-          <w:bottom w:val="single" w:color="auto" w:sz="4"/>
-          <w:right w:val="single" w:color="auto" w:sz="4"/>
-          <w:insideH w:val="single" w:color="auto" w:sz="4"/>
-          <w:insideV w:val="single" w:color="auto" w:sz="4"/>
-        </w:tblBorders>
-      </w:tblPr>
-      <w:tblGrid>
-        <w:gridCol w:w="9026"/>
-      </w:tblGrid>
-      <w:tr>
-        <w:trPr>
-          <w:cantSplit/>
-        </w:trPr>
-        <w:tc>
-          <w:tcPr>
-            <w:tcW w:type="dxa" w:w="9026"/>
-            <w:tcBorders>
-              <w:top w:val="single" w:color="CBD5E0" w:sz="6"/>
-              <w:left w:val="single" w:color="CBD5E0" w:sz="6"/>
-              <w:bottom w:val="single" w:color="CBD5E0" w:sz="6"/>
-              <w:right w:val="single" w:color="CBD5E0" w:sz="6"/>
-            </w:tcBorders>
-            <w:shd w:fill="F8FAFC" w:val="clear"/>
-            <w:tcMar>
-              <w:top w:type="dxa" w:w="120"/>
-              <w:left w:type="dxa" w:w="160"/>
-              <w:bottom w:type="dxa" w:w="120"/>
-              <w:right w:type="dxa" w:w="160"/>
-            </w:tcMar>
-          </w:tcPr>
-          <w:p>
-            <w:pPr>
-              <w:spacing w:after="0" w:before="0" w:line="220"/>
-            </w:pPr>
-            <w:r>
-              <w:rPr>
-                <w:rFonts w:ascii="Consolas" w:cs="Consolas" w:eastAsia="Consolas" w:hAnsi="Consolas"/>
-                <w:color w:val="1A202C"/>
-                <w:sz w:val="17"/>
-                <w:szCs w:val="17"/>
-              </w:rPr>
-              <w:t xml:space="preserve">graph TD</w:t>
-            </w:r>
-          </w:p>
-          <w:p>
-            <w:pPr>
-              <w:spacing w:after="0" w:before="0" w:line="220"/>
-            </w:pPr>
-            <w:r>
-              <w:rPr>
-                <w:rFonts w:ascii="Consolas" w:cs="Consolas" w:eastAsia="Consolas" w:hAnsi="Consolas"/>
-                <w:color w:val="1A202C"/>
-                <w:sz w:val="17"/>
-                <w:szCs w:val="17"/>
-              </w:rPr>
-              <w:t xml:space="preserve">    A["🌟 LINGUAL MEZON"] --&gt; B["1. KHOA HỌC TRÍ NHỚ (Spaced Repetition)"]</w:t>
-            </w:r>
-          </w:p>
-          <w:p>
-            <w:pPr>
-              <w:spacing w:after="0" w:before="0" w:line="220"/>
-            </w:pPr>
-            <w:r>
-              <w:rPr>
-                <w:rFonts w:ascii="Consolas" w:cs="Consolas" w:eastAsia="Consolas" w:hAnsi="Consolas"/>
-                <w:color w:val="1A202C"/>
-                <w:sz w:val="17"/>
-                <w:szCs w:val="17"/>
-              </w:rPr>
-              <w:t xml:space="preserve">    A --&gt; C["2. GẮN KẾT CỘNG ĐỒNG (Clan Social &amp; Gamification)"]</w:t>
-            </w:r>
-          </w:p>
-          <w:p>
-            <w:pPr>
-              <w:spacing w:after="0" w:before="0" w:line="220"/>
-            </w:pPr>
-            <w:r>
-              <w:rPr>
-                <w:rFonts w:ascii="Consolas" w:cs="Consolas" w:eastAsia="Consolas" w:hAnsi="Consolas"/>
-                <w:color w:val="1A202C"/>
-                <w:sz w:val="17"/>
-                <w:szCs w:val="17"/>
-              </w:rPr>
-              <w:t xml:space="preserve">    A --&gt; D["3. ĐỒNG HÀNH THÔNG MINH (AI Companion LingLing)"]</w:t>
-            </w:r>
-          </w:p>
-          <w:p>
-            <w:pPr>
-              <w:spacing w:after="0" w:before="0" w:line="220"/>
-            </w:pPr>
-            <w:r>
-              <w:rPr>
-                <w:rFonts w:ascii="Consolas" w:cs="Consolas" w:eastAsia="Consolas" w:hAnsi="Consolas"/>
-                <w:color w:val="1A202C"/>
-                <w:sz w:val="17"/>
-                <w:szCs w:val="17"/>
-              </w:rPr>
-              <w:t xml:space="preserve">    </w:t>
-            </w:r>
-          </w:p>
-          <w:p>
-            <w:pPr>
-              <w:spacing w:after="0" w:before="0" w:line="220"/>
-            </w:pPr>
-            <w:r>
-              <w:rPr>
-                <w:rFonts w:ascii="Consolas" w:cs="Consolas" w:eastAsia="Consolas" w:hAnsi="Consolas"/>
-                <w:color w:val="1A202C"/>
-                <w:sz w:val="17"/>
-                <w:szCs w:val="17"/>
-              </w:rPr>
-              <w:t xml:space="preserve">    B --&gt; B1["Thuật toán nhắc ôn đúng điểm rơi trí nhớ (10p/ngày)"]</w:t>
-            </w:r>
-          </w:p>
-          <w:p>
-            <w:pPr>
-              <w:spacing w:after="0" w:before="0" w:line="220"/>
-            </w:pPr>
-            <w:r>
-              <w:rPr>
-                <w:rFonts w:ascii="Consolas" w:cs="Consolas" w:eastAsia="Consolas" w:hAnsi="Consolas"/>
-                <w:color w:val="1A202C"/>
-                <w:sz w:val="17"/>
-                <w:szCs w:val="17"/>
-              </w:rPr>
-              <w:t xml:space="preserve">    C --&gt; C1["Đố vui Bot trong kênh, Đấu trường Clan War, BXH đồng đội"]</w:t>
-            </w:r>
-          </w:p>
-          <w:p>
-            <w:pPr>
-              <w:spacing w:after="0" w:before="0" w:line="220"/>
-            </w:pPr>
-            <w:r>
-              <w:rPr>
-                <w:rFonts w:ascii="Consolas" w:cs="Consolas" w:eastAsia="Consolas" w:hAnsi="Consolas"/>
-                <w:color w:val="1A202C"/>
-                <w:sz w:val="17"/>
-                <w:szCs w:val="17"/>
-              </w:rPr>
-              <w:t xml:space="preserve">    D --&gt; D1["Sửa ngữ pháp tức thì, Chat đóng vai tình huống 24/7"]</w:t>
-            </w:r>
-          </w:p>
-        </w:tc>
-      </w:tr>
-    </w:tbl>
+    <w:p>
+      <w:pPr>
+        <w:spacing w:before="240" w:after="240"/>
+        <w:jc w:val="center"/>
+      </w:pPr>
+      <w:r>
+        <w:drawing>
+          <wp:inline xmlns:a="http://schemas.openxmlformats.org/drawingml/2006/main" xmlns:pic="http://schemas.openxmlformats.org/drawingml/2006/picture">
+            <wp:extent cx="5303520" cy="2213746"/>
+            <wp:docPr id="1" name="Picture 1"/>
+            <wp:cNvGraphicFramePr>
+              <a:graphicFrameLocks noChangeAspect="1"/>
+            </wp:cNvGraphicFramePr>
+            <a:graphic>
+              <a:graphicData uri="http://schemas.openxmlformats.org/drawingml/2006/picture">
+                <pic:pic>
+                  <pic:nvPicPr>
+                    <pic:cNvPr id="0" name="diagram_pillars.png"/>
+                    <pic:cNvPicPr/>
+                  </pic:nvPicPr>
+                  <pic:blipFill>
+                    <a:blip r:embed="rId10"/>
+                    <a:stretch>
+                      <a:fillRect/>
+                    </a:stretch>
+                  </pic:blipFill>
+                  <pic:spPr>
+                    <a:xfrm>
+                      <a:off x="0" y="0"/>
+                      <a:ext cx="5303520" cy="2213746"/>
+                    </a:xfrm>
+                    <a:prstGeom prst="rect"/>
+                  </pic:spPr>
+                </pic:pic>
+              </a:graphicData>
+            </a:graphic>
+          </wp:inline>
+        </w:drawing>
+      </w:r>
+    </w:p>
     <w:p>
       <w:pPr>
         <w:spacing w:after="140" w:before="0"/>
@@ -2166,395 +2055,46 @@
         <w:t xml:space="preserve">4. HÀNH TRÌNH NGƯỜI DÙNG &amp; KỊCH BẢN TƯƠNG TÁC TRÊN MEZON</w:t>
       </w:r>
     </w:p>
-    <w:tbl>
-      <w:tblPr>
-        <w:tblW w:type="dxa" w:w="9026"/>
-        <w:tblBorders>
-          <w:top w:val="single" w:color="auto" w:sz="4"/>
-          <w:left w:val="single" w:color="auto" w:sz="4"/>
-          <w:bottom w:val="single" w:color="auto" w:sz="4"/>
-          <w:right w:val="single" w:color="auto" w:sz="4"/>
-          <w:insideH w:val="single" w:color="auto" w:sz="4"/>
-          <w:insideV w:val="single" w:color="auto" w:sz="4"/>
-        </w:tblBorders>
-      </w:tblPr>
-      <w:tblGrid>
-        <w:gridCol w:w="9026"/>
-      </w:tblGrid>
-      <w:tr>
-        <w:trPr>
-          <w:cantSplit/>
-        </w:trPr>
-        <w:tc>
-          <w:tcPr>
-            <w:tcW w:type="dxa" w:w="9026"/>
-            <w:tcBorders>
-              <w:top w:val="single" w:color="CBD5E0" w:sz="6"/>
-              <w:left w:val="single" w:color="CBD5E0" w:sz="6"/>
-              <w:bottom w:val="single" w:color="CBD5E0" w:sz="6"/>
-              <w:right w:val="single" w:color="CBD5E0" w:sz="6"/>
-            </w:tcBorders>
-            <w:shd w:fill="F8FAFC" w:val="clear"/>
-            <w:tcMar>
-              <w:top w:type="dxa" w:w="120"/>
-              <w:left w:type="dxa" w:w="160"/>
-              <w:bottom w:type="dxa" w:w="120"/>
-              <w:right w:type="dxa" w:w="160"/>
-            </w:tcMar>
-          </w:tcPr>
-          <w:p>
-            <w:pPr>
-              <w:spacing w:after="0" w:before="0" w:line="220"/>
-            </w:pPr>
-            <w:r>
-              <w:rPr>
-                <w:rFonts w:ascii="Consolas" w:cs="Consolas" w:eastAsia="Consolas" w:hAnsi="Consolas"/>
-                <w:color w:val="1A202C"/>
-                <w:sz w:val="17"/>
-                <w:szCs w:val="17"/>
-              </w:rPr>
-              <w:t xml:space="preserve">sequenceDiagram</w:t>
-            </w:r>
-          </w:p>
-          <w:p>
-            <w:pPr>
-              <w:spacing w:after="0" w:before="0" w:line="220"/>
-            </w:pPr>
-            <w:r>
-              <w:rPr>
-                <w:rFonts w:ascii="Consolas" w:cs="Consolas" w:eastAsia="Consolas" w:hAnsi="Consolas"/>
-                <w:color w:val="1A202C"/>
-                <w:sz w:val="17"/>
-                <w:szCs w:val="17"/>
-              </w:rPr>
-              <w:t xml:space="preserve">    autonumber</w:t>
-            </w:r>
-          </w:p>
-          <w:p>
-            <w:pPr>
-              <w:spacing w:after="0" w:before="0" w:line="220"/>
-            </w:pPr>
-            <w:r>
-              <w:rPr>
-                <w:rFonts w:ascii="Consolas" w:cs="Consolas" w:eastAsia="Consolas" w:hAnsi="Consolas"/>
-                <w:color w:val="1A202C"/>
-                <w:sz w:val="17"/>
-                <w:szCs w:val="17"/>
-              </w:rPr>
-              <w:t xml:space="preserve">    actor User as Người học (Minh)</w:t>
-            </w:r>
-          </w:p>
-          <w:p>
-            <w:pPr>
-              <w:spacing w:after="0" w:before="0" w:line="220"/>
-            </w:pPr>
-            <w:r>
-              <w:rPr>
-                <w:rFonts w:ascii="Consolas" w:cs="Consolas" w:eastAsia="Consolas" w:hAnsi="Consolas"/>
-                <w:color w:val="1A202C"/>
-                <w:sz w:val="17"/>
-                <w:szCs w:val="17"/>
-              </w:rPr>
-              <w:t xml:space="preserve">    participant Channel as Kênh Chat Clan Mezon</w:t>
-            </w:r>
-          </w:p>
-          <w:p>
-            <w:pPr>
-              <w:spacing w:after="0" w:before="0" w:line="220"/>
-            </w:pPr>
-            <w:r>
-              <w:rPr>
-                <w:rFonts w:ascii="Consolas" w:cs="Consolas" w:eastAsia="Consolas" w:hAnsi="Consolas"/>
-                <w:color w:val="1A202C"/>
-                <w:sz w:val="17"/>
-                <w:szCs w:val="17"/>
-              </w:rPr>
-              <w:t xml:space="preserve">    participant Bot as Lingual Bot</w:t>
-            </w:r>
-          </w:p>
-          <w:p>
-            <w:pPr>
-              <w:spacing w:after="0" w:before="0" w:line="220"/>
-            </w:pPr>
-            <w:r>
-              <w:rPr>
-                <w:rFonts w:ascii="Consolas" w:cs="Consolas" w:eastAsia="Consolas" w:hAnsi="Consolas"/>
-                <w:color w:val="1A202C"/>
-                <w:sz w:val="17"/>
-                <w:szCs w:val="17"/>
-              </w:rPr>
-              <w:t xml:space="preserve">    participant MiniApp as Channel Mini-App (Nhúng)</w:t>
-            </w:r>
-          </w:p>
-          <w:p>
-            <w:pPr>
-              <w:spacing w:after="0" w:before="0" w:line="220"/>
-            </w:pPr>
-            <w:r>
-              <w:rPr>
-                <w:rFonts w:ascii="Consolas" w:cs="Consolas" w:eastAsia="Consolas" w:hAnsi="Consolas"/>
-                <w:color w:val="1A202C"/>
-                <w:sz w:val="17"/>
-                <w:szCs w:val="17"/>
-              </w:rPr>
-              <w:t xml:space="preserve">    participant AI as Trợ Lý AI LingLing</w:t>
-            </w:r>
-          </w:p>
-          <w:p>
-            <w:pPr>
-              <w:spacing w:after="0" w:before="0" w:line="220"/>
-            </w:pPr>
-            <w:r>
-              <w:rPr>
-                <w:rFonts w:ascii="Consolas" w:cs="Consolas" w:eastAsia="Consolas" w:hAnsi="Consolas"/>
-                <w:color w:val="1A202C"/>
-                <w:sz w:val="17"/>
-                <w:szCs w:val="17"/>
-              </w:rPr>
-              <w:t xml:space="preserve"> </w:t>
-            </w:r>
-          </w:p>
-          <w:p>
-            <w:pPr>
-              <w:spacing w:after="0" w:before="0" w:line="220"/>
-            </w:pPr>
-            <w:r>
-              <w:rPr>
-                <w:rFonts w:ascii="Consolas" w:cs="Consolas" w:eastAsia="Consolas" w:hAnsi="Consolas"/>
-                <w:color w:val="1A202C"/>
-                <w:sz w:val="17"/>
-                <w:szCs w:val="17"/>
-              </w:rPr>
-              <w:t xml:space="preserve">    Note over User,Bot: Kịch bản 1: Tương tác qua Kênh Chat</w:t>
-            </w:r>
-          </w:p>
-          <w:p>
-            <w:pPr>
-              <w:spacing w:after="0" w:before="0" w:line="220"/>
-            </w:pPr>
-            <w:r>
-              <w:rPr>
-                <w:rFonts w:ascii="Consolas" w:cs="Consolas" w:eastAsia="Consolas" w:hAnsi="Consolas"/>
-                <w:color w:val="1A202C"/>
-                <w:sz w:val="17"/>
-                <w:szCs w:val="17"/>
-              </w:rPr>
-              <w:t xml:space="preserve">    User-&gt;&gt;Channel: Gõ lệnh /learn</w:t>
-            </w:r>
-          </w:p>
-          <w:p>
-            <w:pPr>
-              <w:spacing w:after="0" w:before="0" w:line="220"/>
-            </w:pPr>
-            <w:r>
-              <w:rPr>
-                <w:rFonts w:ascii="Consolas" w:cs="Consolas" w:eastAsia="Consolas" w:hAnsi="Consolas"/>
-                <w:color w:val="1A202C"/>
-                <w:sz w:val="17"/>
-                <w:szCs w:val="17"/>
-              </w:rPr>
-              <w:t xml:space="preserve">    Bot--&gt;&gt;Channel: Trả về Flashcard 3 từ mới hôm nay kèm nút bấm "Nghe phát âm" &amp; "Tôi đã thuộc"</w:t>
-            </w:r>
-          </w:p>
-          <w:p>
-            <w:pPr>
-              <w:spacing w:after="0" w:before="0" w:line="220"/>
-            </w:pPr>
-            <w:r>
-              <w:rPr>
-                <w:rFonts w:ascii="Consolas" w:cs="Consolas" w:eastAsia="Consolas" w:hAnsi="Consolas"/>
-                <w:color w:val="1A202C"/>
-                <w:sz w:val="17"/>
-                <w:szCs w:val="17"/>
-              </w:rPr>
-              <w:t xml:space="preserve">    User-&gt;&gt;Bot: Bấm "Tôi đã thuộc"</w:t>
-            </w:r>
-          </w:p>
-          <w:p>
-            <w:pPr>
-              <w:spacing w:after="0" w:before="0" w:line="220"/>
-            </w:pPr>
-            <w:r>
-              <w:rPr>
-                <w:rFonts w:ascii="Consolas" w:cs="Consolas" w:eastAsia="Consolas" w:hAnsi="Consolas"/>
-                <w:color w:val="1A202C"/>
-                <w:sz w:val="17"/>
-                <w:szCs w:val="17"/>
-              </w:rPr>
-              <w:t xml:space="preserve">    Bot--&gt;&gt;Channel: Cập nhật +15 XP &amp; thông báo Chuỗi 3 ngày liên tiếp!</w:t>
-            </w:r>
-          </w:p>
-          <w:p>
-            <w:pPr>
-              <w:spacing w:after="0" w:before="0" w:line="220"/>
-            </w:pPr>
-            <w:r>
-              <w:rPr>
-                <w:rFonts w:ascii="Consolas" w:cs="Consolas" w:eastAsia="Consolas" w:hAnsi="Consolas"/>
-                <w:color w:val="1A202C"/>
-                <w:sz w:val="17"/>
-                <w:szCs w:val="17"/>
-              </w:rPr>
-              <w:t xml:space="preserve"> </w:t>
-            </w:r>
-          </w:p>
-          <w:p>
-            <w:pPr>
-              <w:spacing w:after="0" w:before="0" w:line="220"/>
-            </w:pPr>
-            <w:r>
-              <w:rPr>
-                <w:rFonts w:ascii="Consolas" w:cs="Consolas" w:eastAsia="Consolas" w:hAnsi="Consolas"/>
-                <w:color w:val="1A202C"/>
-                <w:sz w:val="17"/>
-                <w:szCs w:val="17"/>
-              </w:rPr>
-              <w:t xml:space="preserve">    Note over User,MiniApp: Kịch bản 2: Học chuyên sâu trên Channel App</w:t>
-            </w:r>
-          </w:p>
-          <w:p>
-            <w:pPr>
-              <w:spacing w:after="0" w:before="0" w:line="220"/>
-            </w:pPr>
-            <w:r>
-              <w:rPr>
-                <w:rFonts w:ascii="Consolas" w:cs="Consolas" w:eastAsia="Consolas" w:hAnsi="Consolas"/>
-                <w:color w:val="1A202C"/>
-                <w:sz w:val="17"/>
-                <w:szCs w:val="17"/>
-              </w:rPr>
-              <w:t xml:space="preserve">    User-&gt;&gt;Channel: Bấm vào Tab "Lingual Study Cockpit" ở thanh kênh</w:t>
-            </w:r>
-          </w:p>
-          <w:p>
-            <w:pPr>
-              <w:spacing w:after="0" w:before="0" w:line="220"/>
-            </w:pPr>
-            <w:r>
-              <w:rPr>
-                <w:rFonts w:ascii="Consolas" w:cs="Consolas" w:eastAsia="Consolas" w:hAnsi="Consolas"/>
-                <w:color w:val="1A202C"/>
-                <w:sz w:val="17"/>
-                <w:szCs w:val="17"/>
-              </w:rPr>
-              <w:t xml:space="preserve">    MiniApp-&gt;&gt;User: Mở giao diện bài học: Lộ trình Unit, Lật thẻ 3D, Bài tập kéo thả</w:t>
-            </w:r>
-          </w:p>
-          <w:p>
-            <w:pPr>
-              <w:spacing w:after="0" w:before="0" w:line="220"/>
-            </w:pPr>
-            <w:r>
-              <w:rPr>
-                <w:rFonts w:ascii="Consolas" w:cs="Consolas" w:eastAsia="Consolas" w:hAnsi="Consolas"/>
-                <w:color w:val="1A202C"/>
-                <w:sz w:val="17"/>
-                <w:szCs w:val="17"/>
-              </w:rPr>
-              <w:t xml:space="preserve">    User-&gt;&gt;MiniApp: Hoàn thành bài trắc nghiệm nhanh</w:t>
-            </w:r>
-          </w:p>
-          <w:p>
-            <w:pPr>
-              <w:spacing w:after="0" w:before="0" w:line="220"/>
-            </w:pPr>
-            <w:r>
-              <w:rPr>
-                <w:rFonts w:ascii="Consolas" w:cs="Consolas" w:eastAsia="Consolas" w:hAnsi="Consolas"/>
-                <w:color w:val="1A202C"/>
-                <w:sz w:val="17"/>
-                <w:szCs w:val="17"/>
-              </w:rPr>
-              <w:t xml:space="preserve">    MiniApp--&gt;&gt;User: Ghi nhận tiến độ SRS &amp; đồng bộ điểm về Clan Profile</w:t>
-            </w:r>
-          </w:p>
-          <w:p>
-            <w:pPr>
-              <w:spacing w:after="0" w:before="0" w:line="220"/>
-            </w:pPr>
-            <w:r>
-              <w:rPr>
-                <w:rFonts w:ascii="Consolas" w:cs="Consolas" w:eastAsia="Consolas" w:hAnsi="Consolas"/>
-                <w:color w:val="1A202C"/>
-                <w:sz w:val="17"/>
-                <w:szCs w:val="17"/>
-              </w:rPr>
-              <w:t xml:space="preserve"> </w:t>
-            </w:r>
-          </w:p>
-          <w:p>
-            <w:pPr>
-              <w:spacing w:after="0" w:before="0" w:line="220"/>
-            </w:pPr>
-            <w:r>
-              <w:rPr>
-                <w:rFonts w:ascii="Consolas" w:cs="Consolas" w:eastAsia="Consolas" w:hAnsi="Consolas"/>
-                <w:color w:val="1A202C"/>
-                <w:sz w:val="17"/>
-                <w:szCs w:val="17"/>
-              </w:rPr>
-              <w:t xml:space="preserve">    Note over User,AI: Kịch bản 3: Luyện phản xạ với AI LingLing</w:t>
-            </w:r>
-          </w:p>
-          <w:p>
-            <w:pPr>
-              <w:spacing w:after="0" w:before="0" w:line="220"/>
-            </w:pPr>
-            <w:r>
-              <w:rPr>
-                <w:rFonts w:ascii="Consolas" w:cs="Consolas" w:eastAsia="Consolas" w:hAnsi="Consolas"/>
-                <w:color w:val="1A202C"/>
-                <w:sz w:val="17"/>
-                <w:szCs w:val="17"/>
-              </w:rPr>
-              <w:t xml:space="preserve">    User-&gt;&gt;AI: Nhắn tin: "Hi LingLing, let's practice ordering coffee!"</w:t>
-            </w:r>
-          </w:p>
-          <w:p>
-            <w:pPr>
-              <w:spacing w:after="0" w:before="0" w:line="220"/>
-            </w:pPr>
-            <w:r>
-              <w:rPr>
-                <w:rFonts w:ascii="Consolas" w:cs="Consolas" w:eastAsia="Consolas" w:hAnsi="Consolas"/>
-                <w:color w:val="1A202C"/>
-                <w:sz w:val="17"/>
-                <w:szCs w:val="17"/>
-              </w:rPr>
-              <w:t xml:space="preserve">    AI--&gt;&gt;User: Đóng vai Barista: "Welcome to Mezon Cafe! What can I get for you today?"</w:t>
-            </w:r>
-          </w:p>
-          <w:p>
-            <w:pPr>
-              <w:spacing w:after="0" w:before="0" w:line="220"/>
-            </w:pPr>
-            <w:r>
-              <w:rPr>
-                <w:rFonts w:ascii="Consolas" w:cs="Consolas" w:eastAsia="Consolas" w:hAnsi="Consolas"/>
-                <w:color w:val="1A202C"/>
-                <w:sz w:val="17"/>
-                <w:szCs w:val="17"/>
-              </w:rPr>
-              <w:t xml:space="preserve">    User-&gt;&gt;AI: "I want drink a hot chocolate please."</w:t>
-            </w:r>
-          </w:p>
-          <w:p>
-            <w:pPr>
-              <w:spacing w:after="0" w:before="0" w:line="220"/>
-            </w:pPr>
-            <w:r>
-              <w:rPr>
-                <w:rFonts w:ascii="Consolas" w:cs="Consolas" w:eastAsia="Consolas" w:hAnsi="Consolas"/>
-                <w:color w:val="1A202C"/>
-                <w:sz w:val="17"/>
-                <w:szCs w:val="17"/>
-              </w:rPr>
-              <w:t xml:space="preserve">    AI--&gt;&gt;User: "Sure! A hot chocolate for you. 💡 Nhỏ một xíu: Bạn nên nói 'I want to drink' hoặc 'I would like a hot chocolate' sẽ tự nhiên và lịch sự hơn nhé!"</w:t>
-            </w:r>
-          </w:p>
-        </w:tc>
-      </w:tr>
-    </w:tbl>
+    <w:p>
+      <w:pPr>
+        <w:spacing w:before="240" w:after="240"/>
+        <w:jc w:val="center"/>
+      </w:pPr>
+      <w:r>
+        <w:drawing>
+          <wp:inline xmlns:a="http://schemas.openxmlformats.org/drawingml/2006/main" xmlns:pic="http://schemas.openxmlformats.org/drawingml/2006/picture">
+            <wp:extent cx="5669280" cy="3598615"/>
+            <wp:docPr id="2" name="Picture 2"/>
+            <wp:cNvGraphicFramePr>
+              <a:graphicFrameLocks noChangeAspect="1"/>
+            </wp:cNvGraphicFramePr>
+            <a:graphic>
+              <a:graphicData uri="http://schemas.openxmlformats.org/drawingml/2006/picture">
+                <pic:pic>
+                  <pic:nvPicPr>
+                    <pic:cNvPr id="0" name="diagram_sequence.png"/>
+                    <pic:cNvPicPr/>
+                  </pic:nvPicPr>
+                  <pic:blipFill>
+                    <a:blip r:embed="rId11"/>
+                    <a:stretch>
+                      <a:fillRect/>
+                    </a:stretch>
+                  </pic:blipFill>
+                  <pic:spPr>
+                    <a:xfrm>
+                      <a:off x="0" y="0"/>
+                      <a:ext cx="5669280" cy="3598615"/>
+                    </a:xfrm>
+                    <a:prstGeom prst="rect"/>
+                  </pic:spPr>
+                </pic:pic>
+              </a:graphicData>
+            </a:graphic>
+          </wp:inline>
+        </w:drawing>
+      </w:r>
+    </w:p>
     <w:p>
       <w:pPr>
         <w:spacing w:after="140" w:before="0"/>

</xml_diff>